<commit_message>
fix(podes): adjust chapter cover card positioning, BPS theme colors, and signees in PODES engine
</commit_message>
<xml_diff>
--- a/kegiatan/desa-cantik/2026/pasir-palembang/publikasi-potensi-pasir-palembang-2026.docx
+++ b/kegiatan/desa-cantik/2026/pasir-palembang/publikasi-potensi-pasir-palembang-2026.docx
@@ -287,7 +287,7 @@
       </w:tblGrid>
       <w:tr>
         <w:trPr>
-          <w:trHeight w:hRule="exact" w:val="8176"/>
+          <w:trHeight w:hRule="exact" w:val="8208"/>
         </w:trPr>
         <w:tc>
           <w:tcPr>
@@ -318,7 +318,7 @@
                 <w:color w:val="E2E8F0"/>
                 <w:sz w:val="20"/>
               </w:rPr>
-              <w:t>Hasil Pendataan Potensi Desa (PODES) Tahun 2025</w:t>
+              <w:t>Disusun oleh Pemerintah Desa Pasir Palembang &amp; Disunting oleh BPS Kabupaten Mempawah</w:t>
             </w:r>
           </w:p>
         </w:tc>
@@ -345,7 +345,7 @@
       </w:tblGrid>
       <w:tr>
         <w:trPr>
-          <w:trHeight w:hRule="exact" w:val="1546"/>
+          <w:trHeight w:hRule="exact" w:val="1528"/>
         </w:trPr>
         <w:tc>
           <w:tcPr>
@@ -362,7 +362,7 @@
               <w:autoSpaceDN w:val="0"/>
               <w:autoSpaceDE w:val="0"/>
               <w:widowControl/>
-              <w:spacing w:line="233" w:lineRule="auto" w:before="1224" w:after="0"/>
+              <w:spacing w:line="233" w:lineRule="auto" w:before="1222" w:after="0"/>
               <w:ind w:left="1136" w:right="0" w:firstLine="0"/>
               <w:jc w:val="left"/>
             </w:pPr>
@@ -374,7 +374,7 @@
                 <w:color w:val="FFFFFF"/>
                 <w:sz w:val="24"/>
               </w:rPr>
-              <w:t>BADAN PUSAT STATISTIK KABUPATEN MEMPAWAH</w:t>
+              <w:t>PEMERINTAH DESA PASIR PALEMBANG</w:t>
             </w:r>
           </w:p>
         </w:tc>
@@ -401,7 +401,7 @@
       </w:tblGrid>
       <w:tr>
         <w:trPr>
-          <w:trHeight w:hRule="exact" w:val="1428"/>
+          <w:trHeight w:hRule="exact" w:val="1414"/>
         </w:trPr>
         <w:tc>
           <w:tcPr>
@@ -418,19 +418,19 @@
               <w:autoSpaceDN w:val="0"/>
               <w:autoSpaceDE w:val="0"/>
               <w:widowControl/>
-              <w:spacing w:line="233" w:lineRule="auto" w:before="54" w:after="0"/>
+              <w:spacing w:line="233" w:lineRule="auto" w:before="40" w:after="0"/>
               <w:ind w:left="1136" w:right="0" w:firstLine="0"/>
               <w:jc w:val="left"/>
             </w:pPr>
             <w:r>
               <w:rPr>
                 <w:rFonts w:ascii="Liberation Sans" w:hAnsi="Liberation Sans" w:eastAsia="Liberation Sans"/>
-                <w:b w:val="0"/>
+                <w:b/>
                 <w:i w:val="0"/>
-                <w:color w:val="94A3B8"/>
+                <w:color w:val="EB8A3C"/>
                 <w:sz w:val="19"/>
               </w:rPr>
-              <w:t>BPS-Statistics Mempawah Regency</w:t>
+              <w:t>Disunting oleh BPS Kabupaten Mempawah</w:t>
             </w:r>
           </w:p>
         </w:tc>
@@ -506,7 +506,7 @@
       </w:tblGrid>
       <w:tr>
         <w:trPr>
-          <w:trHeight w:hRule="exact" w:val="3162"/>
+          <w:trHeight w:hRule="exact" w:val="3450"/>
         </w:trPr>
         <w:tc>
           <w:tcPr>
@@ -525,7 +525,7 @@
               <w:autoSpaceDN w:val="0"/>
               <w:autoSpaceDE w:val="0"/>
               <w:widowControl/>
-              <w:spacing w:line="374" w:lineRule="auto" w:before="716" w:after="0"/>
+              <w:spacing w:line="370" w:lineRule="auto" w:before="716" w:after="0"/>
               <w:ind w:left="1422" w:right="144" w:firstLine="0"/>
               <w:jc w:val="left"/>
             </w:pPr>
@@ -582,7 +582,10 @@
                 <w:color w:val="2D3748"/>
                 <w:sz w:val="18"/>
               </w:rPr>
-              <w:t xml:space="preserve">Naskah / </w:t>
+              <w:t xml:space="preserve">Penyusun Naskah / </w:t>
+            </w:r>
+            <w:r>
+              <w:br/>
             </w:r>
             <w:r>
               <w:rPr>
@@ -709,8 +712,8 @@
               <w:autoSpaceDN w:val="0"/>
               <w:autoSpaceDE w:val="0"/>
               <w:widowControl/>
-              <w:spacing w:line="374" w:lineRule="auto" w:before="426" w:after="0"/>
-              <w:ind w:left="192" w:right="1152" w:firstLine="0"/>
+              <w:spacing w:line="235" w:lineRule="auto" w:before="426" w:after="0"/>
+              <w:ind w:left="342" w:right="0" w:firstLine="0"/>
               <w:jc w:val="left"/>
             </w:pPr>
             <w:r>
@@ -722,11 +725,18 @@
                 <w:color w:val="2D3748"/>
                 <w:sz w:val="18"/>
               </w:rPr>
-              <w:t xml:space="preserve">: 21 cm x 29,7 cm (A4) </w:t>
+              <w:t>: 21 cm x 29,7 cm (A4)</w:t>
             </w:r>
-            <w:r>
-              <w:br/>
-            </w:r>
+          </w:p>
+          <w:p>
+            <w:pPr>
+              <w:autoSpaceDN w:val="0"/>
+              <w:autoSpaceDE w:val="0"/>
+              <w:widowControl/>
+              <w:spacing w:line="235" w:lineRule="auto" w:before="132" w:after="0"/>
+              <w:ind w:left="342" w:right="0" w:firstLine="0"/>
+              <w:jc w:val="left"/>
+            </w:pPr>
             <w:r>
               <w:rPr>
                 <w:w w:val="97.74999618530273"/>
@@ -736,11 +746,18 @@
                 <w:color w:val="2D3748"/>
                 <w:sz w:val="18"/>
               </w:rPr>
-              <w:t xml:space="preserve">: ix + 15 halaman </w:t>
+              <w:t>: ix + 15 halaman</w:t>
             </w:r>
-            <w:r>
-              <w:br/>
-            </w:r>
+          </w:p>
+          <w:p>
+            <w:pPr>
+              <w:autoSpaceDN w:val="0"/>
+              <w:autoSpaceDE w:val="0"/>
+              <w:widowControl/>
+              <w:spacing w:line="235" w:lineRule="auto" w:before="282" w:after="0"/>
+              <w:ind w:left="342" w:right="0" w:firstLine="0"/>
+              <w:jc w:val="left"/>
+            </w:pPr>
             <w:r>
               <w:rPr>
                 <w:w w:val="97.74999618530273"/>
@@ -750,11 +767,18 @@
                 <w:color w:val="2D3748"/>
                 <w:sz w:val="18"/>
               </w:rPr>
-              <w:t xml:space="preserve">: BPS Kabupaten Mempawah </w:t>
+              <w:t>: Pemerintah Desa Pasir Palembang (menggunakan data PODES BPS)</w:t>
             </w:r>
-            <w:r>
-              <w:br/>
-            </w:r>
+          </w:p>
+          <w:p>
+            <w:pPr>
+              <w:autoSpaceDN w:val="0"/>
+              <w:autoSpaceDE w:val="0"/>
+              <w:widowControl/>
+              <w:spacing w:line="233" w:lineRule="auto" w:before="298" w:after="0"/>
+              <w:ind w:left="342" w:right="0" w:firstLine="0"/>
+              <w:jc w:val="left"/>
+            </w:pPr>
             <w:r>
               <w:rPr>
                 <w:w w:val="97.74999618530273"/>
@@ -764,11 +788,18 @@
                 <w:color w:val="2D3748"/>
                 <w:sz w:val="18"/>
               </w:rPr>
-              <w:t xml:space="preserve">: BPS Kabupaten Mempawah </w:t>
+              <w:t>: Badan Pusat Statistik Kabupaten Mempawah</w:t>
             </w:r>
-            <w:r>
-              <w:br/>
-            </w:r>
+          </w:p>
+          <w:p>
+            <w:pPr>
+              <w:autoSpaceDN w:val="0"/>
+              <w:autoSpaceDE w:val="0"/>
+              <w:widowControl/>
+              <w:spacing w:line="233" w:lineRule="auto" w:before="134" w:after="0"/>
+              <w:ind w:left="342" w:right="0" w:firstLine="0"/>
+              <w:jc w:val="left"/>
+            </w:pPr>
             <w:r>
               <w:rPr>
                 <w:w w:val="97.74999618530273"/>
@@ -778,8 +809,18 @@
                 <w:color w:val="2D3748"/>
                 <w:sz w:val="18"/>
               </w:rPr>
-              <w:t xml:space="preserve">: © BPS Kabupaten Mempawah &amp; Pemerintah Desa Pasir Palembang </w:t>
+              <w:t>: © Pemerintah Desa Pasir Palembang &amp; BPS Kabupaten Mempawah</w:t>
             </w:r>
+          </w:p>
+          <w:p>
+            <w:pPr>
+              <w:autoSpaceDN w:val="0"/>
+              <w:autoSpaceDE w:val="0"/>
+              <w:widowControl/>
+              <w:spacing w:line="235" w:lineRule="auto" w:before="148" w:after="0"/>
+              <w:ind w:left="342" w:right="0" w:firstLine="0"/>
+              <w:jc w:val="left"/>
+            </w:pPr>
             <w:r>
               <w:rPr>
                 <w:w w:val="97.74999618530273"/>
@@ -789,7 +830,7 @@
                 <w:color w:val="2D3748"/>
                 <w:sz w:val="18"/>
               </w:rPr>
-              <w:t>: Pendataan Potensi Desa (PODES) Tahun 2025</w:t>
+              <w:t>: Hasil Pendataan Potensi Desa (PODES) Tahun 2025</w:t>
             </w:r>
           </w:p>
         </w:tc>
@@ -800,7 +841,7 @@
         <w:autoSpaceDN w:val="0"/>
         <w:autoSpaceDE w:val="0"/>
         <w:widowControl/>
-        <w:spacing w:line="160" w:lineRule="exact" w:before="0" w:after="0"/>
+        <w:spacing w:line="158" w:lineRule="exact" w:before="0" w:after="0"/>
         <w:ind w:left="0" w:right="0"/>
       </w:pPr>
     </w:p>
@@ -816,7 +857,7 @@
       </w:tblGrid>
       <w:tr>
         <w:trPr>
-          <w:trHeight w:hRule="exact" w:val="320"/>
+          <w:trHeight w:hRule="exact" w:val="322"/>
         </w:trPr>
         <w:tc>
           <w:tcPr>
@@ -832,7 +873,7 @@
               <w:autoSpaceDN w:val="0"/>
               <w:autoSpaceDE w:val="0"/>
               <w:widowControl/>
-              <w:spacing w:line="233" w:lineRule="auto" w:before="60" w:after="0"/>
+              <w:spacing w:line="235" w:lineRule="auto" w:before="60" w:after="0"/>
               <w:ind w:left="792" w:right="0" w:firstLine="0"/>
               <w:jc w:val="left"/>
             </w:pPr>
@@ -855,7 +896,7 @@
         <w:autoSpaceDN w:val="0"/>
         <w:autoSpaceDE w:val="0"/>
         <w:widowControl/>
-        <w:spacing w:line="288" w:lineRule="auto" w:before="114" w:after="0"/>
+        <w:spacing w:line="288" w:lineRule="auto" w:before="112" w:after="0"/>
         <w:ind w:left="1572" w:right="1562" w:firstLine="0"/>
         <w:jc w:val="both"/>
       </w:pPr>
@@ -879,7 +920,7 @@
           <w:color w:val="334155"/>
           <w:sz w:val="16"/>
         </w:rPr>
-        <w:t xml:space="preserve">buku ini untuk tujuan komersial tanpa izin tertulis dari Badan Pusat Statistik Kabupaten Mempawah dan Pemerintah </w:t>
+        <w:t xml:space="preserve">buku ini untuk tujuan komersial tanpa izin tertulis dari Pemerintah Desa Pasir Palembang dan Badan Pusat Statistik </w:t>
       </w:r>
       <w:r>
         <w:rPr>
@@ -890,7 +931,7 @@
           <w:color w:val="334155"/>
           <w:sz w:val="16"/>
         </w:rPr>
-        <w:t>Desa Pasir Palembang.</w:t>
+        <w:t>Kabupaten Mempawah.</w:t>
       </w:r>
     </w:p>
     <w:p>
@@ -898,7 +939,7 @@
         <w:autoSpaceDN w:val="0"/>
         <w:autoSpaceDE w:val="0"/>
         <w:widowControl/>
-        <w:spacing w:line="233" w:lineRule="auto" w:before="72" w:after="28"/>
+        <w:spacing w:line="233" w:lineRule="auto" w:before="58" w:after="36"/>
         <w:ind w:left="0" w:right="0" w:firstLine="0"/>
         <w:jc w:val="center"/>
       </w:pPr>
@@ -926,7 +967,7 @@
       </w:tblGrid>
       <w:tr>
         <w:trPr>
-          <w:trHeight w:hRule="exact" w:val="590"/>
+          <w:trHeight w:hRule="exact" w:val="598"/>
         </w:trPr>
         <w:tc>
           <w:tcPr>
@@ -945,7 +986,7 @@
               <w:autoSpaceDN w:val="0"/>
               <w:autoSpaceDE w:val="0"/>
               <w:widowControl/>
-              <w:spacing w:line="233" w:lineRule="auto" w:before="30" w:after="0"/>
+              <w:spacing w:line="235" w:lineRule="auto" w:before="36" w:after="0"/>
               <w:ind w:left="110" w:right="0" w:firstLine="0"/>
               <w:jc w:val="left"/>
             </w:pPr>
@@ -958,7 +999,7 @@
                 <w:color w:val="334155"/>
                 <w:sz w:val="16"/>
               </w:rPr>
-              <w:t>without written permission from BPS-Statistics Mempawah Regency and Government of Pasir Palembang Village.</w:t>
+              <w:t>without written permission from Government of Pasir Palembang Village and BPS-Statistics Mempawah Regency.</w:t>
             </w:r>
           </w:p>
         </w:tc>
@@ -969,7 +1010,7 @@
         <w:autoSpaceDN w:val="0"/>
         <w:autoSpaceDE w:val="0"/>
         <w:widowControl/>
-        <w:spacing w:line="9598" w:lineRule="exact" w:before="0" w:after="0"/>
+        <w:spacing w:line="9312" w:lineRule="exact" w:before="0" w:after="0"/>
         <w:ind w:left="0" w:right="0"/>
       </w:pPr>
     </w:p>
@@ -1134,13 +1175,53 @@
         </w:rPr>
         <w:t>Government of Pasir Palembang Village</w:t>
       </w:r>
+      <w:r>
+        <w:rPr>
+          <w:rFonts w:ascii="Liberation Sans" w:hAnsi="Liberation Sans" w:eastAsia="Liberation Sans"/>
+          <w:b w:val="0"/>
+          <w:i w:val="0"/>
+          <w:color w:val="2D3748"/>
+          <w:sz w:val="19"/>
+        </w:rPr>
+        <w:t xml:space="preserve"> (Penyusun Utama /</w:t>
+      </w:r>
     </w:p>
     <w:p>
       <w:pPr>
         <w:autoSpaceDN w:val="0"/>
         <w:autoSpaceDE w:val="0"/>
         <w:widowControl/>
-        <w:spacing w:line="233" w:lineRule="auto" w:before="134" w:after="72"/>
+        <w:spacing w:line="233" w:lineRule="auto" w:before="134" w:after="0"/>
+        <w:ind w:left="1918" w:right="0" w:firstLine="0"/>
+        <w:jc w:val="left"/>
+      </w:pPr>
+      <w:r>
+        <w:rPr>
+          <w:rFonts w:ascii="Liberation Sans" w:hAnsi="Liberation Sans" w:eastAsia="Liberation Sans"/>
+          <w:b w:val="0"/>
+          <w:i/>
+          <w:color w:val="2D3748"/>
+          <w:sz w:val="19"/>
+        </w:rPr>
+        <w:t>Main Drafter</w:t>
+      </w:r>
+      <w:r>
+        <w:rPr>
+          <w:rFonts w:ascii="Liberation Sans" w:hAnsi="Liberation Sans" w:eastAsia="Liberation Sans"/>
+          <w:b w:val="0"/>
+          <w:i w:val="0"/>
+          <w:color w:val="2D3748"/>
+          <w:sz w:val="19"/>
+        </w:rPr>
+        <w:t>)</w:t>
+      </w:r>
+    </w:p>
+    <w:p>
+      <w:pPr>
+        <w:autoSpaceDN w:val="0"/>
+        <w:autoSpaceDE w:val="0"/>
+        <w:widowControl/>
+        <w:spacing w:line="233" w:lineRule="auto" w:before="132" w:after="74"/>
         <w:ind w:left="0" w:right="0" w:firstLine="0"/>
         <w:jc w:val="center"/>
       </w:pPr>
@@ -1181,7 +1262,7 @@
         </w:trPr>
         <w:tc>
           <w:tcPr>
-            <w:tcW w:type="dxa" w:w="7480"/>
+            <w:tcW w:type="dxa" w:w="8820"/>
             <w:tcBorders/>
             <w:shd w:fill="f7fafb"/>
             <w:tcMar>
@@ -1208,6 +1289,36 @@
               </w:rPr>
               <w:t>BPS-Statistics Mempawah Regency</w:t>
             </w:r>
+            <w:r>
+              <w:rPr>
+                <w:rFonts w:ascii="Liberation Sans" w:hAnsi="Liberation Sans" w:eastAsia="Liberation Sans"/>
+                <w:b w:val="0"/>
+                <w:i w:val="0"/>
+                <w:color w:val="2D3748"/>
+                <w:sz w:val="19"/>
+              </w:rPr>
+              <w:t xml:space="preserve"> (Penyunting Data / </w:t>
+            </w:r>
+            <w:r>
+              <w:rPr>
+                <w:rFonts w:ascii="Liberation Sans" w:hAnsi="Liberation Sans" w:eastAsia="Liberation Sans"/>
+                <w:b w:val="0"/>
+                <w:i/>
+                <w:color w:val="2D3748"/>
+                <w:sz w:val="19"/>
+              </w:rPr>
+              <w:t>Data Editor</w:t>
+            </w:r>
+            <w:r>
+              <w:rPr>
+                <w:rFonts w:ascii="Liberation Sans" w:hAnsi="Liberation Sans" w:eastAsia="Liberation Sans"/>
+                <w:b w:val="0"/>
+                <w:i w:val="0"/>
+                <w:color w:val="2D3748"/>
+                <w:sz w:val="19"/>
+              </w:rPr>
+              <w:t>)</w:t>
+            </w:r>
           </w:p>
         </w:tc>
       </w:tr>
@@ -1217,7 +1328,7 @@
         <w:autoSpaceDN w:val="0"/>
         <w:autoSpaceDE w:val="0"/>
         <w:widowControl/>
-        <w:spacing w:line="13390" w:lineRule="exact" w:before="0" w:after="0"/>
+        <w:spacing w:line="13044" w:lineRule="exact" w:before="0" w:after="0"/>
         <w:ind w:left="0" w:right="0"/>
       </w:pPr>
     </w:p>
@@ -1400,7 +1511,67 @@
           <w:color w:val="2D3748"/>
           <w:sz w:val="19"/>
         </w:rPr>
-        <w:t xml:space="preserve">menyajikan gambaran komprehensif mengenai potensi kewilayahan, kependudukan, perumahan, energi, </w:t>
+        <w:t xml:space="preserve">disusun oleh </w:t>
+      </w:r>
+      <w:r>
+        <w:rPr>
+          <w:rFonts w:ascii="Liberation Sans" w:hAnsi="Liberation Sans" w:eastAsia="Liberation Sans"/>
+          <w:b/>
+          <w:i w:val="0"/>
+          <w:color w:val="2D3748"/>
+          <w:sz w:val="19"/>
+        </w:rPr>
+        <w:t>Pemerintah Desa Pasir Palembang</w:t>
+      </w:r>
+      <w:r>
+        <w:rPr>
+          <w:rFonts w:ascii="Liberation Sans" w:hAnsi="Liberation Sans" w:eastAsia="Liberation Sans"/>
+          <w:b w:val="0"/>
+          <w:i w:val="0"/>
+          <w:color w:val="2D3748"/>
+          <w:sz w:val="19"/>
+        </w:rPr>
+        <w:t xml:space="preserve"> menggunakan data hasil Pendataan Potensi Desa </w:t>
+      </w:r>
+      <w:r>
+        <w:rPr>
+          <w:rFonts w:ascii="Liberation Sans" w:hAnsi="Liberation Sans" w:eastAsia="Liberation Sans"/>
+          <w:b w:val="0"/>
+          <w:i w:val="0"/>
+          <w:color w:val="2D3748"/>
+          <w:sz w:val="19"/>
+        </w:rPr>
+        <w:t xml:space="preserve">(PODES) Tahun 2025 dari Badan Pusat Statistik (BPS) dan disunting oleh Badan Pusat Statistik Kabupaten </w:t>
+      </w:r>
+      <w:r>
+        <w:rPr>
+          <w:rFonts w:ascii="Liberation Sans" w:hAnsi="Liberation Sans" w:eastAsia="Liberation Sans"/>
+          <w:b w:val="0"/>
+          <w:i w:val="0"/>
+          <w:color w:val="2D3748"/>
+          <w:sz w:val="19"/>
+        </w:rPr>
+        <w:t>Mempawah.</w:t>
+      </w:r>
+    </w:p>
+    <w:p>
+      <w:pPr>
+        <w:autoSpaceDN w:val="0"/>
+        <w:autoSpaceDE w:val="0"/>
+        <w:widowControl/>
+        <w:spacing w:line="293" w:lineRule="auto" w:before="312" w:after="0"/>
+        <w:ind w:left="1376" w:right="1368" w:firstLine="450"/>
+        <w:jc w:val="both"/>
+      </w:pPr>
+      <w:r>
+        <w:rPr>
+          <w:rFonts w:ascii="Liberation Sans" w:hAnsi="Liberation Sans" w:eastAsia="Liberation Sans"/>
+          <w:b w:val="0"/>
+          <w:i w:val="0"/>
+          <w:color w:val="2D3748"/>
+          <w:sz w:val="19"/>
+        </w:rPr>
+        <w:t xml:space="preserve">Data yang disajikan menggambarkan kondisi potensi kewilayahan, kependudukan, perumahan, energi, </w:t>
       </w:r>
       <w:r>
         <w:rPr>
@@ -1420,27 +1591,7 @@
           <w:color w:val="2D3748"/>
           <w:sz w:val="19"/>
         </w:rPr>
-        <w:t>Palembang berdasarkan hasil Pendataan Potensi Desa (PODES) Tahun 2025.</w:t>
-      </w:r>
-    </w:p>
-    <w:p>
-      <w:pPr>
-        <w:autoSpaceDN w:val="0"/>
-        <w:autoSpaceDE w:val="0"/>
-        <w:widowControl/>
-        <w:spacing w:line="286" w:lineRule="auto" w:before="312" w:after="0"/>
-        <w:ind w:left="1376" w:right="1368" w:firstLine="450"/>
-        <w:jc w:val="both"/>
-      </w:pPr>
-      <w:r>
-        <w:rPr>
-          <w:rFonts w:ascii="Liberation Sans" w:hAnsi="Liberation Sans" w:eastAsia="Liberation Sans"/>
-          <w:b w:val="0"/>
-          <w:i w:val="0"/>
-          <w:color w:val="2D3748"/>
-          <w:sz w:val="19"/>
-        </w:rPr>
-        <w:t xml:space="preserve">Data yang disajikan diharapkan dapat menjadi rujukan baku bagi Pemerintah Desa dan para </w:t>
+        <w:t xml:space="preserve">Palembang. Publikasi ini diharapkan dapat menjadi rujukan baku dalam perencanaan pembangunan </w:t>
       </w:r>
       <w:r>
         <w:rPr>
@@ -1450,7 +1601,7 @@
           <w:color w:val="2D3748"/>
           <w:sz w:val="19"/>
         </w:rPr>
-        <w:t>pemangku kepentingan dalam perencanaan pembangunan kewilayahan berbasis bukti (</w:t>
+        <w:t>kewilayahan berbasis bukti (</w:t>
       </w:r>
       <w:r>
         <w:rPr>
@@ -1460,17 +1611,7 @@
           <w:color w:val="2D3748"/>
           <w:sz w:val="19"/>
         </w:rPr>
-        <w:t xml:space="preserve">evidence-based </w:t>
-      </w:r>
-      <w:r>
-        <w:rPr>
-          <w:rFonts w:ascii="Liberation Sans" w:hAnsi="Liberation Sans" w:eastAsia="Liberation Sans"/>
-          <w:b w:val="0"/>
-          <w:i/>
-          <w:color w:val="2D3748"/>
-          <w:sz w:val="19"/>
-        </w:rPr>
-        <w:t>policy</w:t>
+        <w:t>evidence-based policy</w:t>
       </w:r>
       <w:r>
         <w:rPr>
@@ -1488,7 +1629,7 @@
         <w:autoSpaceDN w:val="0"/>
         <w:autoSpaceDE w:val="0"/>
         <w:widowControl/>
-        <w:spacing w:line="233" w:lineRule="auto" w:before="584" w:after="0"/>
+        <w:spacing w:line="233" w:lineRule="auto" w:before="582" w:after="0"/>
         <w:ind w:left="0" w:right="1426" w:firstLine="0"/>
         <w:jc w:val="right"/>
       </w:pPr>
@@ -1508,8 +1649,8 @@
         <w:autoSpaceDN w:val="0"/>
         <w:autoSpaceDE w:val="0"/>
         <w:widowControl/>
-        <w:spacing w:line="233" w:lineRule="auto" w:before="282" w:after="820"/>
-        <w:ind w:left="0" w:right="1864" w:firstLine="0"/>
+        <w:spacing w:line="233" w:lineRule="auto" w:before="284" w:after="818"/>
+        <w:ind w:left="0" w:right="1426" w:firstLine="0"/>
         <w:jc w:val="right"/>
       </w:pPr>
       <w:r>
@@ -1528,18 +1669,18 @@
         <w:tblW w:type="auto" w:w="0"/>
         <w:tblLayout w:type="fixed"/>
         <w:tblLook w:firstColumn="1" w:firstRow="1" w:lastColumn="0" w:lastRow="0" w:noHBand="0" w:noVBand="1" w:val="04A0"/>
-        <w:tblInd w:w="3180.0" w:type="dxa"/>
+        <w:tblInd w:w="4040.0" w:type="dxa"/>
       </w:tblPr>
       <w:tblGrid>
         <w:gridCol w:w="9019"/>
       </w:tblGrid>
       <w:tr>
         <w:trPr>
-          <w:trHeight w:hRule="exact" w:val="354"/>
+          <w:trHeight w:hRule="exact" w:val="356"/>
         </w:trPr>
         <w:tc>
           <w:tcPr>
-            <w:tcW w:type="dxa" w:w="8000"/>
+            <w:tcW w:type="dxa" w:w="6720"/>
             <w:tcBorders/>
             <w:shd w:fill="f7fafb"/>
             <w:tcMar>
@@ -1552,8 +1693,8 @@
               <w:autoSpaceDN w:val="0"/>
               <w:autoSpaceDE w:val="0"/>
               <w:widowControl/>
-              <w:spacing w:line="233" w:lineRule="auto" w:before="60" w:after="0"/>
-              <w:ind w:left="0" w:right="706" w:firstLine="0"/>
+              <w:spacing w:line="235" w:lineRule="auto" w:before="60" w:after="0"/>
+              <w:ind w:left="0" w:right="1120" w:firstLine="0"/>
               <w:jc w:val="right"/>
             </w:pPr>
             <w:r>
@@ -1565,7 +1706,7 @@
                 <w:color w:val="0B3C5D"/>
                 <w:sz w:val="21"/>
               </w:rPr>
-              <w:t>PEMERINTAH DESA PASIR PALEMBANG</w:t>
+              <w:t>AS'AD AFRIADI</w:t>
             </w:r>
           </w:p>
         </w:tc>
@@ -1576,7 +1717,7 @@
         <w:autoSpaceDN w:val="0"/>
         <w:autoSpaceDE w:val="0"/>
         <w:widowControl/>
-        <w:spacing w:line="9516" w:lineRule="exact" w:before="0" w:after="0"/>
+        <w:spacing w:line="9230" w:lineRule="exact" w:before="0" w:after="0"/>
         <w:ind w:left="0" w:right="0"/>
       </w:pPr>
     </w:p>
@@ -1729,7 +1870,27 @@
           <w:color w:val="475569"/>
           <w:sz w:val="19"/>
         </w:rPr>
-        <w:t xml:space="preserve">Village 2026" has been successfully completed. This publication presents a comprehensive overview of </w:t>
+        <w:t xml:space="preserve">Village 2026" has been successfully completed. This publication was compiled by </w:t>
+      </w:r>
+      <w:r>
+        <w:rPr>
+          <w:rFonts w:ascii="Liberation Sans" w:hAnsi="Liberation Sans" w:eastAsia="Liberation Sans"/>
+          <w:b/>
+          <w:i/>
+          <w:color w:val="475569"/>
+          <w:sz w:val="19"/>
+        </w:rPr>
+        <w:t xml:space="preserve">Government of Pasir </w:t>
+      </w:r>
+      <w:r>
+        <w:rPr>
+          <w:rFonts w:ascii="Liberation Sans" w:hAnsi="Liberation Sans" w:eastAsia="Liberation Sans"/>
+          <w:b/>
+          <w:i/>
+          <w:color w:val="475569"/>
+          <w:sz w:val="19"/>
+        </w:rPr>
+        <w:t>Palembang Village</w:t>
       </w:r>
       <w:r>
         <w:rPr>
@@ -1739,7 +1900,7 @@
           <w:color w:val="475569"/>
           <w:sz w:val="19"/>
         </w:rPr>
-        <w:t xml:space="preserve">regional potential, demographics, housing, energy, social facilities, telecommunication infrastructure, </w:t>
+        <w:t xml:space="preserve"> using data from the Village Potential Survey (PODES) 2025 by BPS-Statistics Indonesia </w:t>
       </w:r>
       <w:r>
         <w:rPr>
@@ -1749,7 +1910,7 @@
           <w:color w:val="475569"/>
           <w:sz w:val="19"/>
         </w:rPr>
-        <w:t>institutions, and local economy based on the Village Potential Survey (PODES) 2025.</w:t>
+        <w:t>and edited by BPS-Statistics Mempawah Regency.</w:t>
       </w:r>
     </w:p>
     <w:p>
@@ -1814,7 +1975,7 @@
         <w:autoSpaceDE w:val="0"/>
         <w:widowControl/>
         <w:spacing w:line="233" w:lineRule="auto" w:before="282" w:after="820"/>
-        <w:ind w:left="0" w:right="1664" w:firstLine="0"/>
+        <w:ind w:left="0" w:right="1426" w:firstLine="0"/>
         <w:jc w:val="right"/>
       </w:pPr>
       <w:r>
@@ -1833,7 +1994,7 @@
         <w:tblW w:type="auto" w:w="0"/>
         <w:tblLayout w:type="fixed"/>
         <w:tblLook w:firstColumn="1" w:firstRow="1" w:lastColumn="0" w:lastRow="0" w:noHBand="0" w:noVBand="1" w:val="04A0"/>
-        <w:tblInd w:w="3180.0" w:type="dxa"/>
+        <w:tblInd w:w="3940.0" w:type="dxa"/>
       </w:tblPr>
       <w:tblGrid>
         <w:gridCol w:w="9019"/>
@@ -1844,7 +2005,7 @@
         </w:trPr>
         <w:tc>
           <w:tcPr>
-            <w:tcW w:type="dxa" w:w="8000"/>
+            <w:tcW w:type="dxa" w:w="6720"/>
             <w:tcBorders/>
             <w:shd w:fill="f7fafb"/>
             <w:tcMar>
@@ -1858,7 +2019,7 @@
               <w:autoSpaceDE w:val="0"/>
               <w:widowControl/>
               <w:spacing w:line="233" w:lineRule="auto" w:before="60" w:after="0"/>
-              <w:ind w:left="0" w:right="706" w:firstLine="0"/>
+              <w:ind w:left="0" w:right="1218" w:firstLine="0"/>
               <w:jc w:val="right"/>
             </w:pPr>
             <w:r>
@@ -1870,7 +2031,7 @@
                 <w:color w:val="0B3C5D"/>
                 <w:sz w:val="21"/>
               </w:rPr>
-              <w:t>PEMERINTAH DESA PASIR PALEMBANG</w:t>
+              <w:t>AS'AD AFRIADI</w:t>
             </w:r>
           </w:p>
         </w:tc>
@@ -2416,7 +2577,7 @@
                 <w:color w:val="2D3748"/>
                 <w:sz w:val="19"/>
               </w:rPr>
-              <w:t>15</w:t>
+              <w:t>16</w:t>
             </w:r>
           </w:p>
         </w:tc>
@@ -3580,7 +3741,184 @@
         <w:autoSpaceDN w:val="0"/>
         <w:autoSpaceDE w:val="0"/>
         <w:widowControl/>
-        <w:spacing w:line="8998" w:lineRule="exact" w:before="0" w:after="0"/>
+        <w:spacing w:line="100" w:lineRule="exact" w:before="0" w:after="0"/>
+        <w:ind w:left="0" w:right="0"/>
+      </w:pPr>
+    </w:p>
+    <w:tbl>
+      <w:tblPr>
+        <w:tblW w:type="auto" w:w="0"/>
+        <w:tblLayout w:type="fixed"/>
+        <w:tblLook w:firstColumn="1" w:firstRow="1" w:lastColumn="0" w:lastRow="0" w:noHBand="0" w:noVBand="1" w:val="04A0"/>
+        <w:tblInd w:w="560.0" w:type="dxa"/>
+      </w:tblPr>
+      <w:tblGrid>
+        <w:gridCol w:w="3006"/>
+        <w:gridCol w:w="3006"/>
+        <w:gridCol w:w="3006"/>
+      </w:tblGrid>
+      <w:tr>
+        <w:trPr>
+          <w:trHeight w:hRule="exact" w:val="318"/>
+        </w:trPr>
+        <w:tc>
+          <w:tcPr>
+            <w:tcW w:type="dxa" w:w="8280"/>
+            <w:gridSpan w:val="2"/>
+            <w:tcBorders/>
+            <w:shd w:fill="f7fafb"/>
+            <w:tcMar>
+              <w:start w:w="0" w:type="dxa"/>
+              <w:end w:w="0" w:type="dxa"/>
+            </w:tcMar>
+            <w:tcMar>
+              <w:start w:w="0" w:type="dxa"/>
+              <w:end w:w="0" w:type="dxa"/>
+            </w:tcMar>
+          </w:tcPr>
+          <w:p>
+            <w:pPr>
+              <w:autoSpaceDN w:val="0"/>
+              <w:autoSpaceDE w:val="0"/>
+              <w:widowControl/>
+              <w:spacing w:line="235" w:lineRule="auto" w:before="60" w:after="0"/>
+              <w:ind w:left="576" w:right="0" w:firstLine="0"/>
+              <w:jc w:val="left"/>
+            </w:pPr>
+            <w:r>
+              <w:rPr>
+                <w:rFonts w:ascii="Liberation Sans" w:hAnsi="Liberation Sans" w:eastAsia="Liberation Sans"/>
+                <w:b/>
+                <w:i w:val="0"/>
+                <w:color w:val="0B3C5D"/>
+                <w:sz w:val="18"/>
+              </w:rPr>
+              <w:t>5.  PEMERINTAHAN &amp; KELEMBAGAAN</w:t>
+            </w:r>
+          </w:p>
+        </w:tc>
+        <w:tc>
+          <w:tcPr>
+            <w:tcW w:type="dxa" w:w="2480"/>
+            <w:vMerge w:val="restart"/>
+            <w:tcBorders/>
+            <w:shd w:fill="f7fafb"/>
+            <w:tcMar>
+              <w:start w:w="0" w:type="dxa"/>
+              <w:end w:w="0" w:type="dxa"/>
+            </w:tcMar>
+            <w:tcMar>
+              <w:start w:w="0" w:type="dxa"/>
+              <w:end w:w="0" w:type="dxa"/>
+            </w:tcMar>
+          </w:tcPr>
+          <w:p>
+            <w:pPr>
+              <w:autoSpaceDN w:val="0"/>
+              <w:autoSpaceDE w:val="0"/>
+              <w:widowControl/>
+              <w:spacing w:line="235" w:lineRule="auto" w:before="408" w:after="0"/>
+              <w:ind w:left="0" w:right="546" w:firstLine="0"/>
+              <w:jc w:val="right"/>
+            </w:pPr>
+            <w:r>
+              <w:rPr>
+                <w:w w:val="97.74999618530273"/>
+                <w:rFonts w:ascii="Liberation Sans" w:hAnsi="Liberation Sans" w:eastAsia="Liberation Sans"/>
+                <w:b/>
+                <w:i w:val="0"/>
+                <w:color w:val="2D3748"/>
+                <w:sz w:val="18"/>
+              </w:rPr>
+              <w:t>17</w:t>
+            </w:r>
+          </w:p>
+        </w:tc>
+      </w:tr>
+      <w:tr>
+        <w:trPr>
+          <w:trHeight w:hRule="exact" w:val="348"/>
+        </w:trPr>
+        <w:tc>
+          <w:tcPr>
+            <w:tcW w:type="dxa" w:w="1060"/>
+            <w:tcBorders/>
+            <w:shd w:fill="f7fafb"/>
+            <w:tcMar>
+              <w:start w:w="0" w:type="dxa"/>
+              <w:end w:w="0" w:type="dxa"/>
+            </w:tcMar>
+          </w:tcPr>
+          <w:p>
+            <w:pPr>
+              <w:autoSpaceDN w:val="0"/>
+              <w:autoSpaceDE w:val="0"/>
+              <w:widowControl/>
+              <w:spacing w:line="235" w:lineRule="auto" w:before="90" w:after="0"/>
+              <w:ind w:left="0" w:right="240" w:firstLine="0"/>
+              <w:jc w:val="right"/>
+            </w:pPr>
+            <w:r>
+              <w:rPr>
+                <w:w w:val="97.74999618530273"/>
+                <w:rFonts w:ascii="Liberation Sans" w:hAnsi="Liberation Sans" w:eastAsia="Liberation Sans"/>
+                <w:b/>
+                <w:i w:val="0"/>
+                <w:color w:val="2D3748"/>
+                <w:sz w:val="18"/>
+              </w:rPr>
+              <w:t>5.1</w:t>
+            </w:r>
+          </w:p>
+        </w:tc>
+        <w:tc>
+          <w:tcPr>
+            <w:tcW w:type="dxa" w:w="7220"/>
+            <w:tcBorders/>
+            <w:shd w:fill="f7fafb"/>
+            <w:tcMar>
+              <w:start w:w="0" w:type="dxa"/>
+              <w:end w:w="0" w:type="dxa"/>
+            </w:tcMar>
+          </w:tcPr>
+          <w:p>
+            <w:pPr>
+              <w:autoSpaceDN w:val="0"/>
+              <w:autoSpaceDE w:val="0"/>
+              <w:widowControl/>
+              <w:spacing w:line="235" w:lineRule="auto" w:before="90" w:after="0"/>
+              <w:ind w:left="266" w:right="0" w:firstLine="0"/>
+              <w:jc w:val="left"/>
+            </w:pPr>
+            <w:r>
+              <w:rPr>
+                <w:w w:val="97.74999618530273"/>
+                <w:rFonts w:ascii="Liberation Sans" w:hAnsi="Liberation Sans" w:eastAsia="Liberation Sans"/>
+                <w:b w:val="0"/>
+                <w:i w:val="0"/>
+                <w:color w:val="2D3748"/>
+                <w:sz w:val="18"/>
+              </w:rPr>
+              <w:t>Aparatur Desa, Keberadaan BPD/LMK, dan Sistem Informasi Desa</w:t>
+            </w:r>
+          </w:p>
+        </w:tc>
+        <w:tc>
+          <w:tcPr>
+            <w:tcW w:type="dxa" w:w="3006"/>
+            <w:vMerge/>
+            <w:tcBorders/>
+          </w:tcPr>
+          <w:p/>
+        </w:tc>
+      </w:tr>
+    </w:tbl>
+    <w:p>
+      <w:pPr>
+        <w:autoSpaceDN w:val="0"/>
+        <w:autoSpaceDE w:val="0"/>
+        <w:widowControl/>
+        <w:spacing w:line="8232" w:lineRule="exact" w:before="0" w:after="0"/>
         <w:ind w:left="0" w:right="0"/>
       </w:pPr>
     </w:p>
@@ -3631,6 +3969,15 @@
         </w:tc>
       </w:tr>
     </w:tbl>
+    <w:p>
+      <w:pPr>
+        <w:autoSpaceDN w:val="0"/>
+        <w:autoSpaceDE w:val="0"/>
+        <w:widowControl/>
+        <w:spacing w:line="14" w:lineRule="exact" w:before="0" w:after="0"/>
+        <w:ind w:left="0" w:right="0"/>
+      </w:pPr>
+    </w:p>
     <w:p>
       <w:pPr>
         <w:autoSpaceDN w:val="0"/>
@@ -5929,7 +6276,7 @@
         <w:autoSpaceDN w:val="0"/>
         <w:autoSpaceDE w:val="0"/>
         <w:widowControl/>
-        <w:spacing w:line="220" w:lineRule="exact" w:before="0" w:after="214"/>
+        <w:spacing w:line="220" w:lineRule="exact" w:before="0" w:after="5880"/>
         <w:ind w:left="0" w:right="0"/>
       </w:pPr>
       <w:r>
@@ -5940,9 +6287,9 @@
               <wp:posOffset>1244600</wp:posOffset>
             </wp:positionH>
             <wp:positionV relativeFrom="page">
-              <wp:posOffset>4864100</wp:posOffset>
+              <wp:posOffset>4457700</wp:posOffset>
             </wp:positionV>
-            <wp:extent cx="6311900" cy="2844800"/>
+            <wp:extent cx="6311900" cy="2882900"/>
             <wp:wrapNone/>
             <wp:docPr id="1" name="Picture 1"/>
             <wp:cNvGraphicFramePr>
@@ -5964,7 +6311,7 @@
                   <pic:spPr>
                     <a:xfrm>
                       <a:off x="0" y="0"/>
-                      <a:ext cx="6311900" cy="2844800"/>
+                      <a:ext cx="6311900" cy="2882900"/>
                     </a:xfrm>
                     <a:prstGeom prst="rect"/>
                   </pic:spPr>
@@ -5975,57 +6322,24 @@
         </w:drawing>
       </w:r>
     </w:p>
-    <w:p>
-      <w:pPr>
-        <w:autoSpaceDN w:val="0"/>
-        <w:autoSpaceDE w:val="0"/>
-        <w:widowControl/>
-        <w:spacing w:line="254" w:lineRule="auto" w:before="0" w:after="6844"/>
-        <w:ind w:left="5322" w:right="720" w:firstLine="216"/>
-        <w:jc w:val="left"/>
-      </w:pPr>
-      <w:r>
-        <w:rPr>
-          <w:rFonts w:ascii="Liberation Sans" w:hAnsi="Liberation Sans" w:eastAsia="Liberation Sans"/>
-          <w:b/>
-          <w:i w:val="0"/>
-          <w:color w:val="EB8A3C"/>
-          <w:sz w:val="17"/>
-        </w:rPr>
-        <w:t xml:space="preserve">BAB I WILAYAH ADMINISTRASI &amp; DEMOGRAFI </w:t>
-      </w:r>
-      <w:r>
-        <w:br/>
-      </w:r>
-      <w:r>
-        <w:rPr>
-          <w:rFonts w:ascii="Liberation Sans" w:hAnsi="Liberation Sans" w:eastAsia="Liberation Sans"/>
-          <w:b/>
-          <w:i/>
-          <w:color w:val="EB8A3C"/>
-          <w:sz w:val="17"/>
-        </w:rPr>
-        <w:t>CHAPTER I ADMINISTRATIVE &amp; DEMOGRAPHICS</w:t>
-      </w:r>
-    </w:p>
     <w:tbl>
       <w:tblPr>
         <w:tblW w:type="auto" w:w="0"/>
         <w:tblLayout w:type="fixed"/>
         <w:tblLook w:firstColumn="1" w:firstRow="1" w:lastColumn="0" w:lastRow="0" w:noHBand="0" w:noVBand="1" w:val="04A0"/>
-        <w:tblInd w:w="840.0" w:type="dxa"/>
+        <w:tblInd w:w="800.0" w:type="dxa"/>
       </w:tblPr>
       <w:tblGrid>
-        <w:gridCol w:w="5085"/>
-        <w:gridCol w:w="5085"/>
+        <w:gridCol w:w="5070"/>
+        <w:gridCol w:w="5070"/>
       </w:tblGrid>
       <w:tr>
         <w:trPr>
-          <w:trHeight w:hRule="exact" w:val="1072"/>
+          <w:trHeight w:hRule="exact" w:val="1390"/>
         </w:trPr>
         <w:tc>
           <w:tcPr>
-            <w:tcW w:type="dxa" w:w="1680"/>
+            <w:tcW w:type="dxa" w:w="1760"/>
             <w:tcBorders/>
             <w:tcMar>
               <w:start w:w="0" w:type="dxa"/>
@@ -6037,8 +6351,8 @@
               <w:autoSpaceDN w:val="0"/>
               <w:autoSpaceDE w:val="0"/>
               <w:widowControl/>
-              <w:spacing w:line="245" w:lineRule="auto" w:before="72" w:after="0"/>
-              <w:ind w:left="720" w:right="288" w:firstLine="0"/>
+              <w:spacing w:line="245" w:lineRule="auto" w:before="34" w:after="0"/>
+              <w:ind w:left="864" w:right="432" w:firstLine="0"/>
               <w:jc w:val="center"/>
             </w:pPr>
             <w:r>
@@ -6047,7 +6361,7 @@
                 <w:b/>
                 <w:i w:val="0"/>
                 <w:color w:val="FFFFFF"/>
-                <w:sz w:val="72"/>
+                <w:sz w:val="68"/>
               </w:rPr>
               <w:t xml:space="preserve">1 </w:t>
             </w:r>
@@ -6059,16 +6373,36 @@
                 <w:rFonts w:ascii="Liberation Sans" w:hAnsi="Liberation Sans" w:eastAsia="Liberation Sans"/>
                 <w:b/>
                 <w:i w:val="0"/>
-                <w:color w:val="FFFFFF"/>
-                <w:sz w:val="20"/>
+                <w:color w:val="EB8A3C"/>
+                <w:sz w:val="19"/>
               </w:rPr>
               <w:t>BAB</w:t>
+            </w:r>
+          </w:p>
+          <w:p>
+            <w:pPr>
+              <w:autoSpaceDN w:val="0"/>
+              <w:autoSpaceDE w:val="0"/>
+              <w:widowControl/>
+              <w:spacing w:line="233" w:lineRule="auto" w:before="18" w:after="0"/>
+              <w:ind w:left="0" w:right="360" w:firstLine="0"/>
+              <w:jc w:val="right"/>
+            </w:pPr>
+            <w:r>
+              <w:rPr>
+                <w:rFonts w:ascii="Liberation Sans" w:hAnsi="Liberation Sans" w:eastAsia="Liberation Sans"/>
+                <w:b/>
+                <w:i/>
+                <w:color w:val="FEF08A"/>
+                <w:sz w:val="15"/>
+              </w:rPr>
+              <w:t>Chapter</w:t>
             </w:r>
           </w:p>
         </w:tc>
         <w:tc>
           <w:tcPr>
-            <w:tcW w:type="dxa" w:w="7280"/>
+            <w:tcW w:type="dxa" w:w="7220"/>
             <w:tcBorders/>
             <w:tcMar>
               <w:start w:w="0" w:type="dxa"/>
@@ -6080,8 +6414,8 @@
               <w:autoSpaceDN w:val="0"/>
               <w:autoSpaceDE w:val="0"/>
               <w:widowControl/>
-              <w:spacing w:line="245" w:lineRule="auto" w:before="60" w:after="0"/>
-              <w:ind w:left="410" w:right="288" w:firstLine="0"/>
+              <w:spacing w:line="245" w:lineRule="auto" w:before="0" w:after="0"/>
+              <w:ind w:left="370" w:right="288" w:firstLine="0"/>
               <w:jc w:val="left"/>
             </w:pPr>
             <w:r>
@@ -6105,49 +6439,36 @@
               <w:t>KAWASAN</w:t>
             </w:r>
           </w:p>
+          <w:p>
+            <w:pPr>
+              <w:autoSpaceDN w:val="0"/>
+              <w:autoSpaceDE w:val="0"/>
+              <w:widowControl/>
+              <w:spacing w:line="233" w:lineRule="auto" w:before="314" w:after="0"/>
+              <w:ind w:left="0" w:right="0" w:firstLine="0"/>
+              <w:jc w:val="center"/>
+            </w:pPr>
+            <w:r>
+              <w:rPr>
+                <w:rFonts w:ascii="Liberation Sans" w:hAnsi="Liberation Sans" w:eastAsia="Liberation Sans"/>
+                <w:b/>
+                <w:i/>
+                <w:color w:val="FEF08A"/>
+                <w:sz w:val="24"/>
+              </w:rPr>
+              <w:t>ADMINISTRATIVE AREA, DEMOGRAPHICS &amp; REGION</w:t>
+            </w:r>
+          </w:p>
         </w:tc>
       </w:tr>
     </w:tbl>
     <w:p>
       <w:pPr>
         <w:autoSpaceDN w:val="0"/>
-        <w:tabs>
-          <w:tab w:pos="2930" w:val="left"/>
-        </w:tabs>
         <w:autoSpaceDE w:val="0"/>
         <w:widowControl/>
-        <w:spacing w:line="262" w:lineRule="auto" w:before="18" w:after="0"/>
-        <w:ind w:left="1616" w:right="0" w:firstLine="0"/>
-        <w:jc w:val="left"/>
-      </w:pPr>
-      <w:r>
-        <w:rPr>
-          <w:rFonts w:ascii="Liberation Sans" w:hAnsi="Liberation Sans" w:eastAsia="Liberation Sans"/>
-          <w:b/>
-          <w:i/>
-          <w:color w:val="FFFFFF"/>
-          <w:sz w:val="16"/>
-        </w:rPr>
-        <w:t xml:space="preserve">Chapter </w:t>
-      </w:r>
-      <w:r>
-        <w:rPr>
-          <w:rFonts w:ascii="Liberation Sans" w:hAnsi="Liberation Sans" w:eastAsia="Liberation Sans"/>
-          <w:b/>
-          <w:i/>
-          <w:color w:val="FFFFFF"/>
-          <w:sz w:val="24"/>
-        </w:rPr>
-        <w:t>ADMINISTRATIVE AREA, DEMOGRAPHICS &amp; REGION</w:t>
-      </w:r>
-    </w:p>
-    <w:p>
-      <w:pPr>
-        <w:autoSpaceDN w:val="0"/>
-        <w:autoSpaceDE w:val="0"/>
-        <w:widowControl/>
-        <w:spacing w:line="233" w:lineRule="auto" w:before="1098" w:after="0"/>
-        <w:ind w:left="1144" w:right="0" w:firstLine="0"/>
+        <w:spacing w:line="233" w:lineRule="auto" w:before="1068" w:after="0"/>
+        <w:ind w:left="1174" w:right="0" w:firstLine="0"/>
         <w:jc w:val="left"/>
       </w:pPr>
       <w:r>
@@ -6196,8 +6517,8 @@
         <w:autoSpaceDN w:val="0"/>
         <w:autoSpaceDE w:val="0"/>
         <w:widowControl/>
-        <w:spacing w:line="233" w:lineRule="auto" w:before="72" w:after="0"/>
-        <w:ind w:left="1144" w:right="0" w:firstLine="0"/>
+        <w:spacing w:line="233" w:lineRule="auto" w:before="74" w:after="0"/>
+        <w:ind w:left="1174" w:right="0" w:firstLine="0"/>
         <w:jc w:val="left"/>
       </w:pPr>
       <w:r>
@@ -6246,8 +6567,8 @@
         <w:autoSpaceDN w:val="0"/>
         <w:autoSpaceDE w:val="0"/>
         <w:widowControl/>
-        <w:spacing w:line="233" w:lineRule="auto" w:before="74" w:after="0"/>
-        <w:ind w:left="1144" w:right="0" w:firstLine="0"/>
+        <w:spacing w:line="233" w:lineRule="auto" w:before="72" w:after="0"/>
+        <w:ind w:left="1174" w:right="0" w:firstLine="0"/>
         <w:jc w:val="left"/>
       </w:pPr>
       <w:r>
@@ -6286,8 +6607,8 @@
         <w:autoSpaceDN w:val="0"/>
         <w:autoSpaceDE w:val="0"/>
         <w:widowControl/>
-        <w:spacing w:line="233" w:lineRule="auto" w:before="4884" w:after="0"/>
-        <w:ind w:left="0" w:right="498" w:firstLine="0"/>
+        <w:spacing w:line="233" w:lineRule="auto" w:before="5500" w:after="0"/>
+        <w:ind w:left="0" w:right="468" w:firstLine="0"/>
         <w:jc w:val="right"/>
       </w:pPr>
       <w:r>
@@ -6305,7 +6626,7 @@
       <w:pPr>
         <w:sectPr>
           <w:pgSz w:w="11899" w:h="16838"/>
-          <w:pgMar w:top="432" w:right="288" w:bottom="162" w:left="1440" w:header="720" w:footer="720" w:gutter="0"/>
+          <w:pgMar w:top="1440" w:right="318" w:bottom="162" w:left="1440" w:header="720" w:footer="720" w:gutter="0"/>
           <w:cols/>
           <w:docGrid w:linePitch="360"/>
         </w:sectPr>
@@ -7613,27 +7934,68 @@
         <w:autoSpaceDN w:val="0"/>
         <w:autoSpaceDE w:val="0"/>
         <w:widowControl/>
-        <w:spacing w:line="20" w:lineRule="exact" w:before="0" w:after="0"/>
-        <w:ind w:left="0" w:right="0"/>
+        <w:spacing w:line="233" w:lineRule="auto" w:before="36" w:after="14"/>
+        <w:ind w:left="0" w:right="0" w:firstLine="0"/>
+        <w:jc w:val="center"/>
       </w:pPr>
+      <w:r>
+        <w:rPr>
+          <w:rFonts w:ascii="Liberation Sans" w:hAnsi="Liberation Sans" w:eastAsia="Liberation Sans"/>
+          <w:b/>
+          <w:i w:val="0"/>
+          <w:color w:val="2D3748"/>
+          <w:sz w:val="15"/>
+        </w:rPr>
+        <w:t>Sumber/</w:t>
+      </w:r>
+      <w:r>
+        <w:rPr>
+          <w:rFonts w:ascii="Liberation Sans" w:hAnsi="Liberation Sans" w:eastAsia="Liberation Sans"/>
+          <w:b/>
+          <w:i/>
+          <w:color w:val="2D3748"/>
+          <w:sz w:val="15"/>
+        </w:rPr>
+        <w:t>Source:</w:t>
+      </w:r>
+      <w:r>
+        <w:rPr>
+          <w:rFonts w:ascii="Liberation Sans" w:hAnsi="Liberation Sans" w:eastAsia="Liberation Sans"/>
+          <w:b w:val="0"/>
+          <w:i w:val="0"/>
+          <w:color w:val="4A5568"/>
+          <w:sz w:val="15"/>
+        </w:rPr>
+        <w:t xml:space="preserve">Pemerintah Desa Pasir Palembang &amp; BPS Kabupaten Mempawah — PODES 2025 / </w:t>
+      </w:r>
+      <w:r>
+        <w:rPr>
+          <w:rFonts w:ascii="Liberation Sans" w:hAnsi="Liberation Sans" w:eastAsia="Liberation Sans"/>
+          <w:b w:val="0"/>
+          <w:i/>
+          <w:color w:val="4A5568"/>
+          <w:sz w:val="15"/>
+        </w:rPr>
+        <w:t>Government of Pasir Palembang Village</w:t>
+      </w:r>
     </w:p>
     <w:tbl>
       <w:tblPr>
         <w:tblW w:type="auto" w:w="0"/>
         <w:tblLayout w:type="fixed"/>
         <w:tblLook w:firstColumn="1" w:firstRow="1" w:lastColumn="0" w:lastRow="0" w:noHBand="0" w:noVBand="1" w:val="04A0"/>
-        <w:tblInd w:w="560.0" w:type="dxa"/>
+        <w:tblInd w:w="1200.0" w:type="dxa"/>
       </w:tblPr>
       <w:tblGrid>
         <w:gridCol w:w="9019"/>
       </w:tblGrid>
       <w:tr>
         <w:trPr>
-          <w:trHeight w:hRule="exact" w:val="264"/>
+          <w:trHeight w:hRule="exact" w:val="240"/>
         </w:trPr>
         <w:tc>
           <w:tcPr>
-            <w:tcW w:type="dxa" w:w="10480"/>
+            <w:tcW w:type="dxa" w:w="7780"/>
             <w:tcBorders/>
             <w:shd w:fill="f7fafb"/>
             <w:tcMar>
@@ -7646,40 +8008,10 @@
               <w:autoSpaceDN w:val="0"/>
               <w:autoSpaceDE w:val="0"/>
               <w:widowControl/>
-              <w:spacing w:line="233" w:lineRule="auto" w:before="36" w:after="0"/>
-              <w:ind w:left="576" w:right="0" w:firstLine="0"/>
+              <w:spacing w:line="230" w:lineRule="auto" w:before="14" w:after="0"/>
+              <w:ind w:left="1212" w:right="0" w:firstLine="0"/>
               <w:jc w:val="left"/>
             </w:pPr>
-            <w:r>
-              <w:rPr>
-                <w:rFonts w:ascii="Liberation Sans" w:hAnsi="Liberation Sans" w:eastAsia="Liberation Sans"/>
-                <w:b/>
-                <w:i w:val="0"/>
-                <w:color w:val="2D3748"/>
-                <w:sz w:val="15"/>
-              </w:rPr>
-              <w:t>Sumber/</w:t>
-            </w:r>
-            <w:r>
-              <w:rPr>
-                <w:rFonts w:ascii="Liberation Sans" w:hAnsi="Liberation Sans" w:eastAsia="Liberation Sans"/>
-                <w:b/>
-                <w:i/>
-                <w:color w:val="2D3748"/>
-                <w:sz w:val="15"/>
-              </w:rPr>
-              <w:t>Source:</w:t>
-            </w:r>
-            <w:r>
-              <w:rPr>
-                <w:rFonts w:ascii="Liberation Sans" w:hAnsi="Liberation Sans" w:eastAsia="Liberation Sans"/>
-                <w:b w:val="0"/>
-                <w:i w:val="0"/>
-                <w:color w:val="4A5568"/>
-                <w:sz w:val="15"/>
-              </w:rPr>
-              <w:t xml:space="preserve">Badan Pusat Statistik Kabupaten Mempawah — PODES 2025 / </w:t>
-            </w:r>
             <w:r>
               <w:rPr>
                 <w:rFonts w:ascii="Liberation Sans" w:hAnsi="Liberation Sans" w:eastAsia="Liberation Sans"/>
@@ -7688,7 +8020,7 @@
                 <w:color w:val="4A5568"/>
                 <w:sz w:val="15"/>
               </w:rPr>
-              <w:t>BPS-Statistics Mempawah Regency — PODES 2025</w:t>
+              <w:t>&amp; BPS-Statistics Mempawah Regency — PODES 2025</w:t>
             </w:r>
           </w:p>
         </w:tc>
@@ -7699,7 +8031,7 @@
         <w:autoSpaceDN w:val="0"/>
         <w:autoSpaceDE w:val="0"/>
         <w:widowControl/>
-        <w:spacing w:line="6558" w:lineRule="exact" w:before="0" w:after="0"/>
+        <w:spacing w:line="6364" w:lineRule="exact" w:before="0" w:after="0"/>
         <w:ind w:left="0" w:right="0"/>
       </w:pPr>
     </w:p>
@@ -7750,24 +8082,6 @@
         </w:tc>
       </w:tr>
     </w:tbl>
-    <w:p>
-      <w:pPr>
-        <w:autoSpaceDN w:val="0"/>
-        <w:autoSpaceDE w:val="0"/>
-        <w:widowControl/>
-        <w:spacing w:line="14" w:lineRule="exact" w:before="0" w:after="0"/>
-        <w:ind w:left="0" w:right="0"/>
-      </w:pPr>
-    </w:p>
-    <w:p>
-      <w:pPr>
-        <w:autoSpaceDN w:val="0"/>
-        <w:autoSpaceDE w:val="0"/>
-        <w:widowControl/>
-        <w:spacing w:line="14" w:lineRule="exact" w:before="0" w:after="0"/>
-        <w:ind w:left="0" w:right="0"/>
-      </w:pPr>
-    </w:p>
     <w:p>
       <w:pPr>
         <w:autoSpaceDN w:val="0"/>
@@ -8824,27 +9138,68 @@
         <w:autoSpaceDN w:val="0"/>
         <w:autoSpaceDE w:val="0"/>
         <w:widowControl/>
-        <w:spacing w:line="20" w:lineRule="exact" w:before="0" w:after="0"/>
-        <w:ind w:left="0" w:right="0"/>
+        <w:spacing w:line="233" w:lineRule="auto" w:before="36" w:after="14"/>
+        <w:ind w:left="0" w:right="0" w:firstLine="0"/>
+        <w:jc w:val="center"/>
       </w:pPr>
+      <w:r>
+        <w:rPr>
+          <w:rFonts w:ascii="Liberation Sans" w:hAnsi="Liberation Sans" w:eastAsia="Liberation Sans"/>
+          <w:b/>
+          <w:i w:val="0"/>
+          <w:color w:val="2D3748"/>
+          <w:sz w:val="15"/>
+        </w:rPr>
+        <w:t>Sumber/</w:t>
+      </w:r>
+      <w:r>
+        <w:rPr>
+          <w:rFonts w:ascii="Liberation Sans" w:hAnsi="Liberation Sans" w:eastAsia="Liberation Sans"/>
+          <w:b/>
+          <w:i/>
+          <w:color w:val="2D3748"/>
+          <w:sz w:val="15"/>
+        </w:rPr>
+        <w:t>Source:</w:t>
+      </w:r>
+      <w:r>
+        <w:rPr>
+          <w:rFonts w:ascii="Liberation Sans" w:hAnsi="Liberation Sans" w:eastAsia="Liberation Sans"/>
+          <w:b w:val="0"/>
+          <w:i w:val="0"/>
+          <w:color w:val="4A5568"/>
+          <w:sz w:val="15"/>
+        </w:rPr>
+        <w:t xml:space="preserve">Pemerintah Desa Pasir Palembang &amp; BPS Kabupaten Mempawah — PODES 2025 / </w:t>
+      </w:r>
+      <w:r>
+        <w:rPr>
+          <w:rFonts w:ascii="Liberation Sans" w:hAnsi="Liberation Sans" w:eastAsia="Liberation Sans"/>
+          <w:b w:val="0"/>
+          <w:i/>
+          <w:color w:val="4A5568"/>
+          <w:sz w:val="15"/>
+        </w:rPr>
+        <w:t>Government of Pasir Palembang Village</w:t>
+      </w:r>
     </w:p>
     <w:tbl>
       <w:tblPr>
         <w:tblW w:type="auto" w:w="0"/>
         <w:tblLayout w:type="fixed"/>
         <w:tblLook w:firstColumn="1" w:firstRow="1" w:lastColumn="0" w:lastRow="0" w:noHBand="0" w:noVBand="1" w:val="04A0"/>
-        <w:tblInd w:w="560.0" w:type="dxa"/>
+        <w:tblInd w:w="1200.0" w:type="dxa"/>
       </w:tblPr>
       <w:tblGrid>
         <w:gridCol w:w="9019"/>
       </w:tblGrid>
       <w:tr>
         <w:trPr>
-          <w:trHeight w:hRule="exact" w:val="264"/>
+          <w:trHeight w:hRule="exact" w:val="240"/>
         </w:trPr>
         <w:tc>
           <w:tcPr>
-            <w:tcW w:type="dxa" w:w="10480"/>
+            <w:tcW w:type="dxa" w:w="7780"/>
             <w:tcBorders/>
             <w:shd w:fill="f7fafb"/>
             <w:tcMar>
@@ -8857,40 +9212,10 @@
               <w:autoSpaceDN w:val="0"/>
               <w:autoSpaceDE w:val="0"/>
               <w:widowControl/>
-              <w:spacing w:line="233" w:lineRule="auto" w:before="36" w:after="0"/>
-              <w:ind w:left="576" w:right="0" w:firstLine="0"/>
+              <w:spacing w:line="230" w:lineRule="auto" w:before="14" w:after="0"/>
+              <w:ind w:left="1212" w:right="0" w:firstLine="0"/>
               <w:jc w:val="left"/>
             </w:pPr>
-            <w:r>
-              <w:rPr>
-                <w:rFonts w:ascii="Liberation Sans" w:hAnsi="Liberation Sans" w:eastAsia="Liberation Sans"/>
-                <w:b/>
-                <w:i w:val="0"/>
-                <w:color w:val="2D3748"/>
-                <w:sz w:val="15"/>
-              </w:rPr>
-              <w:t>Sumber/</w:t>
-            </w:r>
-            <w:r>
-              <w:rPr>
-                <w:rFonts w:ascii="Liberation Sans" w:hAnsi="Liberation Sans" w:eastAsia="Liberation Sans"/>
-                <w:b/>
-                <w:i/>
-                <w:color w:val="2D3748"/>
-                <w:sz w:val="15"/>
-              </w:rPr>
-              <w:t>Source:</w:t>
-            </w:r>
-            <w:r>
-              <w:rPr>
-                <w:rFonts w:ascii="Liberation Sans" w:hAnsi="Liberation Sans" w:eastAsia="Liberation Sans"/>
-                <w:b w:val="0"/>
-                <w:i w:val="0"/>
-                <w:color w:val="4A5568"/>
-                <w:sz w:val="15"/>
-              </w:rPr>
-              <w:t xml:space="preserve">Badan Pusat Statistik Kabupaten Mempawah — PODES 2025 / </w:t>
-            </w:r>
             <w:r>
               <w:rPr>
                 <w:rFonts w:ascii="Liberation Sans" w:hAnsi="Liberation Sans" w:eastAsia="Liberation Sans"/>
@@ -8899,7 +9224,7 @@
                 <w:color w:val="4A5568"/>
                 <w:sz w:val="15"/>
               </w:rPr>
-              <w:t>BPS-Statistics Mempawah Regency — PODES 2025</w:t>
+              <w:t>&amp; BPS-Statistics Mempawah Regency — PODES 2025</w:t>
             </w:r>
           </w:p>
         </w:tc>
@@ -8910,7 +9235,7 @@
         <w:autoSpaceDN w:val="0"/>
         <w:autoSpaceDE w:val="0"/>
         <w:widowControl/>
-        <w:spacing w:line="9438" w:lineRule="exact" w:before="0" w:after="0"/>
+        <w:spacing w:line="9244" w:lineRule="exact" w:before="0" w:after="0"/>
         <w:ind w:left="0" w:right="0"/>
       </w:pPr>
     </w:p>
@@ -8981,24 +9306,6 @@
     </w:p>
     <w:p>
       <w:pPr>
-        <w:autoSpaceDN w:val="0"/>
-        <w:autoSpaceDE w:val="0"/>
-        <w:widowControl/>
-        <w:spacing w:line="14" w:lineRule="exact" w:before="0" w:after="0"/>
-        <w:ind w:left="0" w:right="0"/>
-      </w:pPr>
-    </w:p>
-    <w:p>
-      <w:pPr>
-        <w:autoSpaceDN w:val="0"/>
-        <w:autoSpaceDE w:val="0"/>
-        <w:widowControl/>
-        <w:spacing w:line="14" w:lineRule="exact" w:before="0" w:after="0"/>
-        <w:ind w:left="0" w:right="0"/>
-      </w:pPr>
-    </w:p>
-    <w:p>
-      <w:pPr>
         <w:sectPr>
           <w:pgSz w:w="11899" w:h="16838"/>
           <w:pgMar w:top="0" w:right="0" w:bottom="0" w:left="0" w:header="720" w:footer="720" w:gutter="0"/>
@@ -9012,7 +9319,7 @@
         <w:autoSpaceDN w:val="0"/>
         <w:autoSpaceDE w:val="0"/>
         <w:widowControl/>
-        <w:spacing w:line="220" w:lineRule="exact" w:before="0" w:after="214"/>
+        <w:spacing w:line="220" w:lineRule="exact" w:before="0" w:after="6030"/>
         <w:ind w:left="0" w:right="0"/>
       </w:pPr>
       <w:r>
@@ -9023,9 +9330,9 @@
               <wp:posOffset>1244600</wp:posOffset>
             </wp:positionH>
             <wp:positionV relativeFrom="page">
-              <wp:posOffset>4965700</wp:posOffset>
+              <wp:posOffset>4559300</wp:posOffset>
             </wp:positionV>
-            <wp:extent cx="6311900" cy="2654300"/>
+            <wp:extent cx="6311900" cy="2692400"/>
             <wp:wrapNone/>
             <wp:docPr id="2" name="Picture 2"/>
             <wp:cNvGraphicFramePr>
@@ -9047,7 +9354,7 @@
                   <pic:spPr>
                     <a:xfrm>
                       <a:off x="0" y="0"/>
-                      <a:ext cx="6311900" cy="2654300"/>
+                      <a:ext cx="6311900" cy="2692400"/>
                     </a:xfrm>
                     <a:prstGeom prst="rect"/>
                   </pic:spPr>
@@ -9058,57 +9365,24 @@
         </w:drawing>
       </w:r>
     </w:p>
-    <w:p>
-      <w:pPr>
-        <w:autoSpaceDN w:val="0"/>
-        <w:autoSpaceDE w:val="0"/>
-        <w:widowControl/>
-        <w:spacing w:line="254" w:lineRule="auto" w:before="0" w:after="6994"/>
-        <w:ind w:left="340" w:right="6192" w:firstLine="0"/>
-        <w:jc w:val="left"/>
-      </w:pPr>
-      <w:r>
-        <w:rPr>
-          <w:rFonts w:ascii="Liberation Sans" w:hAnsi="Liberation Sans" w:eastAsia="Liberation Sans"/>
-          <w:b/>
-          <w:i w:val="0"/>
-          <w:color w:val="EB8A3C"/>
-          <w:sz w:val="17"/>
-        </w:rPr>
-        <w:t xml:space="preserve">POTENSI DESA PASIR PALEMBANG 2026 </w:t>
-      </w:r>
-      <w:r>
-        <w:br/>
-      </w:r>
-      <w:r>
-        <w:rPr>
-          <w:rFonts w:ascii="Liberation Sans" w:hAnsi="Liberation Sans" w:eastAsia="Liberation Sans"/>
-          <w:b/>
-          <w:i/>
-          <w:color w:val="EB8A3C"/>
-          <w:sz w:val="17"/>
-        </w:rPr>
-        <w:t>POTENTIALS OF PASIR PALEMBANG VILLAGE 2026</w:t>
-      </w:r>
-    </w:p>
     <w:tbl>
       <w:tblPr>
         <w:tblW w:type="auto" w:w="0"/>
         <w:tblLayout w:type="fixed"/>
         <w:tblLook w:firstColumn="1" w:firstRow="1" w:lastColumn="0" w:lastRow="0" w:noHBand="0" w:noVBand="1" w:val="04A0"/>
-        <w:tblInd w:w="1164.0" w:type="dxa"/>
+        <w:tblInd w:w="1124.0" w:type="dxa"/>
       </w:tblPr>
       <w:tblGrid>
-        <w:gridCol w:w="5407"/>
-        <w:gridCol w:w="5407"/>
+        <w:gridCol w:w="5392"/>
+        <w:gridCol w:w="5392"/>
       </w:tblGrid>
       <w:tr>
         <w:trPr>
-          <w:trHeight w:hRule="exact" w:val="1062"/>
+          <w:trHeight w:hRule="exact" w:val="1376"/>
         </w:trPr>
         <w:tc>
           <w:tcPr>
-            <w:tcW w:type="dxa" w:w="2000"/>
+            <w:tcW w:type="dxa" w:w="2080"/>
             <w:tcBorders/>
             <w:tcMar>
               <w:start w:w="0" w:type="dxa"/>
@@ -9120,8 +9394,8 @@
               <w:autoSpaceDN w:val="0"/>
               <w:autoSpaceDE w:val="0"/>
               <w:widowControl/>
-              <w:spacing w:line="245" w:lineRule="auto" w:before="72" w:after="0"/>
-              <w:ind w:left="1152" w:right="288" w:firstLine="0"/>
+              <w:spacing w:line="245" w:lineRule="auto" w:before="20" w:after="0"/>
+              <w:ind w:left="1152" w:right="432" w:firstLine="0"/>
               <w:jc w:val="center"/>
             </w:pPr>
             <w:r>
@@ -9130,7 +9404,7 @@
                 <w:b/>
                 <w:i w:val="0"/>
                 <w:color w:val="FFFFFF"/>
-                <w:sz w:val="72"/>
+                <w:sz w:val="68"/>
               </w:rPr>
               <w:t xml:space="preserve">2 </w:t>
             </w:r>
@@ -9142,16 +9416,36 @@
                 <w:rFonts w:ascii="Liberation Sans" w:hAnsi="Liberation Sans" w:eastAsia="Liberation Sans"/>
                 <w:b/>
                 <w:i w:val="0"/>
-                <w:color w:val="FFFFFF"/>
-                <w:sz w:val="20"/>
+                <w:color w:val="EB8A3C"/>
+                <w:sz w:val="19"/>
               </w:rPr>
               <w:t>BAB</w:t>
+            </w:r>
+          </w:p>
+          <w:p>
+            <w:pPr>
+              <w:autoSpaceDN w:val="0"/>
+              <w:autoSpaceDE w:val="0"/>
+              <w:widowControl/>
+              <w:spacing w:line="233" w:lineRule="auto" w:before="34" w:after="0"/>
+              <w:ind w:left="0" w:right="360" w:firstLine="0"/>
+              <w:jc w:val="right"/>
+            </w:pPr>
+            <w:r>
+              <w:rPr>
+                <w:rFonts w:ascii="Liberation Sans" w:hAnsi="Liberation Sans" w:eastAsia="Liberation Sans"/>
+                <w:b/>
+                <w:i/>
+                <w:color w:val="FEF08A"/>
+                <w:sz w:val="15"/>
+              </w:rPr>
+              <w:t>Chapter</w:t>
             </w:r>
           </w:p>
         </w:tc>
         <w:tc>
           <w:tcPr>
-            <w:tcW w:type="dxa" w:w="6780"/>
+            <w:tcW w:type="dxa" w:w="7360"/>
             <w:tcBorders/>
             <w:tcMar>
               <w:start w:w="0" w:type="dxa"/>
@@ -9163,8 +9457,8 @@
               <w:autoSpaceDN w:val="0"/>
               <w:autoSpaceDE w:val="0"/>
               <w:widowControl/>
-              <w:spacing w:line="245" w:lineRule="auto" w:before="60" w:after="0"/>
-              <w:ind w:left="410" w:right="720" w:firstLine="0"/>
+              <w:spacing w:line="245" w:lineRule="auto" w:before="0" w:after="0"/>
+              <w:ind w:left="370" w:right="1440" w:firstLine="0"/>
               <w:jc w:val="left"/>
             </w:pPr>
             <w:r>
@@ -9188,78 +9482,12 @@
               <w:t>MITIGASI BENCANA</w:t>
             </w:r>
           </w:p>
-        </w:tc>
-      </w:tr>
-    </w:tbl>
-    <w:p>
-      <w:pPr>
-        <w:autoSpaceDN w:val="0"/>
-        <w:autoSpaceDE w:val="0"/>
-        <w:widowControl/>
-        <w:spacing w:line="20" w:lineRule="exact" w:before="0" w:after="0"/>
-        <w:ind w:left="0" w:right="0"/>
-      </w:pPr>
-    </w:p>
-    <w:tbl>
-      <w:tblPr>
-        <w:tblW w:type="auto" w:w="0"/>
-        <w:tblLayout w:type="fixed"/>
-        <w:tblLook w:firstColumn="1" w:firstRow="1" w:lastColumn="0" w:lastRow="0" w:noHBand="0" w:noVBand="1" w:val="04A0"/>
-        <w:tblInd w:w="1124.0" w:type="dxa"/>
-      </w:tblPr>
-      <w:tblGrid>
-        <w:gridCol w:w="5407"/>
-        <w:gridCol w:w="5407"/>
-      </w:tblGrid>
-      <w:tr>
-        <w:trPr>
-          <w:trHeight w:hRule="exact" w:val="436"/>
-        </w:trPr>
-        <w:tc>
-          <w:tcPr>
-            <w:tcW w:type="dxa" w:w="2080"/>
-            <w:tcBorders/>
-            <w:tcMar>
-              <w:start w:w="0" w:type="dxa"/>
-              <w:end w:w="0" w:type="dxa"/>
-            </w:tcMar>
-          </w:tcPr>
           <w:p>
             <w:pPr>
               <w:autoSpaceDN w:val="0"/>
               <w:autoSpaceDE w:val="0"/>
               <w:widowControl/>
-              <w:spacing w:line="233" w:lineRule="auto" w:before="60" w:after="0"/>
-              <w:ind w:left="0" w:right="340" w:firstLine="0"/>
-              <w:jc w:val="right"/>
-            </w:pPr>
-            <w:r>
-              <w:rPr>
-                <w:rFonts w:ascii="Liberation Sans" w:hAnsi="Liberation Sans" w:eastAsia="Liberation Sans"/>
-                <w:b/>
-                <w:i/>
-                <w:color w:val="FFFFFF"/>
-                <w:sz w:val="16"/>
-              </w:rPr>
-              <w:t>Chapter</w:t>
-            </w:r>
-          </w:p>
-        </w:tc>
-        <w:tc>
-          <w:tcPr>
-            <w:tcW w:type="dxa" w:w="7360"/>
-            <w:tcBorders/>
-            <w:tcMar>
-              <w:start w:w="0" w:type="dxa"/>
-              <w:end w:w="0" w:type="dxa"/>
-            </w:tcMar>
-          </w:tcPr>
-          <w:p>
-            <w:pPr>
-              <w:autoSpaceDN w:val="0"/>
-              <w:autoSpaceDE w:val="0"/>
-              <w:widowControl/>
-              <w:spacing w:line="233" w:lineRule="auto" w:before="108" w:after="0"/>
+              <w:spacing w:line="233" w:lineRule="auto" w:before="316" w:after="0"/>
               <w:ind w:left="370" w:right="0" w:firstLine="0"/>
               <w:jc w:val="left"/>
             </w:pPr>
@@ -9268,7 +9496,7 @@
                 <w:rFonts w:ascii="Liberation Sans" w:hAnsi="Liberation Sans" w:eastAsia="Liberation Sans"/>
                 <w:b/>
                 <w:i/>
-                <w:color w:val="FFFFFF"/>
+                <w:color w:val="FEF08A"/>
                 <w:sz w:val="24"/>
               </w:rPr>
               <w:t>ENERGY, HOUSING UTILITIES &amp; DISASTER MITIGATION</w:t>
@@ -9282,8 +9510,8 @@
         <w:autoSpaceDN w:val="0"/>
         <w:autoSpaceDE w:val="0"/>
         <w:widowControl/>
-        <w:spacing w:line="233" w:lineRule="auto" w:before="1038" w:after="0"/>
-        <w:ind w:left="1788" w:right="0" w:firstLine="0"/>
+        <w:spacing w:line="233" w:lineRule="auto" w:before="1082" w:after="0"/>
+        <w:ind w:left="1818" w:right="0" w:firstLine="0"/>
         <w:jc w:val="left"/>
       </w:pPr>
       <w:r>
@@ -9314,7 +9542,7 @@
           <w:color w:val="334155"/>
           <w:sz w:val="19"/>
         </w:rPr>
-        <w:t>. Sebagian besar keluarga menggunakan air minum</w:t>
+        <w:t>. Sebagian besar keluarga menggunakan air</w:t>
       </w:r>
     </w:p>
     <w:p>
@@ -9322,8 +9550,8 @@
         <w:autoSpaceDN w:val="0"/>
         <w:autoSpaceDE w:val="0"/>
         <w:widowControl/>
-        <w:spacing w:line="233" w:lineRule="auto" w:before="72" w:after="0"/>
-        <w:ind w:left="1788" w:right="0" w:firstLine="0"/>
+        <w:spacing w:line="233" w:lineRule="auto" w:before="74" w:after="0"/>
+        <w:ind w:left="1818" w:right="0" w:firstLine="0"/>
         <w:jc w:val="left"/>
       </w:pPr>
       <w:r>
@@ -9334,7 +9562,7 @@
           <w:color w:val="334155"/>
           <w:sz w:val="19"/>
         </w:rPr>
-        <w:t xml:space="preserve">berjenis </w:t>
+        <w:t xml:space="preserve">minum berjenis </w:t>
       </w:r>
       <w:r>
         <w:rPr>
@@ -9382,7 +9610,7 @@
         <w:autoSpaceDN w:val="0"/>
         <w:autoSpaceDE w:val="0"/>
         <w:widowControl/>
-        <w:spacing w:line="233" w:lineRule="auto" w:before="5020" w:after="0"/>
+        <w:spacing w:line="233" w:lineRule="auto" w:before="5634" w:after="0"/>
         <w:ind w:left="0" w:right="0" w:firstLine="0"/>
         <w:jc w:val="left"/>
       </w:pPr>
@@ -9401,7 +9629,7 @@
       <w:pPr>
         <w:sectPr>
           <w:pgSz w:w="11899" w:h="16838"/>
-          <w:pgMar w:top="432" w:right="288" w:bottom="162" w:left="796" w:header="720" w:footer="720" w:gutter="0"/>
+          <w:pgMar w:top="1440" w:right="318" w:bottom="162" w:left="796" w:header="720" w:footer="720" w:gutter="0"/>
           <w:cols/>
           <w:docGrid w:linePitch="360"/>
         </w:sectPr>
@@ -10344,27 +10572,68 @@
         <w:autoSpaceDN w:val="0"/>
         <w:autoSpaceDE w:val="0"/>
         <w:widowControl/>
-        <w:spacing w:line="20" w:lineRule="exact" w:before="0" w:after="0"/>
-        <w:ind w:left="0" w:right="0"/>
+        <w:spacing w:line="233" w:lineRule="auto" w:before="30" w:after="20"/>
+        <w:ind w:left="0" w:right="0" w:firstLine="0"/>
+        <w:jc w:val="center"/>
       </w:pPr>
+      <w:r>
+        <w:rPr>
+          <w:rFonts w:ascii="Liberation Sans" w:hAnsi="Liberation Sans" w:eastAsia="Liberation Sans"/>
+          <w:b/>
+          <w:i w:val="0"/>
+          <w:color w:val="2D3748"/>
+          <w:sz w:val="15"/>
+        </w:rPr>
+        <w:t>Sumber/</w:t>
+      </w:r>
+      <w:r>
+        <w:rPr>
+          <w:rFonts w:ascii="Liberation Sans" w:hAnsi="Liberation Sans" w:eastAsia="Liberation Sans"/>
+          <w:b/>
+          <w:i/>
+          <w:color w:val="2D3748"/>
+          <w:sz w:val="15"/>
+        </w:rPr>
+        <w:t>Source:</w:t>
+      </w:r>
+      <w:r>
+        <w:rPr>
+          <w:rFonts w:ascii="Liberation Sans" w:hAnsi="Liberation Sans" w:eastAsia="Liberation Sans"/>
+          <w:b w:val="0"/>
+          <w:i w:val="0"/>
+          <w:color w:val="4A5568"/>
+          <w:sz w:val="15"/>
+        </w:rPr>
+        <w:t xml:space="preserve">Pemerintah Desa Pasir Palembang &amp; BPS Kabupaten Mempawah — PODES 2025 / </w:t>
+      </w:r>
+      <w:r>
+        <w:rPr>
+          <w:rFonts w:ascii="Liberation Sans" w:hAnsi="Liberation Sans" w:eastAsia="Liberation Sans"/>
+          <w:b w:val="0"/>
+          <w:i/>
+          <w:color w:val="4A5568"/>
+          <w:sz w:val="15"/>
+        </w:rPr>
+        <w:t>Government of Pasir Palembang Village</w:t>
+      </w:r>
     </w:p>
     <w:tbl>
       <w:tblPr>
         <w:tblW w:type="auto" w:w="0"/>
         <w:tblLayout w:type="fixed"/>
         <w:tblLook w:firstColumn="1" w:firstRow="1" w:lastColumn="0" w:lastRow="0" w:noHBand="0" w:noVBand="1" w:val="04A0"/>
-        <w:tblInd w:w="560.0" w:type="dxa"/>
+        <w:tblInd w:w="1200.0" w:type="dxa"/>
       </w:tblPr>
       <w:tblGrid>
         <w:gridCol w:w="9019"/>
       </w:tblGrid>
       <w:tr>
         <w:trPr>
-          <w:trHeight w:hRule="exact" w:val="258"/>
+          <w:trHeight w:hRule="exact" w:val="250"/>
         </w:trPr>
         <w:tc>
           <w:tcPr>
-            <w:tcW w:type="dxa" w:w="10480"/>
+            <w:tcW w:type="dxa" w:w="7780"/>
             <w:tcBorders/>
             <w:shd w:fill="f7fafb"/>
             <w:tcMar>
@@ -10377,40 +10646,10 @@
               <w:autoSpaceDN w:val="0"/>
               <w:autoSpaceDE w:val="0"/>
               <w:widowControl/>
-              <w:spacing w:line="233" w:lineRule="auto" w:before="30" w:after="0"/>
-              <w:ind w:left="576" w:right="0" w:firstLine="0"/>
+              <w:spacing w:line="233" w:lineRule="auto" w:before="22" w:after="0"/>
+              <w:ind w:left="1212" w:right="0" w:firstLine="0"/>
               <w:jc w:val="left"/>
             </w:pPr>
-            <w:r>
-              <w:rPr>
-                <w:rFonts w:ascii="Liberation Sans" w:hAnsi="Liberation Sans" w:eastAsia="Liberation Sans"/>
-                <w:b/>
-                <w:i w:val="0"/>
-                <w:color w:val="2D3748"/>
-                <w:sz w:val="15"/>
-              </w:rPr>
-              <w:t>Sumber/</w:t>
-            </w:r>
-            <w:r>
-              <w:rPr>
-                <w:rFonts w:ascii="Liberation Sans" w:hAnsi="Liberation Sans" w:eastAsia="Liberation Sans"/>
-                <w:b/>
-                <w:i/>
-                <w:color w:val="2D3748"/>
-                <w:sz w:val="15"/>
-              </w:rPr>
-              <w:t>Source:</w:t>
-            </w:r>
-            <w:r>
-              <w:rPr>
-                <w:rFonts w:ascii="Liberation Sans" w:hAnsi="Liberation Sans" w:eastAsia="Liberation Sans"/>
-                <w:b w:val="0"/>
-                <w:i w:val="0"/>
-                <w:color w:val="4A5568"/>
-                <w:sz w:val="15"/>
-              </w:rPr>
-              <w:t xml:space="preserve">Badan Pusat Statistik Kabupaten Mempawah — PODES 2025 / </w:t>
-            </w:r>
             <w:r>
               <w:rPr>
                 <w:rFonts w:ascii="Liberation Sans" w:hAnsi="Liberation Sans" w:eastAsia="Liberation Sans"/>
@@ -10419,7 +10658,7 @@
                 <w:color w:val="4A5568"/>
                 <w:sz w:val="15"/>
               </w:rPr>
-              <w:t>BPS-Statistics Mempawah Regency — PODES 2025</w:t>
+              <w:t>&amp; BPS-Statistics Mempawah Regency — PODES 2025</w:t>
             </w:r>
           </w:p>
         </w:tc>
@@ -10430,7 +10669,7 @@
         <w:autoSpaceDN w:val="0"/>
         <w:autoSpaceDE w:val="0"/>
         <w:widowControl/>
-        <w:spacing w:line="9858" w:lineRule="exact" w:before="0" w:after="0"/>
+        <w:spacing w:line="9648" w:lineRule="exact" w:before="0" w:after="0"/>
         <w:ind w:left="0" w:right="0"/>
       </w:pPr>
     </w:p>
@@ -10481,24 +10720,6 @@
         </w:tc>
       </w:tr>
     </w:tbl>
-    <w:p>
-      <w:pPr>
-        <w:autoSpaceDN w:val="0"/>
-        <w:autoSpaceDE w:val="0"/>
-        <w:widowControl/>
-        <w:spacing w:line="14" w:lineRule="exact" w:before="0" w:after="0"/>
-        <w:ind w:left="0" w:right="0"/>
-      </w:pPr>
-    </w:p>
-    <w:p>
-      <w:pPr>
-        <w:autoSpaceDN w:val="0"/>
-        <w:autoSpaceDE w:val="0"/>
-        <w:widowControl/>
-        <w:spacing w:line="14" w:lineRule="exact" w:before="0" w:after="0"/>
-        <w:ind w:left="0" w:right="0"/>
-      </w:pPr>
-    </w:p>
     <w:p>
       <w:pPr>
         <w:autoSpaceDN w:val="0"/>
@@ -11332,27 +11553,68 @@
         <w:autoSpaceDN w:val="0"/>
         <w:autoSpaceDE w:val="0"/>
         <w:widowControl/>
-        <w:spacing w:line="20" w:lineRule="exact" w:before="0" w:after="0"/>
-        <w:ind w:left="0" w:right="0"/>
+        <w:spacing w:line="230" w:lineRule="auto" w:before="38" w:after="14"/>
+        <w:ind w:left="0" w:right="0" w:firstLine="0"/>
+        <w:jc w:val="center"/>
       </w:pPr>
+      <w:r>
+        <w:rPr>
+          <w:rFonts w:ascii="Liberation Sans" w:hAnsi="Liberation Sans" w:eastAsia="Liberation Sans"/>
+          <w:b/>
+          <w:i w:val="0"/>
+          <w:color w:val="2D3748"/>
+          <w:sz w:val="15"/>
+        </w:rPr>
+        <w:t>Sumber/</w:t>
+      </w:r>
+      <w:r>
+        <w:rPr>
+          <w:rFonts w:ascii="Liberation Sans" w:hAnsi="Liberation Sans" w:eastAsia="Liberation Sans"/>
+          <w:b/>
+          <w:i/>
+          <w:color w:val="2D3748"/>
+          <w:sz w:val="15"/>
+        </w:rPr>
+        <w:t>Source:</w:t>
+      </w:r>
+      <w:r>
+        <w:rPr>
+          <w:rFonts w:ascii="Liberation Sans" w:hAnsi="Liberation Sans" w:eastAsia="Liberation Sans"/>
+          <w:b w:val="0"/>
+          <w:i w:val="0"/>
+          <w:color w:val="4A5568"/>
+          <w:sz w:val="15"/>
+        </w:rPr>
+        <w:t xml:space="preserve">Pemerintah Desa Pasir Palembang &amp; BPS Kabupaten Mempawah — PODES 2025 / </w:t>
+      </w:r>
+      <w:r>
+        <w:rPr>
+          <w:rFonts w:ascii="Liberation Sans" w:hAnsi="Liberation Sans" w:eastAsia="Liberation Sans"/>
+          <w:b w:val="0"/>
+          <w:i/>
+          <w:color w:val="4A5568"/>
+          <w:sz w:val="15"/>
+        </w:rPr>
+        <w:t>Government of Pasir Palembang Village</w:t>
+      </w:r>
     </w:p>
     <w:tbl>
       <w:tblPr>
         <w:tblW w:type="auto" w:w="0"/>
         <w:tblLayout w:type="fixed"/>
         <w:tblLook w:firstColumn="1" w:firstRow="1" w:lastColumn="0" w:lastRow="0" w:noHBand="0" w:noVBand="1" w:val="04A0"/>
-        <w:tblInd w:w="560.0" w:type="dxa"/>
+        <w:tblInd w:w="1200.0" w:type="dxa"/>
       </w:tblPr>
       <w:tblGrid>
         <w:gridCol w:w="9019"/>
       </w:tblGrid>
       <w:tr>
         <w:trPr>
-          <w:trHeight w:hRule="exact" w:val="264"/>
+          <w:trHeight w:hRule="exact" w:val="242"/>
         </w:trPr>
         <w:tc>
           <w:tcPr>
-            <w:tcW w:type="dxa" w:w="10480"/>
+            <w:tcW w:type="dxa" w:w="7780"/>
             <w:tcBorders/>
             <w:shd w:fill="f7fafb"/>
             <w:tcMar>
@@ -11365,40 +11627,10 @@
               <w:autoSpaceDN w:val="0"/>
               <w:autoSpaceDE w:val="0"/>
               <w:widowControl/>
-              <w:spacing w:line="230" w:lineRule="auto" w:before="38" w:after="0"/>
-              <w:ind w:left="576" w:right="0" w:firstLine="0"/>
+              <w:spacing w:line="233" w:lineRule="auto" w:before="14" w:after="0"/>
+              <w:ind w:left="1212" w:right="0" w:firstLine="0"/>
               <w:jc w:val="left"/>
             </w:pPr>
-            <w:r>
-              <w:rPr>
-                <w:rFonts w:ascii="Liberation Sans" w:hAnsi="Liberation Sans" w:eastAsia="Liberation Sans"/>
-                <w:b/>
-                <w:i w:val="0"/>
-                <w:color w:val="2D3748"/>
-                <w:sz w:val="15"/>
-              </w:rPr>
-              <w:t>Sumber/</w:t>
-            </w:r>
-            <w:r>
-              <w:rPr>
-                <w:rFonts w:ascii="Liberation Sans" w:hAnsi="Liberation Sans" w:eastAsia="Liberation Sans"/>
-                <w:b/>
-                <w:i/>
-                <w:color w:val="2D3748"/>
-                <w:sz w:val="15"/>
-              </w:rPr>
-              <w:t>Source:</w:t>
-            </w:r>
-            <w:r>
-              <w:rPr>
-                <w:rFonts w:ascii="Liberation Sans" w:hAnsi="Liberation Sans" w:eastAsia="Liberation Sans"/>
-                <w:b w:val="0"/>
-                <w:i w:val="0"/>
-                <w:color w:val="4A5568"/>
-                <w:sz w:val="15"/>
-              </w:rPr>
-              <w:t xml:space="preserve">Badan Pusat Statistik Kabupaten Mempawah — PODES 2025 / </w:t>
-            </w:r>
             <w:r>
               <w:rPr>
                 <w:rFonts w:ascii="Liberation Sans" w:hAnsi="Liberation Sans" w:eastAsia="Liberation Sans"/>
@@ -11407,7 +11639,7 @@
                 <w:color w:val="4A5568"/>
                 <w:sz w:val="15"/>
               </w:rPr>
-              <w:t>BPS-Statistics Mempawah Regency — PODES 2025</w:t>
+              <w:t>&amp; BPS-Statistics Mempawah Regency — PODES 2025</w:t>
             </w:r>
           </w:p>
         </w:tc>
@@ -11418,7 +11650,7 @@
         <w:autoSpaceDN w:val="0"/>
         <w:autoSpaceDE w:val="0"/>
         <w:widowControl/>
-        <w:spacing w:line="9934" w:lineRule="exact" w:before="0" w:after="0"/>
+        <w:spacing w:line="9738" w:lineRule="exact" w:before="0" w:after="0"/>
         <w:ind w:left="0" w:right="0"/>
       </w:pPr>
     </w:p>
@@ -11489,24 +11721,6 @@
     </w:p>
     <w:p>
       <w:pPr>
-        <w:autoSpaceDN w:val="0"/>
-        <w:autoSpaceDE w:val="0"/>
-        <w:widowControl/>
-        <w:spacing w:line="14" w:lineRule="exact" w:before="0" w:after="0"/>
-        <w:ind w:left="0" w:right="0"/>
-      </w:pPr>
-    </w:p>
-    <w:p>
-      <w:pPr>
-        <w:autoSpaceDN w:val="0"/>
-        <w:autoSpaceDE w:val="0"/>
-        <w:widowControl/>
-        <w:spacing w:line="14" w:lineRule="exact" w:before="0" w:after="0"/>
-        <w:ind w:left="0" w:right="0"/>
-      </w:pPr>
-    </w:p>
-    <w:p>
-      <w:pPr>
         <w:sectPr>
           <w:pgSz w:w="11899" w:h="16838"/>
           <w:pgMar w:top="0" w:right="0" w:bottom="0" w:left="0" w:header="720" w:footer="720" w:gutter="0"/>
@@ -11520,7 +11734,7 @@
         <w:autoSpaceDN w:val="0"/>
         <w:autoSpaceDE w:val="0"/>
         <w:widowControl/>
-        <w:spacing w:line="220" w:lineRule="exact" w:before="0" w:after="214"/>
+        <w:spacing w:line="220" w:lineRule="exact" w:before="0" w:after="6030"/>
         <w:ind w:left="0" w:right="0"/>
       </w:pPr>
       <w:r>
@@ -11531,9 +11745,9 @@
               <wp:posOffset>1244600</wp:posOffset>
             </wp:positionH>
             <wp:positionV relativeFrom="page">
-              <wp:posOffset>4965700</wp:posOffset>
+              <wp:posOffset>4559300</wp:posOffset>
             </wp:positionV>
-            <wp:extent cx="6311900" cy="2654300"/>
+            <wp:extent cx="6311900" cy="2692400"/>
             <wp:wrapNone/>
             <wp:docPr id="3" name="Picture 3"/>
             <wp:cNvGraphicFramePr>
@@ -11555,7 +11769,7 @@
                   <pic:spPr>
                     <a:xfrm>
                       <a:off x="0" y="0"/>
-                      <a:ext cx="6311900" cy="2654300"/>
+                      <a:ext cx="6311900" cy="2692400"/>
                     </a:xfrm>
                     <a:prstGeom prst="rect"/>
                   </pic:spPr>
@@ -11566,57 +11780,24 @@
         </w:drawing>
       </w:r>
     </w:p>
-    <w:p>
-      <w:pPr>
-        <w:autoSpaceDN w:val="0"/>
-        <w:autoSpaceDE w:val="0"/>
-        <w:widowControl/>
-        <w:spacing w:line="254" w:lineRule="auto" w:before="0" w:after="6994"/>
-        <w:ind w:left="6674" w:right="720" w:firstLine="520"/>
-        <w:jc w:val="left"/>
-      </w:pPr>
-      <w:r>
-        <w:rPr>
-          <w:rFonts w:ascii="Liberation Sans" w:hAnsi="Liberation Sans" w:eastAsia="Liberation Sans"/>
-          <w:b/>
-          <w:i w:val="0"/>
-          <w:color w:val="EB8A3C"/>
-          <w:sz w:val="17"/>
-        </w:rPr>
-        <w:t xml:space="preserve">BAB III FASILITAS SOSIAL </w:t>
-      </w:r>
-      <w:r>
-        <w:br/>
-      </w:r>
-      <w:r>
-        <w:rPr>
-          <w:rFonts w:ascii="Liberation Sans" w:hAnsi="Liberation Sans" w:eastAsia="Liberation Sans"/>
-          <w:b/>
-          <w:i/>
-          <w:color w:val="EB8A3C"/>
-          <w:sz w:val="17"/>
-        </w:rPr>
-        <w:t>CHAPTER III SOCIAL FACILITIES</w:t>
-      </w:r>
-    </w:p>
     <w:tbl>
       <w:tblPr>
         <w:tblW w:type="auto" w:w="0"/>
         <w:tblLayout w:type="fixed"/>
         <w:tblLook w:firstColumn="1" w:firstRow="1" w:lastColumn="0" w:lastRow="0" w:noHBand="0" w:noVBand="1" w:val="04A0"/>
-        <w:tblInd w:w="840.0" w:type="dxa"/>
+        <w:tblInd w:w="800.0" w:type="dxa"/>
       </w:tblPr>
       <w:tblGrid>
-        <w:gridCol w:w="5085"/>
-        <w:gridCol w:w="5085"/>
+        <w:gridCol w:w="5070"/>
+        <w:gridCol w:w="5070"/>
       </w:tblGrid>
       <w:tr>
         <w:trPr>
-          <w:trHeight w:hRule="exact" w:val="1062"/>
+          <w:trHeight w:hRule="exact" w:val="1376"/>
         </w:trPr>
         <w:tc>
           <w:tcPr>
-            <w:tcW w:type="dxa" w:w="1680"/>
+            <w:tcW w:type="dxa" w:w="1760"/>
             <w:tcBorders/>
             <w:tcMar>
               <w:start w:w="0" w:type="dxa"/>
@@ -11628,8 +11809,8 @@
               <w:autoSpaceDN w:val="0"/>
               <w:autoSpaceDE w:val="0"/>
               <w:widowControl/>
-              <w:spacing w:line="245" w:lineRule="auto" w:before="72" w:after="0"/>
-              <w:ind w:left="720" w:right="288" w:firstLine="0"/>
+              <w:spacing w:line="245" w:lineRule="auto" w:before="20" w:after="0"/>
+              <w:ind w:left="864" w:right="432" w:firstLine="0"/>
               <w:jc w:val="center"/>
             </w:pPr>
             <w:r>
@@ -11638,7 +11819,7 @@
                 <w:b/>
                 <w:i w:val="0"/>
                 <w:color w:val="FFFFFF"/>
-                <w:sz w:val="72"/>
+                <w:sz w:val="68"/>
               </w:rPr>
               <w:t xml:space="preserve">3 </w:t>
             </w:r>
@@ -11650,16 +11831,36 @@
                 <w:rFonts w:ascii="Liberation Sans" w:hAnsi="Liberation Sans" w:eastAsia="Liberation Sans"/>
                 <w:b/>
                 <w:i w:val="0"/>
-                <w:color w:val="FFFFFF"/>
-                <w:sz w:val="20"/>
+                <w:color w:val="EB8A3C"/>
+                <w:sz w:val="19"/>
               </w:rPr>
               <w:t>BAB</w:t>
+            </w:r>
+          </w:p>
+          <w:p>
+            <w:pPr>
+              <w:autoSpaceDN w:val="0"/>
+              <w:autoSpaceDE w:val="0"/>
+              <w:widowControl/>
+              <w:spacing w:line="233" w:lineRule="auto" w:before="34" w:after="0"/>
+              <w:ind w:left="0" w:right="360" w:firstLine="0"/>
+              <w:jc w:val="right"/>
+            </w:pPr>
+            <w:r>
+              <w:rPr>
+                <w:rFonts w:ascii="Liberation Sans" w:hAnsi="Liberation Sans" w:eastAsia="Liberation Sans"/>
+                <w:b/>
+                <w:i/>
+                <w:color w:val="FEF08A"/>
+                <w:sz w:val="15"/>
+              </w:rPr>
+              <w:t>Chapter</w:t>
             </w:r>
           </w:p>
         </w:tc>
         <w:tc>
           <w:tcPr>
-            <w:tcW w:type="dxa" w:w="6820"/>
+            <w:tcW w:type="dxa" w:w="6780"/>
             <w:tcBorders/>
             <w:tcMar>
               <w:start w:w="0" w:type="dxa"/>
@@ -11671,8 +11872,8 @@
               <w:autoSpaceDN w:val="0"/>
               <w:autoSpaceDE w:val="0"/>
               <w:widowControl/>
-              <w:spacing w:line="245" w:lineRule="auto" w:before="60" w:after="0"/>
-              <w:ind w:left="410" w:right="720" w:firstLine="0"/>
+              <w:spacing w:line="245" w:lineRule="auto" w:before="0" w:after="0"/>
+              <w:ind w:left="370" w:right="720" w:firstLine="0"/>
               <w:jc w:val="left"/>
             </w:pPr>
             <w:r>
@@ -11696,78 +11897,12 @@
               <w:t>KESEHATAN)</w:t>
             </w:r>
           </w:p>
-        </w:tc>
-      </w:tr>
-    </w:tbl>
-    <w:p>
-      <w:pPr>
-        <w:autoSpaceDN w:val="0"/>
-        <w:autoSpaceDE w:val="0"/>
-        <w:widowControl/>
-        <w:spacing w:line="20" w:lineRule="exact" w:before="0" w:after="0"/>
-        <w:ind w:left="0" w:right="0"/>
-      </w:pPr>
-    </w:p>
-    <w:tbl>
-      <w:tblPr>
-        <w:tblW w:type="auto" w:w="0"/>
-        <w:tblLayout w:type="fixed"/>
-        <w:tblLook w:firstColumn="1" w:firstRow="1" w:lastColumn="0" w:lastRow="0" w:noHBand="0" w:noVBand="1" w:val="04A0"/>
-        <w:tblInd w:w="800.0" w:type="dxa"/>
-      </w:tblPr>
-      <w:tblGrid>
-        <w:gridCol w:w="5085"/>
-        <w:gridCol w:w="5085"/>
-      </w:tblGrid>
-      <w:tr>
-        <w:trPr>
-          <w:trHeight w:hRule="exact" w:val="436"/>
-        </w:trPr>
-        <w:tc>
-          <w:tcPr>
-            <w:tcW w:type="dxa" w:w="1760"/>
-            <w:tcBorders/>
-            <w:tcMar>
-              <w:start w:w="0" w:type="dxa"/>
-              <w:end w:w="0" w:type="dxa"/>
-            </w:tcMar>
-          </w:tcPr>
           <w:p>
             <w:pPr>
               <w:autoSpaceDN w:val="0"/>
               <w:autoSpaceDE w:val="0"/>
               <w:widowControl/>
-              <w:spacing w:line="233" w:lineRule="auto" w:before="60" w:after="0"/>
-              <w:ind w:left="0" w:right="340" w:firstLine="0"/>
-              <w:jc w:val="right"/>
-            </w:pPr>
-            <w:r>
-              <w:rPr>
-                <w:rFonts w:ascii="Liberation Sans" w:hAnsi="Liberation Sans" w:eastAsia="Liberation Sans"/>
-                <w:b/>
-                <w:i/>
-                <w:color w:val="FFFFFF"/>
-                <w:sz w:val="16"/>
-              </w:rPr>
-              <w:t>Chapter</w:t>
-            </w:r>
-          </w:p>
-        </w:tc>
-        <w:tc>
-          <w:tcPr>
-            <w:tcW w:type="dxa" w:w="6700"/>
-            <w:tcBorders/>
-            <w:tcMar>
-              <w:start w:w="0" w:type="dxa"/>
-              <w:end w:w="0" w:type="dxa"/>
-            </w:tcMar>
-          </w:tcPr>
-          <w:p>
-            <w:pPr>
-              <w:autoSpaceDN w:val="0"/>
-              <w:autoSpaceDE w:val="0"/>
-              <w:widowControl/>
-              <w:spacing w:line="233" w:lineRule="auto" w:before="108" w:after="0"/>
+              <w:spacing w:line="233" w:lineRule="auto" w:before="316" w:after="0"/>
               <w:ind w:left="370" w:right="0" w:firstLine="0"/>
               <w:jc w:val="left"/>
             </w:pPr>
@@ -11776,7 +11911,7 @@
                 <w:rFonts w:ascii="Liberation Sans" w:hAnsi="Liberation Sans" w:eastAsia="Liberation Sans"/>
                 <w:b/>
                 <w:i/>
-                <w:color w:val="FFFFFF"/>
+                <w:color w:val="FEF08A"/>
                 <w:sz w:val="24"/>
               </w:rPr>
               <w:t>SOCIAL FACILITIES (EDUCATION &amp; HEALTH)</w:t>
@@ -11790,8 +11925,8 @@
         <w:autoSpaceDN w:val="0"/>
         <w:autoSpaceDE w:val="0"/>
         <w:widowControl/>
-        <w:spacing w:line="233" w:lineRule="auto" w:before="1038" w:after="0"/>
-        <w:ind w:left="1144" w:right="0" w:firstLine="0"/>
+        <w:spacing w:line="233" w:lineRule="auto" w:before="1082" w:after="0"/>
+        <w:ind w:left="1174" w:right="0" w:firstLine="0"/>
         <w:jc w:val="left"/>
       </w:pPr>
       <w:r>
@@ -11820,8 +11955,8 @@
         <w:autoSpaceDN w:val="0"/>
         <w:autoSpaceDE w:val="0"/>
         <w:widowControl/>
-        <w:spacing w:line="233" w:lineRule="auto" w:before="72" w:after="0"/>
-        <w:ind w:left="1144" w:right="0" w:firstLine="0"/>
+        <w:spacing w:line="233" w:lineRule="auto" w:before="74" w:after="0"/>
+        <w:ind w:left="1174" w:right="0" w:firstLine="0"/>
         <w:jc w:val="left"/>
       </w:pPr>
       <w:r>
@@ -11860,8 +11995,8 @@
         <w:autoSpaceDN w:val="0"/>
         <w:autoSpaceDE w:val="0"/>
         <w:widowControl/>
-        <w:spacing w:line="233" w:lineRule="auto" w:before="5020" w:after="0"/>
-        <w:ind w:left="0" w:right="498" w:firstLine="0"/>
+        <w:spacing w:line="233" w:lineRule="auto" w:before="5634" w:after="0"/>
+        <w:ind w:left="0" w:right="468" w:firstLine="0"/>
         <w:jc w:val="right"/>
       </w:pPr>
       <w:r>
@@ -11879,7 +12014,7 @@
       <w:pPr>
         <w:sectPr>
           <w:pgSz w:w="11899" w:h="16838"/>
-          <w:pgMar w:top="432" w:right="288" w:bottom="162" w:left="1440" w:header="720" w:footer="720" w:gutter="0"/>
+          <w:pgMar w:top="1440" w:right="318" w:bottom="162" w:left="1440" w:header="720" w:footer="720" w:gutter="0"/>
           <w:cols/>
           <w:docGrid w:linePitch="360"/>
         </w:sectPr>
@@ -12463,9 +12598,50 @@
         <w:autoSpaceDN w:val="0"/>
         <w:autoSpaceDE w:val="0"/>
         <w:widowControl/>
-        <w:spacing w:line="20" w:lineRule="exact" w:before="0" w:after="0"/>
-        <w:ind w:left="0" w:right="0"/>
+        <w:spacing w:line="230" w:lineRule="auto" w:before="36" w:after="14"/>
+        <w:ind w:left="0" w:right="0" w:firstLine="0"/>
+        <w:jc w:val="center"/>
       </w:pPr>
+      <w:r>
+        <w:rPr>
+          <w:rFonts w:ascii="Liberation Sans" w:hAnsi="Liberation Sans" w:eastAsia="Liberation Sans"/>
+          <w:b/>
+          <w:i w:val="0"/>
+          <w:color w:val="2D3748"/>
+          <w:sz w:val="15"/>
+        </w:rPr>
+        <w:t>Sumber/</w:t>
+      </w:r>
+      <w:r>
+        <w:rPr>
+          <w:rFonts w:ascii="Liberation Sans" w:hAnsi="Liberation Sans" w:eastAsia="Liberation Sans"/>
+          <w:b/>
+          <w:i/>
+          <w:color w:val="2D3748"/>
+          <w:sz w:val="15"/>
+        </w:rPr>
+        <w:t>Source:</w:t>
+      </w:r>
+      <w:r>
+        <w:rPr>
+          <w:rFonts w:ascii="Liberation Sans" w:hAnsi="Liberation Sans" w:eastAsia="Liberation Sans"/>
+          <w:b w:val="0"/>
+          <w:i w:val="0"/>
+          <w:color w:val="4A5568"/>
+          <w:sz w:val="15"/>
+        </w:rPr>
+        <w:t xml:space="preserve">Pemerintah Desa Pasir Palembang &amp; BPS Kabupaten Mempawah — PODES 2025 / </w:t>
+      </w:r>
+      <w:r>
+        <w:rPr>
+          <w:rFonts w:ascii="Liberation Sans" w:hAnsi="Liberation Sans" w:eastAsia="Liberation Sans"/>
+          <w:b w:val="0"/>
+          <w:i/>
+          <w:color w:val="4A5568"/>
+          <w:sz w:val="15"/>
+        </w:rPr>
+        <w:t>Government of Pasir Palembang Village</w:t>
+      </w:r>
     </w:p>
     <w:tbl>
       <w:tblPr>
@@ -12479,7 +12655,7 @@
       </w:tblGrid>
       <w:tr>
         <w:trPr>
-          <w:trHeight w:hRule="exact" w:val="262"/>
+          <w:trHeight w:hRule="exact" w:val="242"/>
         </w:trPr>
         <w:tc>
           <w:tcPr>
@@ -12496,40 +12672,10 @@
               <w:autoSpaceDN w:val="0"/>
               <w:autoSpaceDE w:val="0"/>
               <w:widowControl/>
-              <w:spacing w:line="230" w:lineRule="auto" w:before="36" w:after="0"/>
-              <w:ind w:left="1136" w:right="0" w:firstLine="0"/>
+              <w:spacing w:line="233" w:lineRule="auto" w:before="14" w:after="0"/>
+              <w:ind w:left="2412" w:right="0" w:firstLine="0"/>
               <w:jc w:val="left"/>
             </w:pPr>
-            <w:r>
-              <w:rPr>
-                <w:rFonts w:ascii="Liberation Sans" w:hAnsi="Liberation Sans" w:eastAsia="Liberation Sans"/>
-                <w:b/>
-                <w:i w:val="0"/>
-                <w:color w:val="2D3748"/>
-                <w:sz w:val="15"/>
-              </w:rPr>
-              <w:t>Sumber/</w:t>
-            </w:r>
-            <w:r>
-              <w:rPr>
-                <w:rFonts w:ascii="Liberation Sans" w:hAnsi="Liberation Sans" w:eastAsia="Liberation Sans"/>
-                <w:b/>
-                <w:i/>
-                <w:color w:val="2D3748"/>
-                <w:sz w:val="15"/>
-              </w:rPr>
-              <w:t>Source:</w:t>
-            </w:r>
-            <w:r>
-              <w:rPr>
-                <w:rFonts w:ascii="Liberation Sans" w:hAnsi="Liberation Sans" w:eastAsia="Liberation Sans"/>
-                <w:b w:val="0"/>
-                <w:i w:val="0"/>
-                <w:color w:val="4A5568"/>
-                <w:sz w:val="15"/>
-              </w:rPr>
-              <w:t xml:space="preserve">Badan Pusat Statistik Kabupaten Mempawah — PODES 2025 / </w:t>
-            </w:r>
             <w:r>
               <w:rPr>
                 <w:rFonts w:ascii="Liberation Sans" w:hAnsi="Liberation Sans" w:eastAsia="Liberation Sans"/>
@@ -12538,7 +12684,7 @@
                 <w:color w:val="4A5568"/>
                 <w:sz w:val="15"/>
               </w:rPr>
-              <w:t>BPS-Statistics Mempawah Regency — PODES 2025</w:t>
+              <w:t>&amp; BPS-Statistics Mempawah Regency — PODES 2025</w:t>
             </w:r>
           </w:p>
         </w:tc>
@@ -12549,7 +12695,7 @@
         <w:autoSpaceDN w:val="0"/>
         <w:autoSpaceDE w:val="0"/>
         <w:widowControl/>
-        <w:spacing w:line="11734" w:lineRule="exact" w:before="0" w:after="0"/>
+        <w:spacing w:line="11538" w:lineRule="exact" w:before="0" w:after="0"/>
         <w:ind w:left="0" w:right="0"/>
       </w:pPr>
     </w:p>
@@ -12600,24 +12746,6 @@
         </w:tc>
       </w:tr>
     </w:tbl>
-    <w:p>
-      <w:pPr>
-        <w:autoSpaceDN w:val="0"/>
-        <w:autoSpaceDE w:val="0"/>
-        <w:widowControl/>
-        <w:spacing w:line="14" w:lineRule="exact" w:before="0" w:after="0"/>
-        <w:ind w:left="0" w:right="0"/>
-      </w:pPr>
-    </w:p>
-    <w:p>
-      <w:pPr>
-        <w:autoSpaceDN w:val="0"/>
-        <w:autoSpaceDE w:val="0"/>
-        <w:widowControl/>
-        <w:spacing w:line="14" w:lineRule="exact" w:before="0" w:after="0"/>
-        <w:ind w:left="0" w:right="0"/>
-      </w:pPr>
-    </w:p>
     <w:p>
       <w:pPr>
         <w:autoSpaceDN w:val="0"/>
@@ -13407,27 +13535,68 @@
         <w:autoSpaceDN w:val="0"/>
         <w:autoSpaceDE w:val="0"/>
         <w:widowControl/>
-        <w:spacing w:line="20" w:lineRule="exact" w:before="0" w:after="0"/>
-        <w:ind w:left="0" w:right="0"/>
+        <w:spacing w:line="230" w:lineRule="auto" w:before="28" w:after="22"/>
+        <w:ind w:left="0" w:right="0" w:firstLine="0"/>
+        <w:jc w:val="center"/>
       </w:pPr>
+      <w:r>
+        <w:rPr>
+          <w:rFonts w:ascii="Liberation Sans" w:hAnsi="Liberation Sans" w:eastAsia="Liberation Sans"/>
+          <w:b/>
+          <w:i w:val="0"/>
+          <w:color w:val="2D3748"/>
+          <w:sz w:val="15"/>
+        </w:rPr>
+        <w:t>Sumber/</w:t>
+      </w:r>
+      <w:r>
+        <w:rPr>
+          <w:rFonts w:ascii="Liberation Sans" w:hAnsi="Liberation Sans" w:eastAsia="Liberation Sans"/>
+          <w:b/>
+          <w:i/>
+          <w:color w:val="2D3748"/>
+          <w:sz w:val="15"/>
+        </w:rPr>
+        <w:t>Source:</w:t>
+      </w:r>
+      <w:r>
+        <w:rPr>
+          <w:rFonts w:ascii="Liberation Sans" w:hAnsi="Liberation Sans" w:eastAsia="Liberation Sans"/>
+          <w:b w:val="0"/>
+          <w:i w:val="0"/>
+          <w:color w:val="4A5568"/>
+          <w:sz w:val="15"/>
+        </w:rPr>
+        <w:t xml:space="preserve">Pemerintah Desa Pasir Palembang &amp; BPS Kabupaten Mempawah — PODES 2025 / </w:t>
+      </w:r>
+      <w:r>
+        <w:rPr>
+          <w:rFonts w:ascii="Liberation Sans" w:hAnsi="Liberation Sans" w:eastAsia="Liberation Sans"/>
+          <w:b w:val="0"/>
+          <w:i/>
+          <w:color w:val="4A5568"/>
+          <w:sz w:val="15"/>
+        </w:rPr>
+        <w:t>Government of Pasir Palembang Village</w:t>
+      </w:r>
     </w:p>
     <w:tbl>
       <w:tblPr>
         <w:tblW w:type="auto" w:w="0"/>
         <w:tblLayout w:type="fixed"/>
         <w:tblLook w:firstColumn="1" w:firstRow="1" w:lastColumn="0" w:lastRow="0" w:noHBand="0" w:noVBand="1" w:val="04A0"/>
-        <w:tblInd w:w="560.0" w:type="dxa"/>
+        <w:tblInd w:w="1200.0" w:type="dxa"/>
       </w:tblPr>
       <w:tblGrid>
         <w:gridCol w:w="9019"/>
       </w:tblGrid>
       <w:tr>
         <w:trPr>
-          <w:trHeight w:hRule="exact" w:val="254"/>
+          <w:trHeight w:hRule="exact" w:val="248"/>
         </w:trPr>
         <w:tc>
           <w:tcPr>
-            <w:tcW w:type="dxa" w:w="10480"/>
+            <w:tcW w:type="dxa" w:w="7780"/>
             <w:tcBorders/>
             <w:shd w:fill="f7fafb"/>
             <w:tcMar>
@@ -13440,40 +13609,10 @@
               <w:autoSpaceDN w:val="0"/>
               <w:autoSpaceDE w:val="0"/>
               <w:widowControl/>
-              <w:spacing w:line="230" w:lineRule="auto" w:before="28" w:after="0"/>
-              <w:ind w:left="576" w:right="0" w:firstLine="0"/>
+              <w:spacing w:line="230" w:lineRule="auto" w:before="22" w:after="0"/>
+              <w:ind w:left="1212" w:right="0" w:firstLine="0"/>
               <w:jc w:val="left"/>
             </w:pPr>
-            <w:r>
-              <w:rPr>
-                <w:rFonts w:ascii="Liberation Sans" w:hAnsi="Liberation Sans" w:eastAsia="Liberation Sans"/>
-                <w:b/>
-                <w:i w:val="0"/>
-                <w:color w:val="2D3748"/>
-                <w:sz w:val="15"/>
-              </w:rPr>
-              <w:t>Sumber/</w:t>
-            </w:r>
-            <w:r>
-              <w:rPr>
-                <w:rFonts w:ascii="Liberation Sans" w:hAnsi="Liberation Sans" w:eastAsia="Liberation Sans"/>
-                <w:b/>
-                <w:i/>
-                <w:color w:val="2D3748"/>
-                <w:sz w:val="15"/>
-              </w:rPr>
-              <w:t>Source:</w:t>
-            </w:r>
-            <w:r>
-              <w:rPr>
-                <w:rFonts w:ascii="Liberation Sans" w:hAnsi="Liberation Sans" w:eastAsia="Liberation Sans"/>
-                <w:b w:val="0"/>
-                <w:i w:val="0"/>
-                <w:color w:val="4A5568"/>
-                <w:sz w:val="15"/>
-              </w:rPr>
-              <w:t xml:space="preserve">Badan Pusat Statistik Kabupaten Mempawah — PODES 2025 / </w:t>
-            </w:r>
             <w:r>
               <w:rPr>
                 <w:rFonts w:ascii="Liberation Sans" w:hAnsi="Liberation Sans" w:eastAsia="Liberation Sans"/>
@@ -13482,7 +13621,7 @@
                 <w:color w:val="4A5568"/>
                 <w:sz w:val="15"/>
               </w:rPr>
-              <w:t>BPS-Statistics Mempawah Regency — PODES 2025</w:t>
+              <w:t>&amp; BPS-Statistics Mempawah Regency — PODES 2025</w:t>
             </w:r>
           </w:p>
         </w:tc>
@@ -13493,7 +13632,7 @@
         <w:autoSpaceDN w:val="0"/>
         <w:autoSpaceDE w:val="0"/>
         <w:widowControl/>
-        <w:spacing w:line="10684" w:lineRule="exact" w:before="0" w:after="0"/>
+        <w:spacing w:line="10474" w:lineRule="exact" w:before="0" w:after="0"/>
         <w:ind w:left="0" w:right="0"/>
       </w:pPr>
     </w:p>
@@ -13564,24 +13703,6 @@
     </w:p>
     <w:p>
       <w:pPr>
-        <w:autoSpaceDN w:val="0"/>
-        <w:autoSpaceDE w:val="0"/>
-        <w:widowControl/>
-        <w:spacing w:line="14" w:lineRule="exact" w:before="0" w:after="0"/>
-        <w:ind w:left="0" w:right="0"/>
-      </w:pPr>
-    </w:p>
-    <w:p>
-      <w:pPr>
-        <w:autoSpaceDN w:val="0"/>
-        <w:autoSpaceDE w:val="0"/>
-        <w:widowControl/>
-        <w:spacing w:line="14" w:lineRule="exact" w:before="0" w:after="0"/>
-        <w:ind w:left="0" w:right="0"/>
-      </w:pPr>
-    </w:p>
-    <w:p>
-      <w:pPr>
         <w:sectPr>
           <w:pgSz w:w="11899" w:h="16838"/>
           <w:pgMar w:top="0" w:right="0" w:bottom="0" w:left="0" w:header="720" w:footer="720" w:gutter="0"/>
@@ -13595,7 +13716,7 @@
         <w:autoSpaceDN w:val="0"/>
         <w:autoSpaceDE w:val="0"/>
         <w:widowControl/>
-        <w:spacing w:line="220" w:lineRule="exact" w:before="0" w:after="214"/>
+        <w:spacing w:line="220" w:lineRule="exact" w:before="0" w:after="6050"/>
         <w:ind w:left="0" w:right="0"/>
       </w:pPr>
       <w:r>
@@ -13606,9 +13727,9 @@
               <wp:posOffset>1244600</wp:posOffset>
             </wp:positionH>
             <wp:positionV relativeFrom="page">
-              <wp:posOffset>4978400</wp:posOffset>
+              <wp:posOffset>4572000</wp:posOffset>
             </wp:positionV>
-            <wp:extent cx="6311900" cy="2628900"/>
+            <wp:extent cx="6311900" cy="2667000"/>
             <wp:wrapNone/>
             <wp:docPr id="4" name="Picture 4"/>
             <wp:cNvGraphicFramePr>
@@ -13630,7 +13751,7 @@
                   <pic:spPr>
                     <a:xfrm>
                       <a:off x="0" y="0"/>
-                      <a:ext cx="6311900" cy="2628900"/>
+                      <a:ext cx="6311900" cy="2667000"/>
                     </a:xfrm>
                     <a:prstGeom prst="rect"/>
                   </pic:spPr>
@@ -13641,39 +13762,6 @@
         </w:drawing>
       </w:r>
     </w:p>
-    <w:p>
-      <w:pPr>
-        <w:autoSpaceDN w:val="0"/>
-        <w:autoSpaceDE w:val="0"/>
-        <w:widowControl/>
-        <w:spacing w:line="254" w:lineRule="auto" w:before="0" w:after="7006"/>
-        <w:ind w:left="340" w:right="6192" w:firstLine="0"/>
-        <w:jc w:val="left"/>
-      </w:pPr>
-      <w:r>
-        <w:rPr>
-          <w:rFonts w:ascii="Liberation Sans" w:hAnsi="Liberation Sans" w:eastAsia="Liberation Sans"/>
-          <w:b/>
-          <w:i w:val="0"/>
-          <w:color w:val="EB8A3C"/>
-          <w:sz w:val="17"/>
-        </w:rPr>
-        <w:t xml:space="preserve">POTENSI DESA PASIR PALEMBANG 2026 </w:t>
-      </w:r>
-      <w:r>
-        <w:br/>
-      </w:r>
-      <w:r>
-        <w:rPr>
-          <w:rFonts w:ascii="Liberation Sans" w:hAnsi="Liberation Sans" w:eastAsia="Liberation Sans"/>
-          <w:b/>
-          <w:i/>
-          <w:color w:val="EB8A3C"/>
-          <w:sz w:val="17"/>
-        </w:rPr>
-        <w:t>POTENTIALS OF PASIR PALEMBANG VILLAGE 2026</w:t>
-      </w:r>
-    </w:p>
     <w:tbl>
       <w:tblPr>
         <w:tblW w:type="auto" w:w="0"/>
@@ -13682,12 +13770,12 @@
         <w:tblInd w:w="1124.0" w:type="dxa"/>
       </w:tblPr>
       <w:tblGrid>
-        <w:gridCol w:w="5407"/>
-        <w:gridCol w:w="5407"/>
+        <w:gridCol w:w="5392"/>
+        <w:gridCol w:w="5392"/>
       </w:tblGrid>
       <w:tr>
         <w:trPr>
-          <w:trHeight w:hRule="exact" w:val="1300"/>
+          <w:trHeight w:hRule="exact" w:val="1202"/>
         </w:trPr>
         <w:tc>
           <w:tcPr>
@@ -13703,8 +13791,8 @@
               <w:autoSpaceDN w:val="0"/>
               <w:autoSpaceDE w:val="0"/>
               <w:widowControl/>
-              <w:spacing w:line="245" w:lineRule="auto" w:before="60" w:after="0"/>
-              <w:ind w:left="1152" w:right="288" w:firstLine="0"/>
+              <w:spacing w:line="245" w:lineRule="auto" w:before="0" w:after="0"/>
+              <w:ind w:left="1152" w:right="432" w:firstLine="0"/>
               <w:jc w:val="center"/>
             </w:pPr>
             <w:r>
@@ -13713,7 +13801,7 @@
                 <w:b/>
                 <w:i w:val="0"/>
                 <w:color w:val="FFFFFF"/>
-                <w:sz w:val="72"/>
+                <w:sz w:val="68"/>
               </w:rPr>
               <w:t xml:space="preserve">4 </w:t>
             </w:r>
@@ -13725,8 +13813,8 @@
                 <w:rFonts w:ascii="Liberation Sans" w:hAnsi="Liberation Sans" w:eastAsia="Liberation Sans"/>
                 <w:b/>
                 <w:i w:val="0"/>
-                <w:color w:val="FFFFFF"/>
-                <w:sz w:val="20"/>
+                <w:color w:val="EB8A3C"/>
+                <w:sz w:val="19"/>
               </w:rPr>
               <w:t>BAB</w:t>
             </w:r>
@@ -13736,8 +13824,8 @@
               <w:autoSpaceDN w:val="0"/>
               <w:autoSpaceDE w:val="0"/>
               <w:widowControl/>
-              <w:spacing w:line="233" w:lineRule="auto" w:before="22" w:after="0"/>
-              <w:ind w:left="0" w:right="340" w:firstLine="0"/>
+              <w:spacing w:line="233" w:lineRule="auto" w:before="34" w:after="0"/>
+              <w:ind w:left="0" w:right="360" w:firstLine="0"/>
               <w:jc w:val="right"/>
             </w:pPr>
             <w:r>
@@ -13745,8 +13833,8 @@
                 <w:rFonts w:ascii="Liberation Sans" w:hAnsi="Liberation Sans" w:eastAsia="Liberation Sans"/>
                 <w:b/>
                 <w:i/>
-                <w:color w:val="FFFFFF"/>
-                <w:sz w:val="16"/>
+                <w:color w:val="FEF08A"/>
+                <w:sz w:val="15"/>
               </w:rPr>
               <w:t>Chapter</w:t>
             </w:r>
@@ -13754,7 +13842,7 @@
         </w:tc>
         <w:tc>
           <w:tcPr>
-            <w:tcW w:type="dxa" w:w="7440"/>
+            <w:tcW w:type="dxa" w:w="7420"/>
             <w:tcBorders/>
             <w:tcMar>
               <w:start w:w="0" w:type="dxa"/>
@@ -13766,8 +13854,8 @@
               <w:autoSpaceDN w:val="0"/>
               <w:autoSpaceDE w:val="0"/>
               <w:widowControl/>
-              <w:spacing w:line="350" w:lineRule="auto" w:before="242" w:after="0"/>
-              <w:ind w:left="370" w:right="144" w:firstLine="0"/>
+              <w:spacing w:line="355" w:lineRule="auto" w:before="160" w:after="0"/>
+              <w:ind w:left="370" w:right="0" w:firstLine="0"/>
               <w:jc w:val="left"/>
             </w:pPr>
             <w:r>
@@ -13785,7 +13873,7 @@
                 <w:rFonts w:ascii="Liberation Sans" w:hAnsi="Liberation Sans" w:eastAsia="Liberation Sans"/>
                 <w:b/>
                 <w:i/>
-                <w:color w:val="FFFFFF"/>
+                <w:color w:val="FEF08A"/>
                 <w:sz w:val="24"/>
               </w:rPr>
               <w:t>TRANSPORTATION, COMMUNICATION &amp; ECONOMY</w:t>
@@ -13799,8 +13887,8 @@
         <w:autoSpaceDN w:val="0"/>
         <w:autoSpaceDE w:val="0"/>
         <w:widowControl/>
-        <w:spacing w:line="233" w:lineRule="auto" w:before="1146" w:after="0"/>
-        <w:ind w:left="1788" w:right="0" w:firstLine="0"/>
+        <w:spacing w:line="233" w:lineRule="auto" w:before="1206" w:after="0"/>
+        <w:ind w:left="1818" w:right="0" w:firstLine="0"/>
         <w:jc w:val="left"/>
       </w:pPr>
       <w:r>
@@ -13859,8 +13947,8 @@
         <w:autoSpaceDN w:val="0"/>
         <w:autoSpaceDE w:val="0"/>
         <w:widowControl/>
-        <w:spacing w:line="233" w:lineRule="auto" w:before="72" w:after="0"/>
-        <w:ind w:left="1788" w:right="0" w:firstLine="0"/>
+        <w:spacing w:line="233" w:lineRule="auto" w:before="74" w:after="0"/>
+        <w:ind w:left="1818" w:right="0" w:firstLine="0"/>
         <w:jc w:val="left"/>
       </w:pPr>
       <w:r>
@@ -13899,7 +13987,7 @@
         <w:autoSpaceDN w:val="0"/>
         <w:autoSpaceDE w:val="0"/>
         <w:widowControl/>
-        <w:spacing w:line="233" w:lineRule="auto" w:before="5050" w:after="0"/>
+        <w:spacing w:line="233" w:lineRule="auto" w:before="5664" w:after="0"/>
         <w:ind w:left="0" w:right="0" w:firstLine="0"/>
         <w:jc w:val="left"/>
       </w:pPr>
@@ -13918,7 +14006,7 @@
       <w:pPr>
         <w:sectPr>
           <w:pgSz w:w="11899" w:h="16838"/>
-          <w:pgMar w:top="432" w:right="288" w:bottom="162" w:left="796" w:header="720" w:footer="720" w:gutter="0"/>
+          <w:pgMar w:top="1440" w:right="318" w:bottom="162" w:left="796" w:header="720" w:footer="720" w:gutter="0"/>
           <w:cols/>
           <w:docGrid w:linePitch="360"/>
         </w:sectPr>
@@ -14820,27 +14908,68 @@
         <w:autoSpaceDN w:val="0"/>
         <w:autoSpaceDE w:val="0"/>
         <w:widowControl/>
-        <w:spacing w:line="20" w:lineRule="exact" w:before="0" w:after="0"/>
-        <w:ind w:left="0" w:right="0"/>
+        <w:spacing w:line="233" w:lineRule="auto" w:before="28" w:after="20"/>
+        <w:ind w:left="0" w:right="0" w:firstLine="0"/>
+        <w:jc w:val="center"/>
       </w:pPr>
+      <w:r>
+        <w:rPr>
+          <w:rFonts w:ascii="Liberation Sans" w:hAnsi="Liberation Sans" w:eastAsia="Liberation Sans"/>
+          <w:b/>
+          <w:i w:val="0"/>
+          <w:color w:val="2D3748"/>
+          <w:sz w:val="15"/>
+        </w:rPr>
+        <w:t>Sumber/</w:t>
+      </w:r>
+      <w:r>
+        <w:rPr>
+          <w:rFonts w:ascii="Liberation Sans" w:hAnsi="Liberation Sans" w:eastAsia="Liberation Sans"/>
+          <w:b/>
+          <w:i/>
+          <w:color w:val="2D3748"/>
+          <w:sz w:val="15"/>
+        </w:rPr>
+        <w:t>Source:</w:t>
+      </w:r>
+      <w:r>
+        <w:rPr>
+          <w:rFonts w:ascii="Liberation Sans" w:hAnsi="Liberation Sans" w:eastAsia="Liberation Sans"/>
+          <w:b w:val="0"/>
+          <w:i w:val="0"/>
+          <w:color w:val="4A5568"/>
+          <w:sz w:val="15"/>
+        </w:rPr>
+        <w:t xml:space="preserve">Pemerintah Desa Pasir Palembang &amp; BPS Kabupaten Mempawah — PODES 2025 / </w:t>
+      </w:r>
+      <w:r>
+        <w:rPr>
+          <w:rFonts w:ascii="Liberation Sans" w:hAnsi="Liberation Sans" w:eastAsia="Liberation Sans"/>
+          <w:b w:val="0"/>
+          <w:i/>
+          <w:color w:val="4A5568"/>
+          <w:sz w:val="15"/>
+        </w:rPr>
+        <w:t>Government of Pasir Palembang Village</w:t>
+      </w:r>
     </w:p>
     <w:tbl>
       <w:tblPr>
         <w:tblW w:type="auto" w:w="0"/>
         <w:tblLayout w:type="fixed"/>
         <w:tblLook w:firstColumn="1" w:firstRow="1" w:lastColumn="0" w:lastRow="0" w:noHBand="0" w:noVBand="1" w:val="04A0"/>
-        <w:tblInd w:w="560.0" w:type="dxa"/>
+        <w:tblInd w:w="1200.0" w:type="dxa"/>
       </w:tblPr>
       <w:tblGrid>
         <w:gridCol w:w="9019"/>
       </w:tblGrid>
       <w:tr>
         <w:trPr>
-          <w:trHeight w:hRule="exact" w:val="256"/>
+          <w:trHeight w:hRule="exact" w:val="250"/>
         </w:trPr>
         <w:tc>
           <w:tcPr>
-            <w:tcW w:type="dxa" w:w="10480"/>
+            <w:tcW w:type="dxa" w:w="7780"/>
             <w:tcBorders/>
             <w:shd w:fill="f7fafb"/>
             <w:tcMar>
@@ -14853,40 +14982,10 @@
               <w:autoSpaceDN w:val="0"/>
               <w:autoSpaceDE w:val="0"/>
               <w:widowControl/>
-              <w:spacing w:line="233" w:lineRule="auto" w:before="28" w:after="0"/>
-              <w:ind w:left="576" w:right="0" w:firstLine="0"/>
+              <w:spacing w:line="233" w:lineRule="auto" w:before="22" w:after="0"/>
+              <w:ind w:left="1212" w:right="0" w:firstLine="0"/>
               <w:jc w:val="left"/>
             </w:pPr>
-            <w:r>
-              <w:rPr>
-                <w:rFonts w:ascii="Liberation Sans" w:hAnsi="Liberation Sans" w:eastAsia="Liberation Sans"/>
-                <w:b/>
-                <w:i w:val="0"/>
-                <w:color w:val="2D3748"/>
-                <w:sz w:val="15"/>
-              </w:rPr>
-              <w:t>Sumber/</w:t>
-            </w:r>
-            <w:r>
-              <w:rPr>
-                <w:rFonts w:ascii="Liberation Sans" w:hAnsi="Liberation Sans" w:eastAsia="Liberation Sans"/>
-                <w:b/>
-                <w:i/>
-                <w:color w:val="2D3748"/>
-                <w:sz w:val="15"/>
-              </w:rPr>
-              <w:t>Source:</w:t>
-            </w:r>
-            <w:r>
-              <w:rPr>
-                <w:rFonts w:ascii="Liberation Sans" w:hAnsi="Liberation Sans" w:eastAsia="Liberation Sans"/>
-                <w:b w:val="0"/>
-                <w:i w:val="0"/>
-                <w:color w:val="4A5568"/>
-                <w:sz w:val="15"/>
-              </w:rPr>
-              <w:t xml:space="preserve">Badan Pusat Statistik Kabupaten Mempawah — PODES 2025 / </w:t>
-            </w:r>
             <w:r>
               <w:rPr>
                 <w:rFonts w:ascii="Liberation Sans" w:hAnsi="Liberation Sans" w:eastAsia="Liberation Sans"/>
@@ -14895,7 +14994,7 @@
                 <w:color w:val="4A5568"/>
                 <w:sz w:val="15"/>
               </w:rPr>
-              <w:t>BPS-Statistics Mempawah Regency — PODES 2025</w:t>
+              <w:t>&amp; BPS-Statistics Mempawah Regency — PODES 2025</w:t>
             </w:r>
           </w:p>
         </w:tc>
@@ -14906,7 +15005,7 @@
         <w:autoSpaceDN w:val="0"/>
         <w:autoSpaceDE w:val="0"/>
         <w:widowControl/>
-        <w:spacing w:line="9528" w:lineRule="exact" w:before="0" w:after="0"/>
+        <w:spacing w:line="9318" w:lineRule="exact" w:before="0" w:after="0"/>
         <w:ind w:left="0" w:right="0"/>
       </w:pPr>
     </w:p>
@@ -14957,24 +15056,6 @@
         </w:tc>
       </w:tr>
     </w:tbl>
-    <w:p>
-      <w:pPr>
-        <w:autoSpaceDN w:val="0"/>
-        <w:autoSpaceDE w:val="0"/>
-        <w:widowControl/>
-        <w:spacing w:line="14" w:lineRule="exact" w:before="0" w:after="0"/>
-        <w:ind w:left="0" w:right="0"/>
-      </w:pPr>
-    </w:p>
-    <w:p>
-      <w:pPr>
-        <w:autoSpaceDN w:val="0"/>
-        <w:autoSpaceDE w:val="0"/>
-        <w:widowControl/>
-        <w:spacing w:line="14" w:lineRule="exact" w:before="0" w:after="0"/>
-        <w:ind w:left="0" w:right="0"/>
-      </w:pPr>
-    </w:p>
     <w:p>
       <w:pPr>
         <w:autoSpaceDN w:val="0"/>
@@ -15855,27 +15936,68 @@
         <w:autoSpaceDN w:val="0"/>
         <w:autoSpaceDE w:val="0"/>
         <w:widowControl/>
-        <w:spacing w:line="20" w:lineRule="exact" w:before="0" w:after="0"/>
-        <w:ind w:left="0" w:right="0"/>
+        <w:spacing w:line="230" w:lineRule="auto" w:before="38" w:after="14"/>
+        <w:ind w:left="0" w:right="0" w:firstLine="0"/>
+        <w:jc w:val="center"/>
       </w:pPr>
+      <w:r>
+        <w:rPr>
+          <w:rFonts w:ascii="Liberation Sans" w:hAnsi="Liberation Sans" w:eastAsia="Liberation Sans"/>
+          <w:b/>
+          <w:i w:val="0"/>
+          <w:color w:val="2D3748"/>
+          <w:sz w:val="15"/>
+        </w:rPr>
+        <w:t>Sumber/</w:t>
+      </w:r>
+      <w:r>
+        <w:rPr>
+          <w:rFonts w:ascii="Liberation Sans" w:hAnsi="Liberation Sans" w:eastAsia="Liberation Sans"/>
+          <w:b/>
+          <w:i/>
+          <w:color w:val="2D3748"/>
+          <w:sz w:val="15"/>
+        </w:rPr>
+        <w:t>Source:</w:t>
+      </w:r>
+      <w:r>
+        <w:rPr>
+          <w:rFonts w:ascii="Liberation Sans" w:hAnsi="Liberation Sans" w:eastAsia="Liberation Sans"/>
+          <w:b w:val="0"/>
+          <w:i w:val="0"/>
+          <w:color w:val="4A5568"/>
+          <w:sz w:val="15"/>
+        </w:rPr>
+        <w:t xml:space="preserve">Pemerintah Desa Pasir Palembang &amp; BPS Kabupaten Mempawah — PODES 2025 / </w:t>
+      </w:r>
+      <w:r>
+        <w:rPr>
+          <w:rFonts w:ascii="Liberation Sans" w:hAnsi="Liberation Sans" w:eastAsia="Liberation Sans"/>
+          <w:b w:val="0"/>
+          <w:i/>
+          <w:color w:val="4A5568"/>
+          <w:sz w:val="15"/>
+        </w:rPr>
+        <w:t>Government of Pasir Palembang Village</w:t>
+      </w:r>
     </w:p>
     <w:tbl>
       <w:tblPr>
         <w:tblW w:type="auto" w:w="0"/>
         <w:tblLayout w:type="fixed"/>
         <w:tblLook w:firstColumn="1" w:firstRow="1" w:lastColumn="0" w:lastRow="0" w:noHBand="0" w:noVBand="1" w:val="04A0"/>
-        <w:tblInd w:w="560.0" w:type="dxa"/>
+        <w:tblInd w:w="1200.0" w:type="dxa"/>
       </w:tblPr>
       <w:tblGrid>
         <w:gridCol w:w="9019"/>
       </w:tblGrid>
       <w:tr>
         <w:trPr>
-          <w:trHeight w:hRule="exact" w:val="264"/>
+          <w:trHeight w:hRule="exact" w:val="242"/>
         </w:trPr>
         <w:tc>
           <w:tcPr>
-            <w:tcW w:type="dxa" w:w="10480"/>
+            <w:tcW w:type="dxa" w:w="7780"/>
             <w:tcBorders/>
             <w:shd w:fill="f7fafb"/>
             <w:tcMar>
@@ -15888,40 +16010,10 @@
               <w:autoSpaceDN w:val="0"/>
               <w:autoSpaceDE w:val="0"/>
               <w:widowControl/>
-              <w:spacing w:line="230" w:lineRule="auto" w:before="38" w:after="0"/>
-              <w:ind w:left="576" w:right="0" w:firstLine="0"/>
+              <w:spacing w:line="233" w:lineRule="auto" w:before="14" w:after="0"/>
+              <w:ind w:left="1212" w:right="0" w:firstLine="0"/>
               <w:jc w:val="left"/>
             </w:pPr>
-            <w:r>
-              <w:rPr>
-                <w:rFonts w:ascii="Liberation Sans" w:hAnsi="Liberation Sans" w:eastAsia="Liberation Sans"/>
-                <w:b/>
-                <w:i w:val="0"/>
-                <w:color w:val="2D3748"/>
-                <w:sz w:val="15"/>
-              </w:rPr>
-              <w:t>Sumber/</w:t>
-            </w:r>
-            <w:r>
-              <w:rPr>
-                <w:rFonts w:ascii="Liberation Sans" w:hAnsi="Liberation Sans" w:eastAsia="Liberation Sans"/>
-                <w:b/>
-                <w:i/>
-                <w:color w:val="2D3748"/>
-                <w:sz w:val="15"/>
-              </w:rPr>
-              <w:t>Source:</w:t>
-            </w:r>
-            <w:r>
-              <w:rPr>
-                <w:rFonts w:ascii="Liberation Sans" w:hAnsi="Liberation Sans" w:eastAsia="Liberation Sans"/>
-                <w:b w:val="0"/>
-                <w:i w:val="0"/>
-                <w:color w:val="4A5568"/>
-                <w:sz w:val="15"/>
-              </w:rPr>
-              <w:t xml:space="preserve">Badan Pusat Statistik Kabupaten Mempawah — PODES 2025 / </w:t>
-            </w:r>
             <w:r>
               <w:rPr>
                 <w:rFonts w:ascii="Liberation Sans" w:hAnsi="Liberation Sans" w:eastAsia="Liberation Sans"/>
@@ -15930,7 +16022,7 @@
                 <w:color w:val="4A5568"/>
                 <w:sz w:val="15"/>
               </w:rPr>
-              <w:t>BPS-Statistics Mempawah Regency — PODES 2025</w:t>
+              <w:t>&amp; BPS-Statistics Mempawah Regency — PODES 2025</w:t>
             </w:r>
           </w:p>
         </w:tc>
@@ -15941,7 +16033,7 @@
         <w:autoSpaceDN w:val="0"/>
         <w:autoSpaceDE w:val="0"/>
         <w:widowControl/>
-        <w:spacing w:line="10264" w:lineRule="exact" w:before="0" w:after="0"/>
+        <w:spacing w:line="10068" w:lineRule="exact" w:before="0" w:after="0"/>
         <w:ind w:left="0" w:right="0"/>
       </w:pPr>
     </w:p>
@@ -15992,24 +16084,6 @@
         </w:tc>
       </w:tr>
     </w:tbl>
-    <w:p>
-      <w:pPr>
-        <w:autoSpaceDN w:val="0"/>
-        <w:autoSpaceDE w:val="0"/>
-        <w:widowControl/>
-        <w:spacing w:line="14" w:lineRule="exact" w:before="0" w:after="0"/>
-        <w:ind w:left="0" w:right="0"/>
-      </w:pPr>
-    </w:p>
-    <w:p>
-      <w:pPr>
-        <w:autoSpaceDN w:val="0"/>
-        <w:autoSpaceDE w:val="0"/>
-        <w:widowControl/>
-        <w:spacing w:line="14" w:lineRule="exact" w:before="0" w:after="0"/>
-        <w:ind w:left="0" w:right="0"/>
-      </w:pPr>
-    </w:p>
     <w:p>
       <w:pPr>
         <w:autoSpaceDN w:val="0"/>
@@ -16821,27 +16895,68 @@
         <w:autoSpaceDN w:val="0"/>
         <w:autoSpaceDE w:val="0"/>
         <w:widowControl/>
-        <w:spacing w:line="20" w:lineRule="exact" w:before="0" w:after="0"/>
-        <w:ind w:left="0" w:right="0"/>
+        <w:spacing w:line="233" w:lineRule="auto" w:before="28" w:after="20"/>
+        <w:ind w:left="0" w:right="0" w:firstLine="0"/>
+        <w:jc w:val="center"/>
       </w:pPr>
+      <w:r>
+        <w:rPr>
+          <w:rFonts w:ascii="Liberation Sans" w:hAnsi="Liberation Sans" w:eastAsia="Liberation Sans"/>
+          <w:b/>
+          <w:i w:val="0"/>
+          <w:color w:val="2D3748"/>
+          <w:sz w:val="15"/>
+        </w:rPr>
+        <w:t>Sumber/</w:t>
+      </w:r>
+      <w:r>
+        <w:rPr>
+          <w:rFonts w:ascii="Liberation Sans" w:hAnsi="Liberation Sans" w:eastAsia="Liberation Sans"/>
+          <w:b/>
+          <w:i/>
+          <w:color w:val="2D3748"/>
+          <w:sz w:val="15"/>
+        </w:rPr>
+        <w:t>Source:</w:t>
+      </w:r>
+      <w:r>
+        <w:rPr>
+          <w:rFonts w:ascii="Liberation Sans" w:hAnsi="Liberation Sans" w:eastAsia="Liberation Sans"/>
+          <w:b w:val="0"/>
+          <w:i w:val="0"/>
+          <w:color w:val="4A5568"/>
+          <w:sz w:val="15"/>
+        </w:rPr>
+        <w:t xml:space="preserve">Pemerintah Desa Pasir Palembang &amp; BPS Kabupaten Mempawah — PODES 2025 / </w:t>
+      </w:r>
+      <w:r>
+        <w:rPr>
+          <w:rFonts w:ascii="Liberation Sans" w:hAnsi="Liberation Sans" w:eastAsia="Liberation Sans"/>
+          <w:b w:val="0"/>
+          <w:i/>
+          <w:color w:val="4A5568"/>
+          <w:sz w:val="15"/>
+        </w:rPr>
+        <w:t>Government of Pasir Palembang Village</w:t>
+      </w:r>
     </w:p>
     <w:tbl>
       <w:tblPr>
         <w:tblW w:type="auto" w:w="0"/>
         <w:tblLayout w:type="fixed"/>
         <w:tblLook w:firstColumn="1" w:firstRow="1" w:lastColumn="0" w:lastRow="0" w:noHBand="0" w:noVBand="1" w:val="04A0"/>
-        <w:tblInd w:w="560.0" w:type="dxa"/>
+        <w:tblInd w:w="1200.0" w:type="dxa"/>
       </w:tblPr>
       <w:tblGrid>
         <w:gridCol w:w="9019"/>
       </w:tblGrid>
       <w:tr>
         <w:trPr>
-          <w:trHeight w:hRule="exact" w:val="256"/>
+          <w:trHeight w:hRule="exact" w:val="250"/>
         </w:trPr>
         <w:tc>
           <w:tcPr>
-            <w:tcW w:type="dxa" w:w="10480"/>
+            <w:tcW w:type="dxa" w:w="7780"/>
             <w:tcBorders/>
             <w:shd w:fill="f7fafb"/>
             <w:tcMar>
@@ -16854,40 +16969,10 @@
               <w:autoSpaceDN w:val="0"/>
               <w:autoSpaceDE w:val="0"/>
               <w:widowControl/>
-              <w:spacing w:line="233" w:lineRule="auto" w:before="28" w:after="0"/>
-              <w:ind w:left="576" w:right="0" w:firstLine="0"/>
+              <w:spacing w:line="233" w:lineRule="auto" w:before="22" w:after="0"/>
+              <w:ind w:left="1212" w:right="0" w:firstLine="0"/>
               <w:jc w:val="left"/>
             </w:pPr>
-            <w:r>
-              <w:rPr>
-                <w:rFonts w:ascii="Liberation Sans" w:hAnsi="Liberation Sans" w:eastAsia="Liberation Sans"/>
-                <w:b/>
-                <w:i w:val="0"/>
-                <w:color w:val="2D3748"/>
-                <w:sz w:val="15"/>
-              </w:rPr>
-              <w:t>Sumber/</w:t>
-            </w:r>
-            <w:r>
-              <w:rPr>
-                <w:rFonts w:ascii="Liberation Sans" w:hAnsi="Liberation Sans" w:eastAsia="Liberation Sans"/>
-                <w:b/>
-                <w:i/>
-                <w:color w:val="2D3748"/>
-                <w:sz w:val="15"/>
-              </w:rPr>
-              <w:t>Source:</w:t>
-            </w:r>
-            <w:r>
-              <w:rPr>
-                <w:rFonts w:ascii="Liberation Sans" w:hAnsi="Liberation Sans" w:eastAsia="Liberation Sans"/>
-                <w:b w:val="0"/>
-                <w:i w:val="0"/>
-                <w:color w:val="4A5568"/>
-                <w:sz w:val="15"/>
-              </w:rPr>
-              <w:t xml:space="preserve">Badan Pusat Statistik Kabupaten Mempawah — PODES 2025 / </w:t>
-            </w:r>
             <w:r>
               <w:rPr>
                 <w:rFonts w:ascii="Liberation Sans" w:hAnsi="Liberation Sans" w:eastAsia="Liberation Sans"/>
@@ -16896,7 +16981,7 @@
                 <w:color w:val="4A5568"/>
                 <w:sz w:val="15"/>
               </w:rPr>
-              <w:t>BPS-Statistics Mempawah Regency — PODES 2025</w:t>
+              <w:t>&amp; BPS-Statistics Mempawah Regency — PODES 2025</w:t>
             </w:r>
           </w:p>
         </w:tc>
@@ -16907,7 +16992,7 @@
         <w:autoSpaceDN w:val="0"/>
         <w:autoSpaceDE w:val="0"/>
         <w:widowControl/>
-        <w:spacing w:line="10188" w:lineRule="exact" w:before="0" w:after="0"/>
+        <w:spacing w:line="9978" w:lineRule="exact" w:before="0" w:after="0"/>
         <w:ind w:left="0" w:right="0"/>
       </w:pPr>
     </w:p>
@@ -16978,24 +17063,6 @@
     </w:p>
     <w:p>
       <w:pPr>
-        <w:autoSpaceDN w:val="0"/>
-        <w:autoSpaceDE w:val="0"/>
-        <w:widowControl/>
-        <w:spacing w:line="14" w:lineRule="exact" w:before="0" w:after="0"/>
-        <w:ind w:left="0" w:right="0"/>
-      </w:pPr>
-    </w:p>
-    <w:p>
-      <w:pPr>
-        <w:autoSpaceDN w:val="0"/>
-        <w:autoSpaceDE w:val="0"/>
-        <w:widowControl/>
-        <w:spacing w:line="14" w:lineRule="exact" w:before="0" w:after="0"/>
-        <w:ind w:left="0" w:right="0"/>
-      </w:pPr>
-    </w:p>
-    <w:p>
-      <w:pPr>
         <w:sectPr>
           <w:pgSz w:w="11899" w:h="16838"/>
           <w:pgMar w:top="0" w:right="0" w:bottom="0" w:left="0" w:header="720" w:footer="720" w:gutter="0"/>
@@ -17009,7 +17076,7 @@
         <w:autoSpaceDN w:val="0"/>
         <w:autoSpaceDE w:val="0"/>
         <w:widowControl/>
-        <w:spacing w:line="220" w:lineRule="exact" w:before="0" w:after="214"/>
+        <w:spacing w:line="220" w:lineRule="exact" w:before="0" w:after="6030"/>
         <w:ind w:left="0" w:right="0"/>
       </w:pPr>
       <w:r>
@@ -17020,9 +17087,9 @@
               <wp:posOffset>1244600</wp:posOffset>
             </wp:positionH>
             <wp:positionV relativeFrom="page">
-              <wp:posOffset>4965700</wp:posOffset>
+              <wp:posOffset>4559300</wp:posOffset>
             </wp:positionV>
-            <wp:extent cx="6311900" cy="2654300"/>
+            <wp:extent cx="6311900" cy="2692400"/>
             <wp:wrapNone/>
             <wp:docPr id="5" name="Picture 5"/>
             <wp:cNvGraphicFramePr>
@@ -17044,7 +17111,7 @@
                   <pic:spPr>
                     <a:xfrm>
                       <a:off x="0" y="0"/>
-                      <a:ext cx="6311900" cy="2654300"/>
+                      <a:ext cx="6311900" cy="2692400"/>
                     </a:xfrm>
                     <a:prstGeom prst="rect"/>
                   </pic:spPr>
@@ -17055,57 +17122,24 @@
         </w:drawing>
       </w:r>
     </w:p>
-    <w:p>
-      <w:pPr>
-        <w:autoSpaceDN w:val="0"/>
-        <w:autoSpaceDE w:val="0"/>
-        <w:widowControl/>
-        <w:spacing w:line="254" w:lineRule="auto" w:before="0" w:after="6994"/>
-        <w:ind w:left="340" w:right="6192" w:firstLine="0"/>
-        <w:jc w:val="left"/>
-      </w:pPr>
-      <w:r>
-        <w:rPr>
-          <w:rFonts w:ascii="Liberation Sans" w:hAnsi="Liberation Sans" w:eastAsia="Liberation Sans"/>
-          <w:b/>
-          <w:i w:val="0"/>
-          <w:color w:val="EB8A3C"/>
-          <w:sz w:val="17"/>
-        </w:rPr>
-        <w:t xml:space="preserve">POTENSI DESA PASIR PALEMBANG 2026 </w:t>
-      </w:r>
-      <w:r>
-        <w:br/>
-      </w:r>
-      <w:r>
-        <w:rPr>
-          <w:rFonts w:ascii="Liberation Sans" w:hAnsi="Liberation Sans" w:eastAsia="Liberation Sans"/>
-          <w:b/>
-          <w:i/>
-          <w:color w:val="EB8A3C"/>
-          <w:sz w:val="17"/>
-        </w:rPr>
-        <w:t>POTENTIALS OF PASIR PALEMBANG VILLAGE 2026</w:t>
-      </w:r>
-    </w:p>
     <w:tbl>
       <w:tblPr>
         <w:tblW w:type="auto" w:w="0"/>
         <w:tblLayout w:type="fixed"/>
         <w:tblLook w:firstColumn="1" w:firstRow="1" w:lastColumn="0" w:lastRow="0" w:noHBand="0" w:noVBand="1" w:val="04A0"/>
-        <w:tblInd w:w="1164.0" w:type="dxa"/>
+        <w:tblInd w:w="1124.0" w:type="dxa"/>
       </w:tblPr>
       <w:tblGrid>
-        <w:gridCol w:w="5407"/>
-        <w:gridCol w:w="5407"/>
+        <w:gridCol w:w="5392"/>
+        <w:gridCol w:w="5392"/>
       </w:tblGrid>
       <w:tr>
         <w:trPr>
-          <w:trHeight w:hRule="exact" w:val="1062"/>
+          <w:trHeight w:hRule="exact" w:val="1376"/>
         </w:trPr>
         <w:tc>
           <w:tcPr>
-            <w:tcW w:type="dxa" w:w="2000"/>
+            <w:tcW w:type="dxa" w:w="2080"/>
             <w:tcBorders/>
             <w:tcMar>
               <w:start w:w="0" w:type="dxa"/>
@@ -17117,8 +17151,8 @@
               <w:autoSpaceDN w:val="0"/>
               <w:autoSpaceDE w:val="0"/>
               <w:widowControl/>
-              <w:spacing w:line="245" w:lineRule="auto" w:before="72" w:after="0"/>
-              <w:ind w:left="1152" w:right="288" w:firstLine="0"/>
+              <w:spacing w:line="245" w:lineRule="auto" w:before="20" w:after="0"/>
+              <w:ind w:left="1152" w:right="432" w:firstLine="0"/>
               <w:jc w:val="center"/>
             </w:pPr>
             <w:r>
@@ -17127,7 +17161,7 @@
                 <w:b/>
                 <w:i w:val="0"/>
                 <w:color w:val="FFFFFF"/>
-                <w:sz w:val="72"/>
+                <w:sz w:val="68"/>
               </w:rPr>
               <w:t xml:space="preserve">5 </w:t>
             </w:r>
@@ -17139,16 +17173,36 @@
                 <w:rFonts w:ascii="Liberation Sans" w:hAnsi="Liberation Sans" w:eastAsia="Liberation Sans"/>
                 <w:b/>
                 <w:i w:val="0"/>
-                <w:color w:val="FFFFFF"/>
-                <w:sz w:val="20"/>
+                <w:color w:val="EB8A3C"/>
+                <w:sz w:val="19"/>
               </w:rPr>
               <w:t>BAB</w:t>
+            </w:r>
+          </w:p>
+          <w:p>
+            <w:pPr>
+              <w:autoSpaceDN w:val="0"/>
+              <w:autoSpaceDE w:val="0"/>
+              <w:widowControl/>
+              <w:spacing w:line="233" w:lineRule="auto" w:before="34" w:after="0"/>
+              <w:ind w:left="0" w:right="360" w:firstLine="0"/>
+              <w:jc w:val="right"/>
+            </w:pPr>
+            <w:r>
+              <w:rPr>
+                <w:rFonts w:ascii="Liberation Sans" w:hAnsi="Liberation Sans" w:eastAsia="Liberation Sans"/>
+                <w:b/>
+                <w:i/>
+                <w:color w:val="FEF08A"/>
+                <w:sz w:val="15"/>
+              </w:rPr>
+              <w:t>Chapter</w:t>
             </w:r>
           </w:p>
         </w:tc>
         <w:tc>
           <w:tcPr>
-            <w:tcW w:type="dxa" w:w="6900"/>
+            <w:tcW w:type="dxa" w:w="7440"/>
             <w:tcBorders/>
             <w:tcMar>
               <w:start w:w="0" w:type="dxa"/>
@@ -17160,8 +17214,8 @@
               <w:autoSpaceDN w:val="0"/>
               <w:autoSpaceDE w:val="0"/>
               <w:widowControl/>
-              <w:spacing w:line="245" w:lineRule="auto" w:before="60" w:after="0"/>
-              <w:ind w:left="410" w:right="720" w:firstLine="0"/>
+              <w:spacing w:line="245" w:lineRule="auto" w:before="0" w:after="0"/>
+              <w:ind w:left="370" w:right="1296" w:firstLine="0"/>
               <w:jc w:val="left"/>
             </w:pPr>
             <w:r>
@@ -17185,78 +17239,12 @@
               <w:t>INFORMASI DESA</w:t>
             </w:r>
           </w:p>
-        </w:tc>
-      </w:tr>
-    </w:tbl>
-    <w:p>
-      <w:pPr>
-        <w:autoSpaceDN w:val="0"/>
-        <w:autoSpaceDE w:val="0"/>
-        <w:widowControl/>
-        <w:spacing w:line="20" w:lineRule="exact" w:before="0" w:after="0"/>
-        <w:ind w:left="0" w:right="0"/>
-      </w:pPr>
-    </w:p>
-    <w:tbl>
-      <w:tblPr>
-        <w:tblW w:type="auto" w:w="0"/>
-        <w:tblLayout w:type="fixed"/>
-        <w:tblLook w:firstColumn="1" w:firstRow="1" w:lastColumn="0" w:lastRow="0" w:noHBand="0" w:noVBand="1" w:val="04A0"/>
-        <w:tblInd w:w="1124.0" w:type="dxa"/>
-      </w:tblPr>
-      <w:tblGrid>
-        <w:gridCol w:w="5407"/>
-        <w:gridCol w:w="5407"/>
-      </w:tblGrid>
-      <w:tr>
-        <w:trPr>
-          <w:trHeight w:hRule="exact" w:val="436"/>
-        </w:trPr>
-        <w:tc>
-          <w:tcPr>
-            <w:tcW w:type="dxa" w:w="2080"/>
-            <w:tcBorders/>
-            <w:tcMar>
-              <w:start w:w="0" w:type="dxa"/>
-              <w:end w:w="0" w:type="dxa"/>
-            </w:tcMar>
-          </w:tcPr>
           <w:p>
             <w:pPr>
               <w:autoSpaceDN w:val="0"/>
               <w:autoSpaceDE w:val="0"/>
               <w:widowControl/>
-              <w:spacing w:line="233" w:lineRule="auto" w:before="60" w:after="0"/>
-              <w:ind w:left="0" w:right="340" w:firstLine="0"/>
-              <w:jc w:val="right"/>
-            </w:pPr>
-            <w:r>
-              <w:rPr>
-                <w:rFonts w:ascii="Liberation Sans" w:hAnsi="Liberation Sans" w:eastAsia="Liberation Sans"/>
-                <w:b/>
-                <w:i/>
-                <w:color w:val="FFFFFF"/>
-                <w:sz w:val="16"/>
-              </w:rPr>
-              <w:t>Chapter</w:t>
-            </w:r>
-          </w:p>
-        </w:tc>
-        <w:tc>
-          <w:tcPr>
-            <w:tcW w:type="dxa" w:w="7440"/>
-            <w:tcBorders/>
-            <w:tcMar>
-              <w:start w:w="0" w:type="dxa"/>
-              <w:end w:w="0" w:type="dxa"/>
-            </w:tcMar>
-          </w:tcPr>
-          <w:p>
-            <w:pPr>
-              <w:autoSpaceDN w:val="0"/>
-              <w:autoSpaceDE w:val="0"/>
-              <w:widowControl/>
-              <w:spacing w:line="233" w:lineRule="auto" w:before="108" w:after="0"/>
+              <w:spacing w:line="233" w:lineRule="auto" w:before="316" w:after="0"/>
               <w:ind w:left="370" w:right="0" w:firstLine="0"/>
               <w:jc w:val="left"/>
             </w:pPr>
@@ -17265,7 +17253,7 @@
                 <w:rFonts w:ascii="Liberation Sans" w:hAnsi="Liberation Sans" w:eastAsia="Liberation Sans"/>
                 <w:b/>
                 <w:i/>
-                <w:color w:val="FFFFFF"/>
+                <w:color w:val="FEF08A"/>
                 <w:sz w:val="24"/>
               </w:rPr>
               <w:t>GOVERNMENT, INSTITUTIONS &amp; VILLAGE INFORMATION</w:t>
@@ -17279,8 +17267,8 @@
         <w:autoSpaceDN w:val="0"/>
         <w:autoSpaceDE w:val="0"/>
         <w:widowControl/>
-        <w:spacing w:line="233" w:lineRule="auto" w:before="1038" w:after="0"/>
-        <w:ind w:left="1788" w:right="0" w:firstLine="0"/>
+        <w:spacing w:line="233" w:lineRule="auto" w:before="1082" w:after="0"/>
+        <w:ind w:left="1818" w:right="0" w:firstLine="0"/>
         <w:jc w:val="left"/>
       </w:pPr>
       <w:r>
@@ -17311,7 +17299,7 @@
           <w:color w:val="334155"/>
           <w:sz w:val="19"/>
         </w:rPr>
-        <w:t>, keberadaan BPD/LMK tercatat</w:t>
+        <w:t>, keberadaan BPD/LMK</w:t>
       </w:r>
     </w:p>
     <w:p>
@@ -17319,10 +17307,20 @@
         <w:autoSpaceDN w:val="0"/>
         <w:autoSpaceDE w:val="0"/>
         <w:widowControl/>
-        <w:spacing w:line="233" w:lineRule="auto" w:before="72" w:after="0"/>
-        <w:ind w:left="1788" w:right="0" w:firstLine="0"/>
+        <w:spacing w:line="233" w:lineRule="auto" w:before="74" w:after="0"/>
+        <w:ind w:left="1818" w:right="0" w:firstLine="0"/>
         <w:jc w:val="left"/>
       </w:pPr>
+      <w:r>
+        <w:rPr>
+          <w:rFonts w:ascii="Liberation Sans" w:hAnsi="Liberation Sans" w:eastAsia="Liberation Sans"/>
+          <w:b w:val="0"/>
+          <w:i w:val="0"/>
+          <w:color w:val="334155"/>
+          <w:sz w:val="19"/>
+        </w:rPr>
+        <w:t xml:space="preserve">tercatat </w:t>
+      </w:r>
       <w:r>
         <w:rPr>
           <w:rFonts w:ascii="Liberation Sans" w:hAnsi="Liberation Sans" w:eastAsia="Liberation Sans"/>
@@ -17369,7 +17367,7 @@
         <w:autoSpaceDN w:val="0"/>
         <w:autoSpaceDE w:val="0"/>
         <w:widowControl/>
-        <w:spacing w:line="233" w:lineRule="auto" w:before="5020" w:after="0"/>
+        <w:spacing w:line="233" w:lineRule="auto" w:before="5634" w:after="0"/>
         <w:ind w:left="0" w:right="0" w:firstLine="0"/>
         <w:jc w:val="left"/>
       </w:pPr>
@@ -17388,7 +17386,7 @@
       <w:pPr>
         <w:sectPr>
           <w:pgSz w:w="11899" w:h="16838"/>
-          <w:pgMar w:top="432" w:right="288" w:bottom="162" w:left="796" w:header="720" w:footer="720" w:gutter="0"/>
+          <w:pgMar w:top="1440" w:right="318" w:bottom="162" w:left="796" w:header="720" w:footer="720" w:gutter="0"/>
           <w:cols/>
           <w:docGrid w:linePitch="360"/>
         </w:sectPr>
@@ -17399,9 +17397,9 @@
         <w:autoSpaceDN w:val="0"/>
         <w:autoSpaceDE w:val="0"/>
         <w:widowControl/>
-        <w:spacing w:line="233" w:lineRule="auto" w:before="866" w:after="0"/>
-        <w:ind w:left="0" w:right="1126" w:firstLine="0"/>
-        <w:jc w:val="right"/>
+        <w:spacing w:line="254" w:lineRule="auto" w:before="866" w:after="0"/>
+        <w:ind w:left="7866" w:right="1008" w:hanging="582"/>
+        <w:jc w:val="left"/>
       </w:pPr>
       <w:r>
         <w:rPr>
@@ -17411,18 +17409,11 @@
           <w:color w:val="EB8A3C"/>
           <w:sz w:val="17"/>
         </w:rPr>
-        <w:t>BAB V PEMERINTAHAN &amp; KELEMBAGAAN</w:t>
+        <w:t xml:space="preserve">BAB V PEMERINTAHAN &amp; KELEMBAGAAN </w:t>
       </w:r>
-    </w:p>
-    <w:p>
-      <w:pPr>
-        <w:autoSpaceDN w:val="0"/>
-        <w:autoSpaceDE w:val="0"/>
-        <w:widowControl/>
-        <w:spacing w:line="233" w:lineRule="auto" w:before="36" w:after="0"/>
-        <w:ind w:left="0" w:right="1126" w:firstLine="0"/>
-        <w:jc w:val="right"/>
-      </w:pPr>
+      <w:r>
+        <w:br/>
+      </w:r>
       <w:r>
         <w:rPr>
           <w:rFonts w:ascii="Liberation Sans" w:hAnsi="Liberation Sans" w:eastAsia="Liberation Sans"/>
@@ -18338,9 +18329,50 @@
         <w:autoSpaceDN w:val="0"/>
         <w:autoSpaceDE w:val="0"/>
         <w:widowControl/>
-        <w:spacing w:line="20" w:lineRule="exact" w:before="0" w:after="0"/>
-        <w:ind w:left="0" w:right="0"/>
+        <w:spacing w:line="233" w:lineRule="auto" w:before="30" w:after="20"/>
+        <w:ind w:left="0" w:right="0" w:firstLine="0"/>
+        <w:jc w:val="center"/>
       </w:pPr>
+      <w:r>
+        <w:rPr>
+          <w:rFonts w:ascii="Liberation Sans" w:hAnsi="Liberation Sans" w:eastAsia="Liberation Sans"/>
+          <w:b/>
+          <w:i w:val="0"/>
+          <w:color w:val="2D3748"/>
+          <w:sz w:val="15"/>
+        </w:rPr>
+        <w:t>Sumber/</w:t>
+      </w:r>
+      <w:r>
+        <w:rPr>
+          <w:rFonts w:ascii="Liberation Sans" w:hAnsi="Liberation Sans" w:eastAsia="Liberation Sans"/>
+          <w:b/>
+          <w:i/>
+          <w:color w:val="2D3748"/>
+          <w:sz w:val="15"/>
+        </w:rPr>
+        <w:t>Source:</w:t>
+      </w:r>
+      <w:r>
+        <w:rPr>
+          <w:rFonts w:ascii="Liberation Sans" w:hAnsi="Liberation Sans" w:eastAsia="Liberation Sans"/>
+          <w:b w:val="0"/>
+          <w:i w:val="0"/>
+          <w:color w:val="4A5568"/>
+          <w:sz w:val="15"/>
+        </w:rPr>
+        <w:t xml:space="preserve">Pemerintah Desa Pasir Palembang &amp; BPS Kabupaten Mempawah — PODES 2025 / </w:t>
+      </w:r>
+      <w:r>
+        <w:rPr>
+          <w:rFonts w:ascii="Liberation Sans" w:hAnsi="Liberation Sans" w:eastAsia="Liberation Sans"/>
+          <w:b w:val="0"/>
+          <w:i/>
+          <w:color w:val="4A5568"/>
+          <w:sz w:val="15"/>
+        </w:rPr>
+        <w:t>Government of Pasir Palembang Village</w:t>
+      </w:r>
     </w:p>
     <w:tbl>
       <w:tblPr>
@@ -18354,13 +18386,13 @@
       </w:tblGrid>
       <w:tr>
         <w:trPr>
-          <w:trHeight w:hRule="exact" w:val="840"/>
+          <w:trHeight w:hRule="exact" w:val="818"/>
         </w:trPr>
         <w:tc>
           <w:tcPr>
             <w:tcW w:type="dxa" w:w="9630"/>
             <w:tcBorders>
-              <w:bottom w:sz="12.0" w:val="single" w:color="#0A3C5C"/>
+              <w:bottom w:sz="12.800000000000182" w:val="single" w:color="#0A3C5C"/>
             </w:tcBorders>
             <w:tcMar>
               <w:start w:w="0" w:type="dxa"/>
@@ -18372,40 +18404,10 @@
               <w:autoSpaceDN w:val="0"/>
               <w:autoSpaceDE w:val="0"/>
               <w:widowControl/>
-              <w:spacing w:line="233" w:lineRule="auto" w:before="30" w:after="0"/>
-              <w:ind w:left="0" w:right="0" w:firstLine="0"/>
+              <w:spacing w:line="233" w:lineRule="auto" w:before="22" w:after="0"/>
+              <w:ind w:left="1272" w:right="0" w:firstLine="0"/>
               <w:jc w:val="left"/>
             </w:pPr>
-            <w:r>
-              <w:rPr>
-                <w:rFonts w:ascii="Liberation Sans" w:hAnsi="Liberation Sans" w:eastAsia="Liberation Sans"/>
-                <w:b/>
-                <w:i w:val="0"/>
-                <w:color w:val="2D3748"/>
-                <w:sz w:val="15"/>
-              </w:rPr>
-              <w:t>Sumber/</w:t>
-            </w:r>
-            <w:r>
-              <w:rPr>
-                <w:rFonts w:ascii="Liberation Sans" w:hAnsi="Liberation Sans" w:eastAsia="Liberation Sans"/>
-                <w:b/>
-                <w:i/>
-                <w:color w:val="2D3748"/>
-                <w:sz w:val="15"/>
-              </w:rPr>
-              <w:t>Source:</w:t>
-            </w:r>
-            <w:r>
-              <w:rPr>
-                <w:rFonts w:ascii="Liberation Sans" w:hAnsi="Liberation Sans" w:eastAsia="Liberation Sans"/>
-                <w:b w:val="0"/>
-                <w:i w:val="0"/>
-                <w:color w:val="4A5568"/>
-                <w:sz w:val="15"/>
-              </w:rPr>
-              <w:t xml:space="preserve">Badan Pusat Statistik Kabupaten Mempawah — PODES 2025 / </w:t>
-            </w:r>
             <w:r>
               <w:rPr>
                 <w:rFonts w:ascii="Liberation Sans" w:hAnsi="Liberation Sans" w:eastAsia="Liberation Sans"/>
@@ -18414,7 +18416,7 @@
                 <w:color w:val="4A5568"/>
                 <w:sz w:val="15"/>
               </w:rPr>
-              <w:t>BPS-Statistics Mempawah Regency — PODES 2025</w:t>
+              <w:t>&amp; BPS-Statistics Mempawah Regency — PODES 2025</w:t>
             </w:r>
           </w:p>
         </w:tc>
@@ -18425,7 +18427,7 @@
         <w:autoSpaceDN w:val="0"/>
         <w:autoSpaceDE w:val="0"/>
         <w:widowControl/>
-        <w:spacing w:line="282" w:lineRule="exact" w:before="0" w:after="0"/>
+        <w:spacing w:line="280" w:lineRule="exact" w:before="0" w:after="0"/>
         <w:ind w:left="0" w:right="0"/>
       </w:pPr>
     </w:p>
@@ -18441,7 +18443,7 @@
       </w:tblGrid>
       <w:tr>
         <w:trPr>
-          <w:trHeight w:hRule="exact" w:val="418"/>
+          <w:trHeight w:hRule="exact" w:val="420"/>
         </w:trPr>
         <w:tc>
           <w:tcPr>
@@ -18496,7 +18498,7 @@
       </w:tblGrid>
       <w:tr>
         <w:trPr>
-          <w:trHeight w:hRule="exact" w:val="314"/>
+          <w:trHeight w:hRule="exact" w:val="312"/>
         </w:trPr>
         <w:tc>
           <w:tcPr>
@@ -18513,7 +18515,7 @@
               <w:autoSpaceDN w:val="0"/>
               <w:autoSpaceDE w:val="0"/>
               <w:widowControl/>
-              <w:spacing w:line="235" w:lineRule="auto" w:before="56" w:after="0"/>
+              <w:spacing w:line="233" w:lineRule="auto" w:before="56" w:after="0"/>
               <w:ind w:left="576" w:right="0" w:firstLine="0"/>
               <w:jc w:val="left"/>
             </w:pPr>
@@ -18537,7 +18539,7 @@
         <w:autoSpaceDN w:val="0"/>
         <w:autoSpaceDE w:val="0"/>
         <w:widowControl/>
-        <w:spacing w:line="8262" w:lineRule="exact" w:before="0" w:after="0"/>
+        <w:spacing w:line="8068" w:lineRule="exact" w:before="0" w:after="0"/>
         <w:ind w:left="0" w:right="0"/>
       </w:pPr>
     </w:p>
@@ -18588,24 +18590,6 @@
         </w:tc>
       </w:tr>
     </w:tbl>
-    <w:p>
-      <w:pPr>
-        <w:autoSpaceDN w:val="0"/>
-        <w:autoSpaceDE w:val="0"/>
-        <w:widowControl/>
-        <w:spacing w:line="14" w:lineRule="exact" w:before="0" w:after="0"/>
-        <w:ind w:left="0" w:right="0"/>
-      </w:pPr>
-    </w:p>
-    <w:p>
-      <w:pPr>
-        <w:autoSpaceDN w:val="0"/>
-        <w:autoSpaceDE w:val="0"/>
-        <w:widowControl/>
-        <w:spacing w:line="14" w:lineRule="exact" w:before="0" w:after="0"/>
-        <w:ind w:left="0" w:right="0"/>
-      </w:pPr>
-    </w:p>
     <w:p>
       <w:pPr>
         <w:autoSpaceDN w:val="0"/>

</xml_diff>

<commit_message>
fix(podes): replace BPS header with village government name on front cover
</commit_message>
<xml_diff>
--- a/kegiatan/desa-cantik/2026/pasir-palembang/publikasi-potensi-pasir-palembang-2026.docx
+++ b/kegiatan/desa-cantik/2026/pasir-palembang/publikasi-potensi-pasir-palembang-2026.docx
@@ -14,7 +14,7 @@
       </w:tblGrid>
       <w:tr>
         <w:trPr>
-          <w:trHeight w:hRule="exact" w:val="1716"/>
+          <w:trHeight w:hRule="exact" w:val="1738"/>
         </w:trPr>
         <w:tc>
           <w:tcPr>
@@ -43,7 +43,7 @@
                 <w:color w:val="F8FAFC"/>
                 <w:sz w:val="22"/>
               </w:rPr>
-              <w:t>BADAN PUSAT STATISTIK</w:t>
+              <w:t>PEMERINTAH DESA PASIR PALEMBANG</w:t>
             </w:r>
           </w:p>
         </w:tc>
@@ -70,7 +70,7 @@
       </w:tblGrid>
       <w:tr>
         <w:trPr>
-          <w:trHeight w:hRule="exact" w:val="700"/>
+          <w:trHeight w:hRule="exact" w:val="678"/>
         </w:trPr>
         <w:tc>
           <w:tcPr>
@@ -86,7 +86,7 @@
               <w:autoSpaceDN w:val="0"/>
               <w:autoSpaceDE w:val="0"/>
               <w:widowControl/>
-              <w:spacing w:line="233" w:lineRule="auto" w:before="34" w:after="0"/>
+              <w:spacing w:line="233" w:lineRule="auto" w:before="58" w:after="0"/>
               <w:ind w:left="0" w:right="0" w:firstLine="0"/>
               <w:jc w:val="left"/>
             </w:pPr>
@@ -95,8 +95,8 @@
                 <w:rFonts w:ascii="Liberation Sans" w:hAnsi="Liberation Sans" w:eastAsia="Liberation Sans"/>
                 <w:b/>
                 <w:i w:val="0"/>
-                <w:color w:val="F8FAFC"/>
-                <w:sz w:val="22"/>
+                <w:color w:val="CBD5E1"/>
+                <w:sz w:val="17"/>
               </w:rPr>
               <w:t>KABUPATEN MEMPAWAH</w:t>
             </w:r>

</xml_diff>

<commit_message>
fix(podes): resolve nested page-card div bug on chapter cover pages
</commit_message>
<xml_diff>
--- a/kegiatan/desa-cantik/2026/pasir-palembang/publikasi-potensi-pasir-palembang-2026.docx
+++ b/kegiatan/desa-cantik/2026/pasir-palembang/publikasi-potensi-pasir-palembang-2026.docx
@@ -6276,7 +6276,7 @@
         <w:autoSpaceDN w:val="0"/>
         <w:autoSpaceDE w:val="0"/>
         <w:widowControl/>
-        <w:spacing w:line="220" w:lineRule="exact" w:before="0" w:after="5880"/>
+        <w:spacing w:line="220" w:lineRule="exact" w:before="0" w:after="416"/>
         <w:ind w:left="0" w:right="0"/>
       </w:pPr>
       <w:r>
@@ -6284,12 +6284,12 @@
           <wp:anchor xmlns:a="http://schemas.openxmlformats.org/drawingml/2006/main" xmlns:pic="http://schemas.openxmlformats.org/drawingml/2006/picture" distT="0" distB="0" distL="0" distR="0" simplePos="0" relativeHeight="0" behindDoc="1" locked="0" layoutInCell="1" allowOverlap="1">
             <wp:simplePos x="0" y="0"/>
             <wp:positionH relativeFrom="page">
-              <wp:posOffset>1244600</wp:posOffset>
+              <wp:posOffset>571500</wp:posOffset>
             </wp:positionH>
             <wp:positionV relativeFrom="page">
-              <wp:posOffset>4457700</wp:posOffset>
+              <wp:posOffset>520700</wp:posOffset>
             </wp:positionV>
-            <wp:extent cx="6311900" cy="2882900"/>
+            <wp:extent cx="6400800" cy="3784600"/>
             <wp:wrapNone/>
             <wp:docPr id="1" name="Picture 1"/>
             <wp:cNvGraphicFramePr>
@@ -6311,7 +6311,7 @@
                   <pic:spPr>
                     <a:xfrm>
                       <a:off x="0" y="0"/>
-                      <a:ext cx="6311900" cy="2882900"/>
+                      <a:ext cx="6400800" cy="3784600"/>
                     </a:xfrm>
                     <a:prstGeom prst="rect"/>
                   </pic:spPr>
@@ -6327,19 +6327,19 @@
         <w:tblW w:type="auto" w:w="0"/>
         <w:tblLayout w:type="fixed"/>
         <w:tblLook w:firstColumn="1" w:firstRow="1" w:lastColumn="0" w:lastRow="0" w:noHBand="0" w:noVBand="1" w:val="04A0"/>
-        <w:tblInd w:w="800.0" w:type="dxa"/>
+        <w:tblInd w:w="180.0" w:type="dxa"/>
       </w:tblPr>
       <w:tblGrid>
-        <w:gridCol w:w="5070"/>
-        <w:gridCol w:w="5070"/>
+        <w:gridCol w:w="4846"/>
+        <w:gridCol w:w="4846"/>
       </w:tblGrid>
       <w:tr>
         <w:trPr>
-          <w:trHeight w:hRule="exact" w:val="1390"/>
+          <w:trHeight w:hRule="exact" w:val="1218"/>
         </w:trPr>
         <w:tc>
           <w:tcPr>
-            <w:tcW w:type="dxa" w:w="1760"/>
+            <w:tcW w:type="dxa" w:w="1060"/>
             <w:tcBorders/>
             <w:tcMar>
               <w:start w:w="0" w:type="dxa"/>
@@ -6351,8 +6351,8 @@
               <w:autoSpaceDN w:val="0"/>
               <w:autoSpaceDE w:val="0"/>
               <w:widowControl/>
-              <w:spacing w:line="245" w:lineRule="auto" w:before="34" w:after="0"/>
-              <w:ind w:left="864" w:right="432" w:firstLine="0"/>
+              <w:spacing w:line="245" w:lineRule="auto" w:before="28" w:after="0"/>
+              <w:ind w:left="144" w:right="288" w:firstLine="0"/>
               <w:jc w:val="center"/>
             </w:pPr>
             <w:r>
@@ -6361,7 +6361,7 @@
                 <w:b/>
                 <w:i w:val="0"/>
                 <w:color w:val="FFFFFF"/>
-                <w:sz w:val="68"/>
+                <w:sz w:val="60"/>
               </w:rPr>
               <w:t xml:space="preserve">1 </w:t>
             </w:r>
@@ -6374,7 +6374,7 @@
                 <w:b/>
                 <w:i w:val="0"/>
                 <w:color w:val="EB8A3C"/>
-                <w:sz w:val="19"/>
+                <w:sz w:val="17"/>
               </w:rPr>
               <w:t>BAB</w:t>
             </w:r>
@@ -6384,9 +6384,9 @@
               <w:autoSpaceDN w:val="0"/>
               <w:autoSpaceDE w:val="0"/>
               <w:widowControl/>
-              <w:spacing w:line="233" w:lineRule="auto" w:before="18" w:after="0"/>
-              <w:ind w:left="0" w:right="360" w:firstLine="0"/>
-              <w:jc w:val="right"/>
+              <w:spacing w:line="233" w:lineRule="auto" w:before="2" w:after="0"/>
+              <w:ind w:left="212" w:right="0" w:firstLine="0"/>
+              <w:jc w:val="left"/>
             </w:pPr>
             <w:r>
               <w:rPr>
@@ -6394,7 +6394,7 @@
                 <w:b/>
                 <w:i/>
                 <w:color w:val="FEF08A"/>
-                <w:sz w:val="15"/>
+                <w:sz w:val="14"/>
               </w:rPr>
               <w:t>Chapter</w:t>
             </w:r>
@@ -6402,7 +6402,7 @@
         </w:tc>
         <w:tc>
           <w:tcPr>
-            <w:tcW w:type="dxa" w:w="7220"/>
+            <w:tcW w:type="dxa" w:w="7440"/>
             <w:tcBorders/>
             <w:tcMar>
               <w:start w:w="0" w:type="dxa"/>
@@ -6415,7 +6415,7 @@
               <w:autoSpaceDE w:val="0"/>
               <w:widowControl/>
               <w:spacing w:line="245" w:lineRule="auto" w:before="0" w:after="0"/>
-              <w:ind w:left="370" w:right="288" w:firstLine="0"/>
+              <w:ind w:left="332" w:right="864" w:firstLine="0"/>
               <w:jc w:val="left"/>
             </w:pPr>
             <w:r>
@@ -6424,7 +6424,7 @@
                 <w:b/>
                 <w:i w:val="0"/>
                 <w:color w:val="FFFFFF"/>
-                <w:sz w:val="32"/>
+                <w:sz w:val="30"/>
               </w:rPr>
               <w:t xml:space="preserve">WILAYAH ADMINISTRASI, DEMOGRAFI &amp; </w:t>
             </w:r>
@@ -6434,7 +6434,7 @@
                 <w:b/>
                 <w:i w:val="0"/>
                 <w:color w:val="FFFFFF"/>
-                <w:sz w:val="32"/>
+                <w:sz w:val="30"/>
               </w:rPr>
               <w:t>KAWASAN</w:t>
             </w:r>
@@ -6444,9 +6444,9 @@
               <w:autoSpaceDN w:val="0"/>
               <w:autoSpaceDE w:val="0"/>
               <w:widowControl/>
-              <w:spacing w:line="233" w:lineRule="auto" w:before="314" w:after="0"/>
-              <w:ind w:left="0" w:right="0" w:firstLine="0"/>
-              <w:jc w:val="center"/>
+              <w:spacing w:line="233" w:lineRule="auto" w:before="218" w:after="0"/>
+              <w:ind w:left="332" w:right="0" w:firstLine="0"/>
+              <w:jc w:val="left"/>
             </w:pPr>
             <w:r>
               <w:rPr>
@@ -6454,7 +6454,7 @@
                 <w:b/>
                 <w:i/>
                 <w:color w:val="FEF08A"/>
-                <w:sz w:val="24"/>
+                <w:sz w:val="22"/>
               </w:rPr>
               <w:t>ADMINISTRATIVE AREA, DEMOGRAPHICS &amp; REGION</w:t>
             </w:r>
@@ -6467,49 +6467,124 @@
         <w:autoSpaceDN w:val="0"/>
         <w:autoSpaceDE w:val="0"/>
         <w:widowControl/>
-        <w:spacing w:line="233" w:lineRule="auto" w:before="1068" w:after="0"/>
-        <w:ind w:left="1174" w:right="0" w:firstLine="0"/>
+        <w:spacing w:line="233" w:lineRule="auto" w:before="946" w:after="0"/>
+        <w:ind w:left="12" w:right="0" w:firstLine="0"/>
         <w:jc w:val="left"/>
       </w:pPr>
       <w:r>
         <w:rPr>
           <w:rFonts w:ascii="Liberation Sans" w:hAnsi="Liberation Sans" w:eastAsia="Liberation Sans"/>
-          <w:b w:val="0"/>
+          <w:b/>
           <w:i w:val="0"/>
-          <w:color w:val="334155"/>
-          <w:sz w:val="19"/>
+          <w:color w:val="0B3C5D"/>
+          <w:sz w:val="18"/>
         </w:rPr>
-        <w:t xml:space="preserve">Desa Pasir Palembang berstatus sebagai wilayah </w:t>
+        <w:t xml:space="preserve">RINGKASAN INDIKATOR BAB 1 / </w:t>
+      </w:r>
+      <w:r>
+        <w:rPr>
+          <w:rFonts w:ascii="Liberation Sans" w:hAnsi="Liberation Sans" w:eastAsia="Liberation Sans"/>
+          <w:b/>
+          <w:i/>
+          <w:color w:val="0B3C5D"/>
+          <w:sz w:val="18"/>
+        </w:rPr>
+        <w:t>CHAPTER 1 HIGHLIGHTS</w:t>
+      </w:r>
+    </w:p>
+    <w:p>
+      <w:pPr>
+        <w:autoSpaceDN w:val="0"/>
+        <w:tabs>
+          <w:tab w:pos="4800" w:val="left"/>
+        </w:tabs>
+        <w:autoSpaceDE w:val="0"/>
+        <w:widowControl/>
+        <w:spacing w:line="230" w:lineRule="auto" w:before="472" w:after="0"/>
+        <w:ind w:left="206" w:right="0" w:firstLine="0"/>
+        <w:jc w:val="left"/>
+      </w:pPr>
+      <w:r>
+        <w:rPr>
+          <w:rFonts w:ascii="Liberation Sans" w:hAnsi="Liberation Sans" w:eastAsia="Liberation Sans"/>
+          <w:b/>
+          <w:i w:val="0"/>
+          <w:color w:val="166534"/>
+          <w:sz w:val="15"/>
+        </w:rPr>
+        <w:t xml:space="preserve">STATUS WILAYAH / REGIONAL STATUS </w:t>
+      </w:r>
+      <w:r>
+        <w:tab/>
       </w:r>
       <w:r>
         <w:rPr>
           <w:rFonts w:ascii="Liberation Sans" w:hAnsi="Liberation Sans" w:eastAsia="Liberation Sans"/>
           <w:b/>
           <w:i w:val="0"/>
-          <w:color w:val="334155"/>
-          <w:sz w:val="19"/>
+          <w:color w:val="1E40AF"/>
+          <w:sz w:val="15"/>
         </w:rPr>
-        <w:t>Perdesaan</w:t>
+        <w:t>ADMINISTRASI RT / RW</w:t>
+      </w:r>
+    </w:p>
+    <w:p>
+      <w:pPr>
+        <w:autoSpaceDN w:val="0"/>
+        <w:tabs>
+          <w:tab w:pos="4800" w:val="left"/>
+        </w:tabs>
+        <w:autoSpaceDE w:val="0"/>
+        <w:widowControl/>
+        <w:spacing w:line="259" w:lineRule="auto" w:before="82" w:after="0"/>
+        <w:ind w:left="206" w:right="2880" w:firstLine="0"/>
+        <w:jc w:val="left"/>
+      </w:pPr>
+      <w:r>
+        <w:rPr>
+          <w:rFonts w:ascii="Liberation Sans" w:hAnsi="Liberation Sans" w:eastAsia="Liberation Sans"/>
+          <w:b/>
+          <w:i w:val="0"/>
+          <w:color w:val="15803D"/>
+          <w:sz w:val="24"/>
+        </w:rPr>
+        <w:t xml:space="preserve">Perdesaan </w:t>
+      </w:r>
+      <w:r>
+        <w:tab/>
+      </w:r>
+      <w:r>
+        <w:rPr>
+          <w:rFonts w:ascii="Liberation Sans" w:hAnsi="Liberation Sans" w:eastAsia="Liberation Sans"/>
+          <w:b/>
+          <w:i w:val="0"/>
+          <w:color w:val="1D4ED8"/>
+          <w:sz w:val="24"/>
+        </w:rPr>
+        <w:t xml:space="preserve">6 RW | 14 RT </w:t>
       </w:r>
       <w:r>
         <w:rPr>
           <w:rFonts w:ascii="Liberation Sans" w:hAnsi="Liberation Sans" w:eastAsia="Liberation Sans"/>
           <w:b w:val="0"/>
           <w:i w:val="0"/>
-          <w:color w:val="334155"/>
-          <w:sz w:val="19"/>
+          <w:color w:val="166534"/>
+          <w:sz w:val="14"/>
         </w:rPr>
-        <w:t xml:space="preserve"> dengan jumlah penduduk sebanyak </w:t>
+        <w:t xml:space="preserve">Kawasan Hutan: Di luar kawasan hutan </w:t>
+      </w:r>
+      <w:r>
+        <w:tab/>
       </w:r>
       <w:r>
         <w:rPr>
           <w:rFonts w:ascii="Liberation Sans" w:hAnsi="Liberation Sans" w:eastAsia="Liberation Sans"/>
-          <w:b/>
+          <w:b w:val="0"/>
           <w:i w:val="0"/>
-          <w:color w:val="334155"/>
-          <w:sz w:val="19"/>
+          <w:color w:val="1E40AF"/>
+          <w:sz w:val="14"/>
         </w:rPr>
-        <w:t>4.120</w:t>
+        <w:t>Wilayah Kerja Pembinaan Statis</w:t>
       </w:r>
     </w:p>
     <w:p>
@@ -6517,49 +6592,174 @@
         <w:autoSpaceDN w:val="0"/>
         <w:autoSpaceDE w:val="0"/>
         <w:widowControl/>
-        <w:spacing w:line="233" w:lineRule="auto" w:before="74" w:after="0"/>
-        <w:ind w:left="1174" w:right="0" w:firstLine="0"/>
-        <w:jc w:val="left"/>
+        <w:spacing w:line="290" w:lineRule="auto" w:before="456" w:after="0"/>
+        <w:ind w:left="12" w:right="674" w:firstLine="0"/>
+        <w:jc w:val="both"/>
       </w:pPr>
       <w:r>
         <w:rPr>
+          <w:w w:val="97.74999618530273"/>
+          <w:rFonts w:ascii="Liberation Sans" w:hAnsi="Liberation Sans" w:eastAsia="Liberation Sans"/>
+          <w:b w:val="0"/>
+          <w:i w:val="0"/>
+          <w:color w:val="334155"/>
+          <w:sz w:val="18"/>
+        </w:rPr>
+        <w:t xml:space="preserve">Desa Pasir Palembang berstatus sebagai wilayah </w:t>
+      </w:r>
+      <w:r>
+        <w:rPr>
+          <w:w w:val="97.74999618530273"/>
           <w:rFonts w:ascii="Liberation Sans" w:hAnsi="Liberation Sans" w:eastAsia="Liberation Sans"/>
           <w:b/>
           <w:i w:val="0"/>
           <w:color w:val="334155"/>
-          <w:sz w:val="19"/>
+          <w:sz w:val="18"/>
         </w:rPr>
-        <w:t>jiwa</w:t>
+        <w:t>Perdesaan</w:t>
       </w:r>
       <w:r>
         <w:rPr>
+          <w:w w:val="97.74999618530273"/>
           <w:rFonts w:ascii="Liberation Sans" w:hAnsi="Liberation Sans" w:eastAsia="Liberation Sans"/>
           <w:b w:val="0"/>
           <w:i w:val="0"/>
           <w:color w:val="334155"/>
-          <w:sz w:val="19"/>
+          <w:sz w:val="18"/>
         </w:rPr>
-        <w:t xml:space="preserve"> (2.092 laki-laki, 2.028 perempuan). Total keluarga tercatat sebanyak </w:t>
+        <w:t xml:space="preserve"> dengan lokasi kantor berada di </w:t>
       </w:r>
       <w:r>
         <w:rPr>
+          <w:w w:val="97.74999618530273"/>
           <w:rFonts w:ascii="Liberation Sans" w:hAnsi="Liberation Sans" w:eastAsia="Liberation Sans"/>
           <w:b/>
           <w:i w:val="0"/>
           <w:color w:val="334155"/>
-          <w:sz w:val="19"/>
+          <w:sz w:val="18"/>
+        </w:rPr>
+        <w:t xml:space="preserve">JALAN </w:t>
+      </w:r>
+      <w:r>
+        <w:rPr>
+          <w:w w:val="97.74999618530273"/>
+          <w:rFonts w:ascii="Liberation Sans" w:hAnsi="Liberation Sans" w:eastAsia="Liberation Sans"/>
+          <w:b/>
+          <w:i w:val="0"/>
+          <w:color w:val="334155"/>
+          <w:sz w:val="18"/>
+        </w:rPr>
+        <w:t>BARDANADI RT 002 RW 001 DUSUN PELAEK DESA PASIR PALEMBANG</w:t>
+      </w:r>
+      <w:r>
+        <w:rPr>
+          <w:w w:val="97.74999618530273"/>
+          <w:rFonts w:ascii="Liberation Sans" w:hAnsi="Liberation Sans" w:eastAsia="Liberation Sans"/>
+          <w:b w:val="0"/>
+          <w:i w:val="0"/>
+          <w:color w:val="334155"/>
+          <w:sz w:val="18"/>
+        </w:rPr>
+        <w:t xml:space="preserve">. Jumlah penduduk tercatat sebanyak </w:t>
+      </w:r>
+      <w:r>
+        <w:rPr>
+          <w:w w:val="97.74999618530273"/>
+          <w:rFonts w:ascii="Liberation Sans" w:hAnsi="Liberation Sans" w:eastAsia="Liberation Sans"/>
+          <w:b/>
+          <w:i w:val="0"/>
+          <w:color w:val="334155"/>
+          <w:sz w:val="18"/>
+        </w:rPr>
+        <w:t>4.120 jiwa</w:t>
+      </w:r>
+      <w:r>
+        <w:rPr>
+          <w:w w:val="97.74999618530273"/>
+          <w:rFonts w:ascii="Liberation Sans" w:hAnsi="Liberation Sans" w:eastAsia="Liberation Sans"/>
+          <w:b w:val="0"/>
+          <w:i w:val="0"/>
+          <w:color w:val="334155"/>
+          <w:sz w:val="18"/>
+        </w:rPr>
+        <w:t xml:space="preserve"> (2.092 laki-laki, 2.028 perempuan) dengan </w:t>
+      </w:r>
+      <w:r>
+        <w:rPr>
+          <w:w w:val="97.74999618530273"/>
+          <w:rFonts w:ascii="Liberation Sans" w:hAnsi="Liberation Sans" w:eastAsia="Liberation Sans"/>
+          <w:b w:val="0"/>
+          <w:i/>
+          <w:color w:val="334155"/>
+          <w:sz w:val="18"/>
+        </w:rPr>
+        <w:t>sex ratio</w:t>
+      </w:r>
+      <w:r>
+        <w:rPr>
+          <w:w w:val="97.74999618530273"/>
+          <w:rFonts w:ascii="Liberation Sans" w:hAnsi="Liberation Sans" w:eastAsia="Liberation Sans"/>
+          <w:b/>
+          <w:i w:val="0"/>
+          <w:color w:val="334155"/>
+          <w:sz w:val="18"/>
+        </w:rPr>
+        <w:t>103,16</w:t>
+      </w:r>
+      <w:r>
+        <w:rPr>
+          <w:w w:val="97.74999618530273"/>
+          <w:rFonts w:ascii="Liberation Sans" w:hAnsi="Liberation Sans" w:eastAsia="Liberation Sans"/>
+          <w:b w:val="0"/>
+          <w:i w:val="0"/>
+          <w:color w:val="334155"/>
+          <w:sz w:val="18"/>
+        </w:rPr>
+        <w:t xml:space="preserve">. Total keluarga sebanyak </w:t>
+      </w:r>
+      <w:r>
+        <w:rPr>
+          <w:w w:val="97.74999618530273"/>
+          <w:rFonts w:ascii="Liberation Sans" w:hAnsi="Liberation Sans" w:eastAsia="Liberation Sans"/>
+          <w:b/>
+          <w:i w:val="0"/>
+          <w:color w:val="334155"/>
+          <w:sz w:val="18"/>
         </w:rPr>
         <w:t>1.214 KK</w:t>
       </w:r>
       <w:r>
         <w:rPr>
+          <w:w w:val="97.74999618530273"/>
           <w:rFonts w:ascii="Liberation Sans" w:hAnsi="Liberation Sans" w:eastAsia="Liberation Sans"/>
           <w:b w:val="0"/>
           <w:i w:val="0"/>
           <w:color w:val="334155"/>
-          <w:sz w:val="19"/>
+          <w:sz w:val="18"/>
         </w:rPr>
-        <w:t xml:space="preserve"> dengan keluarga</w:t>
+        <w:t xml:space="preserve">, di mana </w:t>
+      </w:r>
+      <w:r>
+        <w:rPr>
+          <w:w w:val="97.74999618530273"/>
+          <w:rFonts w:ascii="Liberation Sans" w:hAnsi="Liberation Sans" w:eastAsia="Liberation Sans"/>
+          <w:b/>
+          <w:i w:val="0"/>
+          <w:color w:val="334155"/>
+          <w:sz w:val="18"/>
+        </w:rPr>
+        <w:t>815 KK (67.1%)</w:t>
+      </w:r>
+      <w:r>
+        <w:rPr>
+          <w:w w:val="97.74999618530273"/>
+          <w:rFonts w:ascii="Liberation Sans" w:hAnsi="Liberation Sans" w:eastAsia="Liberation Sans"/>
+          <w:b w:val="0"/>
+          <w:i w:val="0"/>
+          <w:color w:val="334155"/>
+          <w:sz w:val="18"/>
+        </w:rPr>
+        <w:t xml:space="preserve"> bergerak di sektor pertanian.</w:t>
       </w:r>
     </w:p>
     <w:p>
@@ -6567,48 +6767,8 @@
         <w:autoSpaceDN w:val="0"/>
         <w:autoSpaceDE w:val="0"/>
         <w:widowControl/>
-        <w:spacing w:line="233" w:lineRule="auto" w:before="72" w:after="0"/>
-        <w:ind w:left="1174" w:right="0" w:firstLine="0"/>
-        <w:jc w:val="left"/>
-      </w:pPr>
-      <w:r>
-        <w:rPr>
-          <w:rFonts w:ascii="Liberation Sans" w:hAnsi="Liberation Sans" w:eastAsia="Liberation Sans"/>
-          <w:b w:val="0"/>
-          <w:i w:val="0"/>
-          <w:color w:val="334155"/>
-          <w:sz w:val="19"/>
-        </w:rPr>
-        <w:t xml:space="preserve">pertanian sejumlah </w:t>
-      </w:r>
-      <w:r>
-        <w:rPr>
-          <w:rFonts w:ascii="Liberation Sans" w:hAnsi="Liberation Sans" w:eastAsia="Liberation Sans"/>
-          <w:b/>
-          <w:i w:val="0"/>
-          <w:color w:val="334155"/>
-          <w:sz w:val="19"/>
-        </w:rPr>
-        <w:t>815 KK (67.1%)</w:t>
-      </w:r>
-      <w:r>
-        <w:rPr>
-          <w:rFonts w:ascii="Liberation Sans" w:hAnsi="Liberation Sans" w:eastAsia="Liberation Sans"/>
-          <w:b w:val="0"/>
-          <w:i w:val="0"/>
-          <w:color w:val="334155"/>
-          <w:sz w:val="19"/>
-        </w:rPr>
-        <w:t>.</w:t>
-      </w:r>
-    </w:p>
-    <w:p>
-      <w:pPr>
-        <w:autoSpaceDN w:val="0"/>
-        <w:autoSpaceDE w:val="0"/>
-        <w:widowControl/>
-        <w:spacing w:line="233" w:lineRule="auto" w:before="5500" w:after="0"/>
-        <w:ind w:left="0" w:right="468" w:firstLine="0"/>
+        <w:spacing w:line="233" w:lineRule="auto" w:before="10018" w:after="0"/>
+        <w:ind w:left="0" w:right="20" w:firstLine="0"/>
         <w:jc w:val="right"/>
       </w:pPr>
       <w:r>
@@ -6626,7 +6786,7 @@
       <w:pPr>
         <w:sectPr>
           <w:pgSz w:w="11899" w:h="16838"/>
-          <w:pgMar w:top="1440" w:right="318" w:bottom="162" w:left="1440" w:header="720" w:footer="720" w:gutter="0"/>
+          <w:pgMar w:top="638" w:right="766" w:bottom="162" w:left="1440" w:header="720" w:footer="720" w:gutter="0"/>
           <w:cols/>
           <w:docGrid w:linePitch="360"/>
         </w:sectPr>
@@ -9319,7 +9479,7 @@
         <w:autoSpaceDN w:val="0"/>
         <w:autoSpaceDE w:val="0"/>
         <w:widowControl/>
-        <w:spacing w:line="220" w:lineRule="exact" w:before="0" w:after="6030"/>
+        <w:spacing w:line="220" w:lineRule="exact" w:before="0" w:after="416"/>
         <w:ind w:left="0" w:right="0"/>
       </w:pPr>
       <w:r>
@@ -9327,12 +9487,12 @@
           <wp:anchor xmlns:a="http://schemas.openxmlformats.org/drawingml/2006/main" xmlns:pic="http://schemas.openxmlformats.org/drawingml/2006/picture" distT="0" distB="0" distL="0" distR="0" simplePos="0" relativeHeight="0" behindDoc="1" locked="0" layoutInCell="1" allowOverlap="1">
             <wp:simplePos x="0" y="0"/>
             <wp:positionH relativeFrom="page">
-              <wp:posOffset>1244600</wp:posOffset>
+              <wp:posOffset>571500</wp:posOffset>
             </wp:positionH>
             <wp:positionV relativeFrom="page">
-              <wp:posOffset>4559300</wp:posOffset>
+              <wp:posOffset>520700</wp:posOffset>
             </wp:positionV>
-            <wp:extent cx="6311900" cy="2692400"/>
+            <wp:extent cx="6400800" cy="3784600"/>
             <wp:wrapNone/>
             <wp:docPr id="2" name="Picture 2"/>
             <wp:cNvGraphicFramePr>
@@ -9354,7 +9514,7 @@
                   <pic:spPr>
                     <a:xfrm>
                       <a:off x="0" y="0"/>
-                      <a:ext cx="6311900" cy="2692400"/>
+                      <a:ext cx="6400800" cy="3784600"/>
                     </a:xfrm>
                     <a:prstGeom prst="rect"/>
                   </pic:spPr>
@@ -9370,19 +9530,19 @@
         <w:tblW w:type="auto" w:w="0"/>
         <w:tblLayout w:type="fixed"/>
         <w:tblLook w:firstColumn="1" w:firstRow="1" w:lastColumn="0" w:lastRow="0" w:noHBand="0" w:noVBand="1" w:val="04A0"/>
-        <w:tblInd w:w="1124.0" w:type="dxa"/>
+        <w:tblInd w:w="504.00000000000006" w:type="dxa"/>
       </w:tblPr>
       <w:tblGrid>
-        <w:gridCol w:w="5392"/>
-        <w:gridCol w:w="5392"/>
+        <w:gridCol w:w="4840"/>
+        <w:gridCol w:w="4840"/>
       </w:tblGrid>
       <w:tr>
         <w:trPr>
-          <w:trHeight w:hRule="exact" w:val="1376"/>
+          <w:trHeight w:hRule="exact" w:val="1218"/>
         </w:trPr>
         <w:tc>
           <w:tcPr>
-            <w:tcW w:type="dxa" w:w="2080"/>
+            <w:tcW w:type="dxa" w:w="1380"/>
             <w:tcBorders/>
             <w:tcMar>
               <w:start w:w="0" w:type="dxa"/>
@@ -9394,8 +9554,8 @@
               <w:autoSpaceDN w:val="0"/>
               <w:autoSpaceDE w:val="0"/>
               <w:widowControl/>
-              <w:spacing w:line="245" w:lineRule="auto" w:before="20" w:after="0"/>
-              <w:ind w:left="1152" w:right="432" w:firstLine="0"/>
+              <w:spacing w:line="245" w:lineRule="auto" w:before="28" w:after="0"/>
+              <w:ind w:left="576" w:right="288" w:firstLine="0"/>
               <w:jc w:val="center"/>
             </w:pPr>
             <w:r>
@@ -9404,7 +9564,7 @@
                 <w:b/>
                 <w:i w:val="0"/>
                 <w:color w:val="FFFFFF"/>
-                <w:sz w:val="68"/>
+                <w:sz w:val="60"/>
               </w:rPr>
               <w:t xml:space="preserve">2 </w:t>
             </w:r>
@@ -9417,7 +9577,7 @@
                 <w:b/>
                 <w:i w:val="0"/>
                 <w:color w:val="EB8A3C"/>
-                <w:sz w:val="19"/>
+                <w:sz w:val="17"/>
               </w:rPr>
               <w:t>BAB</w:t>
             </w:r>
@@ -9427,8 +9587,8 @@
               <w:autoSpaceDN w:val="0"/>
               <w:autoSpaceDE w:val="0"/>
               <w:widowControl/>
-              <w:spacing w:line="233" w:lineRule="auto" w:before="34" w:after="0"/>
-              <w:ind w:left="0" w:right="360" w:firstLine="0"/>
+              <w:spacing w:line="233" w:lineRule="auto" w:before="2" w:after="0"/>
+              <w:ind w:left="0" w:right="320" w:firstLine="0"/>
               <w:jc w:val="right"/>
             </w:pPr>
             <w:r>
@@ -9437,7 +9597,7 @@
                 <w:b/>
                 <w:i/>
                 <w:color w:val="FEF08A"/>
-                <w:sz w:val="15"/>
+                <w:sz w:val="14"/>
               </w:rPr>
               <w:t>Chapter</w:t>
             </w:r>
@@ -9445,7 +9605,7 @@
         </w:tc>
         <w:tc>
           <w:tcPr>
-            <w:tcW w:type="dxa" w:w="7360"/>
+            <w:tcW w:type="dxa" w:w="7380"/>
             <w:tcBorders/>
             <w:tcMar>
               <w:start w:w="0" w:type="dxa"/>
@@ -9458,7 +9618,7 @@
               <w:autoSpaceDE w:val="0"/>
               <w:widowControl/>
               <w:spacing w:line="245" w:lineRule="auto" w:before="0" w:after="0"/>
-              <w:ind w:left="370" w:right="1440" w:firstLine="0"/>
+              <w:ind w:left="332" w:right="288" w:firstLine="0"/>
               <w:jc w:val="left"/>
             </w:pPr>
             <w:r>
@@ -9467,9 +9627,9 @@
                 <w:b/>
                 <w:i w:val="0"/>
                 <w:color w:val="FFFFFF"/>
-                <w:sz w:val="32"/>
+                <w:sz w:val="30"/>
               </w:rPr>
-              <w:t xml:space="preserve">ENERGI, UTILITAS PERUMAHAN &amp; </w:t>
+              <w:t xml:space="preserve">ENERGI, UTILITAS PERUMAHAN &amp; MITIGASI </w:t>
             </w:r>
             <w:r>
               <w:rPr>
@@ -9477,9 +9637,9 @@
                 <w:b/>
                 <w:i w:val="0"/>
                 <w:color w:val="FFFFFF"/>
-                <w:sz w:val="32"/>
+                <w:sz w:val="30"/>
               </w:rPr>
-              <w:t>MITIGASI BENCANA</w:t>
+              <w:t>BENCANA</w:t>
             </w:r>
           </w:p>
           <w:p>
@@ -9487,8 +9647,8 @@
               <w:autoSpaceDN w:val="0"/>
               <w:autoSpaceDE w:val="0"/>
               <w:widowControl/>
-              <w:spacing w:line="233" w:lineRule="auto" w:before="316" w:after="0"/>
-              <w:ind w:left="370" w:right="0" w:firstLine="0"/>
+              <w:spacing w:line="233" w:lineRule="auto" w:before="218" w:after="0"/>
+              <w:ind w:left="332" w:right="0" w:firstLine="0"/>
               <w:jc w:val="left"/>
             </w:pPr>
             <w:r>
@@ -9497,7 +9657,7 @@
                 <w:b/>
                 <w:i/>
                 <w:color w:val="FEF08A"/>
-                <w:sz w:val="24"/>
+                <w:sz w:val="22"/>
               </w:rPr>
               <w:t>ENERGY, HOUSING UTILITIES &amp; DISASTER MITIGATION</w:t>
             </w:r>
@@ -9510,39 +9670,127 @@
         <w:autoSpaceDN w:val="0"/>
         <w:autoSpaceDE w:val="0"/>
         <w:widowControl/>
-        <w:spacing w:line="233" w:lineRule="auto" w:before="1082" w:after="0"/>
-        <w:ind w:left="1818" w:right="0" w:firstLine="0"/>
+        <w:spacing w:line="233" w:lineRule="auto" w:before="946" w:after="0"/>
+        <w:ind w:left="656" w:right="0" w:firstLine="0"/>
         <w:jc w:val="left"/>
       </w:pPr>
       <w:r>
         <w:rPr>
           <w:rFonts w:ascii="Liberation Sans" w:hAnsi="Liberation Sans" w:eastAsia="Liberation Sans"/>
-          <w:b w:val="0"/>
+          <w:b/>
           <w:i w:val="0"/>
-          <w:color w:val="334155"/>
-          <w:sz w:val="19"/>
+          <w:color w:val="0B3C5D"/>
+          <w:sz w:val="18"/>
         </w:rPr>
-        <w:t xml:space="preserve">Penggunaan listrik PLN mencakup </w:t>
+        <w:t xml:space="preserve">RINGKASAN INDIKATOR BAB 2 / </w:t>
+      </w:r>
+      <w:r>
+        <w:rPr>
+          <w:rFonts w:ascii="Liberation Sans" w:hAnsi="Liberation Sans" w:eastAsia="Liberation Sans"/>
+          <w:b/>
+          <w:i/>
+          <w:color w:val="0B3C5D"/>
+          <w:sz w:val="18"/>
+        </w:rPr>
+        <w:t>CHAPTER 2 HIGHLIGHTS</w:t>
+      </w:r>
+    </w:p>
+    <w:p>
+      <w:pPr>
+        <w:autoSpaceDN w:val="0"/>
+        <w:tabs>
+          <w:tab w:pos="5444" w:val="left"/>
+        </w:tabs>
+        <w:autoSpaceDE w:val="0"/>
+        <w:widowControl/>
+        <w:spacing w:line="230" w:lineRule="auto" w:before="472" w:after="0"/>
+        <w:ind w:left="850" w:right="0" w:firstLine="0"/>
+        <w:jc w:val="left"/>
+      </w:pPr>
+      <w:r>
+        <w:rPr>
+          <w:rFonts w:ascii="Liberation Sans" w:hAnsi="Liberation Sans" w:eastAsia="Liberation Sans"/>
+          <w:b/>
+          <w:i w:val="0"/>
+          <w:color w:val="92400E"/>
+          <w:sz w:val="15"/>
+        </w:rPr>
+        <w:t xml:space="preserve">LISTRIK PLN / PLN ELECTRICITY </w:t>
+      </w:r>
+      <w:r>
+        <w:tab/>
       </w:r>
       <w:r>
         <w:rPr>
           <w:rFonts w:ascii="Liberation Sans" w:hAnsi="Liberation Sans" w:eastAsia="Liberation Sans"/>
           <w:b/>
           <w:i w:val="0"/>
-          <w:color w:val="334155"/>
-          <w:sz w:val="19"/>
+          <w:color w:val="115E59"/>
+          <w:sz w:val="15"/>
         </w:rPr>
-        <w:t>1.214 KK (100.0%)</w:t>
+        <w:t>AIR MINUM UTAMA / DRINKING WATER</w:t>
+      </w:r>
+    </w:p>
+    <w:p>
+      <w:pPr>
+        <w:autoSpaceDN w:val="0"/>
+        <w:tabs>
+          <w:tab w:pos="5444" w:val="left"/>
+        </w:tabs>
+        <w:autoSpaceDE w:val="0"/>
+        <w:widowControl/>
+        <w:spacing w:line="259" w:lineRule="auto" w:before="82" w:after="0"/>
+        <w:ind w:left="850" w:right="2304" w:firstLine="0"/>
+        <w:jc w:val="left"/>
+      </w:pPr>
+      <w:r>
+        <w:rPr>
+          <w:rFonts w:ascii="Liberation Sans" w:hAnsi="Liberation Sans" w:eastAsia="Liberation Sans"/>
+          <w:b/>
+          <w:i w:val="0"/>
+          <w:color w:val="B45309"/>
+          <w:sz w:val="24"/>
+        </w:rPr>
+        <w:t xml:space="preserve">1.214 KK </w:t>
+      </w:r>
+      <w:r>
+        <w:tab/>
+      </w:r>
+      <w:r>
+        <w:rPr>
+          <w:rFonts w:ascii="Liberation Sans" w:hAnsi="Liberation Sans" w:eastAsia="Liberation Sans"/>
+          <w:b/>
+          <w:i w:val="0"/>
+          <w:color w:val="0F766E"/>
+          <w:sz w:val="24"/>
+        </w:rPr>
+        <w:t xml:space="preserve">Air hujan </w:t>
+      </w:r>
+      <w:r>
+        <w:br/>
       </w:r>
       <w:r>
         <w:rPr>
           <w:rFonts w:ascii="Liberation Sans" w:hAnsi="Liberation Sans" w:eastAsia="Liberation Sans"/>
           <w:b w:val="0"/>
           <w:i w:val="0"/>
-          <w:color w:val="334155"/>
-          <w:sz w:val="19"/>
+          <w:color w:val="78350F"/>
+          <w:sz w:val="14"/>
         </w:rPr>
-        <w:t>. Sebagian besar keluarga menggunakan air</w:t>
+        <w:t xml:space="preserve">100.0% Pelanggan Listrik PLN </w:t>
+      </w:r>
+      <w:r>
+        <w:tab/>
+      </w:r>
+      <w:r>
+        <w:rPr>
+          <w:rFonts w:ascii="Liberation Sans" w:hAnsi="Liberation Sans" w:eastAsia="Liberation Sans"/>
+          <w:b w:val="0"/>
+          <w:i w:val="0"/>
+          <w:color w:val="134E4A"/>
+          <w:sz w:val="14"/>
+        </w:rPr>
+        <w:t>Sumber Air Utama Masyarakat</w:t>
       </w:r>
     </w:p>
     <w:p>
@@ -9550,57 +9798,139 @@
         <w:autoSpaceDN w:val="0"/>
         <w:autoSpaceDE w:val="0"/>
         <w:widowControl/>
-        <w:spacing w:line="233" w:lineRule="auto" w:before="74" w:after="0"/>
-        <w:ind w:left="1818" w:right="0" w:firstLine="0"/>
-        <w:jc w:val="left"/>
+        <w:spacing w:line="290" w:lineRule="auto" w:before="456" w:after="0"/>
+        <w:ind w:left="656" w:right="20" w:firstLine="0"/>
+        <w:jc w:val="both"/>
       </w:pPr>
       <w:r>
         <w:rPr>
+          <w:w w:val="97.74999618530273"/>
           <w:rFonts w:ascii="Liberation Sans" w:hAnsi="Liberation Sans" w:eastAsia="Liberation Sans"/>
           <w:b w:val="0"/>
           <w:i w:val="0"/>
           <w:color w:val="334155"/>
-          <w:sz w:val="19"/>
+          <w:sz w:val="18"/>
         </w:rPr>
-        <w:t xml:space="preserve">minum berjenis </w:t>
+        <w:t xml:space="preserve">Penggunaan daya listrik PLN mencakup </w:t>
       </w:r>
       <w:r>
         <w:rPr>
+          <w:w w:val="97.74999618530273"/>
           <w:rFonts w:ascii="Liberation Sans" w:hAnsi="Liberation Sans" w:eastAsia="Liberation Sans"/>
           <w:b/>
           <w:i w:val="0"/>
           <w:color w:val="334155"/>
-          <w:sz w:val="19"/>
+          <w:sz w:val="18"/>
+        </w:rPr>
+        <w:t>1.214 KK (100.0%)</w:t>
+      </w:r>
+      <w:r>
+        <w:rPr>
+          <w:w w:val="97.74999618530273"/>
+          <w:rFonts w:ascii="Liberation Sans" w:hAnsi="Liberation Sans" w:eastAsia="Liberation Sans"/>
+          <w:b w:val="0"/>
+          <w:i w:val="0"/>
+          <w:color w:val="334155"/>
+          <w:sz w:val="18"/>
+        </w:rPr>
+        <w:t xml:space="preserve">. Sebagian besar keluarga memanfaatkan air minum </w:t>
+      </w:r>
+      <w:r>
+        <w:rPr>
+          <w:w w:val="97.74999618530273"/>
+          <w:rFonts w:ascii="Liberation Sans" w:hAnsi="Liberation Sans" w:eastAsia="Liberation Sans"/>
+          <w:b w:val="0"/>
+          <w:i w:val="0"/>
+          <w:color w:val="334155"/>
+          <w:sz w:val="18"/>
+        </w:rPr>
+        <w:t xml:space="preserve">utama berjenis </w:t>
+      </w:r>
+      <w:r>
+        <w:rPr>
+          <w:w w:val="97.74999618530273"/>
+          <w:rFonts w:ascii="Liberation Sans" w:hAnsi="Liberation Sans" w:eastAsia="Liberation Sans"/>
+          <w:b/>
+          <w:i w:val="0"/>
+          <w:color w:val="334155"/>
+          <w:sz w:val="18"/>
         </w:rPr>
         <w:t>Air hujan</w:t>
       </w:r>
       <w:r>
         <w:rPr>
+          <w:w w:val="97.74999618530273"/>
           <w:rFonts w:ascii="Liberation Sans" w:hAnsi="Liberation Sans" w:eastAsia="Liberation Sans"/>
           <w:b w:val="0"/>
           <w:i w:val="0"/>
           <w:color w:val="334155"/>
-          <w:sz w:val="19"/>
+          <w:sz w:val="18"/>
         </w:rPr>
-        <w:t xml:space="preserve"> dan memasak dengan </w:t>
+        <w:t xml:space="preserve"> dan bahan bakar utama memasak berjenis </w:t>
       </w:r>
       <w:r>
         <w:rPr>
+          <w:w w:val="97.74999618530273"/>
           <w:rFonts w:ascii="Liberation Sans" w:hAnsi="Liberation Sans" w:eastAsia="Liberation Sans"/>
           <w:b/>
           <w:i w:val="0"/>
           <w:color w:val="334155"/>
-          <w:sz w:val="19"/>
+          <w:sz w:val="18"/>
         </w:rPr>
         <w:t>Elpiji 3 kg</w:t>
       </w:r>
       <w:r>
         <w:rPr>
+          <w:w w:val="97.74999618530273"/>
           <w:rFonts w:ascii="Liberation Sans" w:hAnsi="Liberation Sans" w:eastAsia="Liberation Sans"/>
           <w:b w:val="0"/>
           <w:i w:val="0"/>
           <w:color w:val="334155"/>
-          <w:sz w:val="19"/>
+          <w:sz w:val="18"/>
+        </w:rPr>
+        <w:t xml:space="preserve">. Keberadaan upaya mitigasi </w:t>
+      </w:r>
+      <w:r>
+        <w:rPr>
+          <w:w w:val="97.74999618530273"/>
+          <w:rFonts w:ascii="Liberation Sans" w:hAnsi="Liberation Sans" w:eastAsia="Liberation Sans"/>
+          <w:b w:val="0"/>
+          <w:i w:val="0"/>
+          <w:color w:val="334155"/>
+          <w:sz w:val="18"/>
+        </w:rPr>
+        <w:t xml:space="preserve">bencana tercatat </w:t>
+      </w:r>
+      <w:r>
+        <w:rPr>
+          <w:w w:val="97.74999618530273"/>
+          <w:rFonts w:ascii="Liberation Sans" w:hAnsi="Liberation Sans" w:eastAsia="Liberation Sans"/>
+          <w:b/>
+          <w:i w:val="0"/>
+          <w:color w:val="334155"/>
+          <w:sz w:val="18"/>
+        </w:rPr>
+        <w:t xml:space="preserve">"Pembuatan, perawatan, atau normalisasi: sungai, kanal, tanggul, parit, drainase, waduk, </w:t>
+      </w:r>
+      <w:r>
+        <w:rPr>
+          <w:w w:val="97.74999618530273"/>
+          <w:rFonts w:ascii="Liberation Sans" w:hAnsi="Liberation Sans" w:eastAsia="Liberation Sans"/>
+          <w:b/>
+          <w:i w:val="0"/>
+          <w:color w:val="334155"/>
+          <w:sz w:val="18"/>
+        </w:rPr>
+        <w:t>pantai, dll selama setahun terakhir"</w:t>
+      </w:r>
+      <w:r>
+        <w:rPr>
+          <w:w w:val="97.74999618530273"/>
+          <w:rFonts w:ascii="Liberation Sans" w:hAnsi="Liberation Sans" w:eastAsia="Liberation Sans"/>
+          <w:b w:val="0"/>
+          <w:i w:val="0"/>
+          <w:color w:val="334155"/>
+          <w:sz w:val="18"/>
         </w:rPr>
         <w:t>.</w:t>
       </w:r>
@@ -9610,7 +9940,7 @@
         <w:autoSpaceDN w:val="0"/>
         <w:autoSpaceDE w:val="0"/>
         <w:widowControl/>
-        <w:spacing w:line="233" w:lineRule="auto" w:before="5634" w:after="0"/>
+        <w:spacing w:line="233" w:lineRule="auto" w:before="10018" w:after="0"/>
         <w:ind w:left="0" w:right="0" w:firstLine="0"/>
         <w:jc w:val="left"/>
       </w:pPr>
@@ -9629,7 +9959,7 @@
       <w:pPr>
         <w:sectPr>
           <w:pgSz w:w="11899" w:h="16838"/>
-          <w:pgMar w:top="1440" w:right="318" w:bottom="162" w:left="796" w:header="720" w:footer="720" w:gutter="0"/>
+          <w:pgMar w:top="638" w:right="1422" w:bottom="162" w:left="796" w:header="720" w:footer="720" w:gutter="0"/>
           <w:cols/>
           <w:docGrid w:linePitch="360"/>
         </w:sectPr>
@@ -11734,7 +12064,7 @@
         <w:autoSpaceDN w:val="0"/>
         <w:autoSpaceDE w:val="0"/>
         <w:widowControl/>
-        <w:spacing w:line="220" w:lineRule="exact" w:before="0" w:after="6030"/>
+        <w:spacing w:line="220" w:lineRule="exact" w:before="0" w:after="424"/>
         <w:ind w:left="0" w:right="0"/>
       </w:pPr>
       <w:r>
@@ -11742,12 +12072,12 @@
           <wp:anchor xmlns:a="http://schemas.openxmlformats.org/drawingml/2006/main" xmlns:pic="http://schemas.openxmlformats.org/drawingml/2006/picture" distT="0" distB="0" distL="0" distR="0" simplePos="0" relativeHeight="0" behindDoc="1" locked="0" layoutInCell="1" allowOverlap="1">
             <wp:simplePos x="0" y="0"/>
             <wp:positionH relativeFrom="page">
-              <wp:posOffset>1244600</wp:posOffset>
+              <wp:posOffset>571500</wp:posOffset>
             </wp:positionH>
             <wp:positionV relativeFrom="page">
-              <wp:posOffset>4559300</wp:posOffset>
+              <wp:posOffset>520700</wp:posOffset>
             </wp:positionV>
-            <wp:extent cx="6311900" cy="2692400"/>
+            <wp:extent cx="6400800" cy="3594100"/>
             <wp:wrapNone/>
             <wp:docPr id="3" name="Picture 3"/>
             <wp:cNvGraphicFramePr>
@@ -11769,7 +12099,7 @@
                   <pic:spPr>
                     <a:xfrm>
                       <a:off x="0" y="0"/>
-                      <a:ext cx="6311900" cy="2692400"/>
+                      <a:ext cx="6400800" cy="3594100"/>
                     </a:xfrm>
                     <a:prstGeom prst="rect"/>
                   </pic:spPr>
@@ -11785,19 +12115,19 @@
         <w:tblW w:type="auto" w:w="0"/>
         <w:tblLayout w:type="fixed"/>
         <w:tblLook w:firstColumn="1" w:firstRow="1" w:lastColumn="0" w:lastRow="0" w:noHBand="0" w:noVBand="1" w:val="04A0"/>
-        <w:tblInd w:w="800.0" w:type="dxa"/>
+        <w:tblInd w:w="180.0" w:type="dxa"/>
       </w:tblPr>
       <w:tblGrid>
-        <w:gridCol w:w="5070"/>
-        <w:gridCol w:w="5070"/>
+        <w:gridCol w:w="4846"/>
+        <w:gridCol w:w="4846"/>
       </w:tblGrid>
       <w:tr>
         <w:trPr>
-          <w:trHeight w:hRule="exact" w:val="1376"/>
+          <w:trHeight w:hRule="exact" w:val="1054"/>
         </w:trPr>
         <w:tc>
           <w:tcPr>
-            <w:tcW w:type="dxa" w:w="1760"/>
+            <w:tcW w:type="dxa" w:w="1060"/>
             <w:tcBorders/>
             <w:tcMar>
               <w:start w:w="0" w:type="dxa"/>
@@ -11809,8 +12139,8 @@
               <w:autoSpaceDN w:val="0"/>
               <w:autoSpaceDE w:val="0"/>
               <w:widowControl/>
-              <w:spacing w:line="245" w:lineRule="auto" w:before="20" w:after="0"/>
-              <w:ind w:left="864" w:right="432" w:firstLine="0"/>
+              <w:spacing w:line="245" w:lineRule="auto" w:before="0" w:after="0"/>
+              <w:ind w:left="144" w:right="288" w:firstLine="0"/>
               <w:jc w:val="center"/>
             </w:pPr>
             <w:r>
@@ -11819,7 +12149,7 @@
                 <w:b/>
                 <w:i w:val="0"/>
                 <w:color w:val="FFFFFF"/>
-                <w:sz w:val="68"/>
+                <w:sz w:val="60"/>
               </w:rPr>
               <w:t xml:space="preserve">3 </w:t>
             </w:r>
@@ -11832,7 +12162,7 @@
                 <w:b/>
                 <w:i w:val="0"/>
                 <w:color w:val="EB8A3C"/>
-                <w:sz w:val="19"/>
+                <w:sz w:val="17"/>
               </w:rPr>
               <w:t>BAB</w:t>
             </w:r>
@@ -11842,9 +12172,9 @@
               <w:autoSpaceDN w:val="0"/>
               <w:autoSpaceDE w:val="0"/>
               <w:widowControl/>
-              <w:spacing w:line="233" w:lineRule="auto" w:before="34" w:after="0"/>
-              <w:ind w:left="0" w:right="360" w:firstLine="0"/>
-              <w:jc w:val="right"/>
+              <w:spacing w:line="233" w:lineRule="auto" w:before="18" w:after="0"/>
+              <w:ind w:left="212" w:right="0" w:firstLine="0"/>
+              <w:jc w:val="left"/>
             </w:pPr>
             <w:r>
               <w:rPr>
@@ -11852,7 +12182,7 @@
                 <w:b/>
                 <w:i/>
                 <w:color w:val="FEF08A"/>
-                <w:sz w:val="15"/>
+                <w:sz w:val="14"/>
               </w:rPr>
               <w:t>Chapter</w:t>
             </w:r>
@@ -11860,7 +12190,7 @@
         </w:tc>
         <w:tc>
           <w:tcPr>
-            <w:tcW w:type="dxa" w:w="6780"/>
+            <w:tcW w:type="dxa" w:w="8060"/>
             <w:tcBorders/>
             <w:tcMar>
               <w:start w:w="0" w:type="dxa"/>
@@ -11872,8 +12202,8 @@
               <w:autoSpaceDN w:val="0"/>
               <w:autoSpaceDE w:val="0"/>
               <w:widowControl/>
-              <w:spacing w:line="245" w:lineRule="auto" w:before="0" w:after="0"/>
-              <w:ind w:left="370" w:right="720" w:firstLine="0"/>
+              <w:spacing w:line="319" w:lineRule="auto" w:before="152" w:after="0"/>
+              <w:ind w:left="332" w:right="288" w:firstLine="0"/>
               <w:jc w:val="left"/>
             </w:pPr>
             <w:r>
@@ -11882,37 +12212,17 @@
                 <w:b/>
                 <w:i w:val="0"/>
                 <w:color w:val="FFFFFF"/>
-                <w:sz w:val="32"/>
+                <w:sz w:val="30"/>
               </w:rPr>
-              <w:t xml:space="preserve">FASILITAS SOSIAL (PENDIDIKAN &amp; </w:t>
+              <w:t xml:space="preserve">FASILITAS SOSIAL (PENDIDIKAN &amp; KESEHATAN) </w:t>
             </w:r>
-            <w:r>
-              <w:rPr>
-                <w:rFonts w:ascii="Liberation Sans" w:hAnsi="Liberation Sans" w:eastAsia="Liberation Sans"/>
-                <w:b/>
-                <w:i w:val="0"/>
-                <w:color w:val="FFFFFF"/>
-                <w:sz w:val="32"/>
-              </w:rPr>
-              <w:t>KESEHATAN)</w:t>
-            </w:r>
-          </w:p>
-          <w:p>
-            <w:pPr>
-              <w:autoSpaceDN w:val="0"/>
-              <w:autoSpaceDE w:val="0"/>
-              <w:widowControl/>
-              <w:spacing w:line="233" w:lineRule="auto" w:before="316" w:after="0"/>
-              <w:ind w:left="370" w:right="0" w:firstLine="0"/>
-              <w:jc w:val="left"/>
-            </w:pPr>
             <w:r>
               <w:rPr>
                 <w:rFonts w:ascii="Liberation Sans" w:hAnsi="Liberation Sans" w:eastAsia="Liberation Sans"/>
                 <w:b/>
                 <w:i/>
                 <w:color w:val="FEF08A"/>
-                <w:sz w:val="24"/>
+                <w:sz w:val="22"/>
               </w:rPr>
               <w:t>SOCIAL FACILITIES (EDUCATION &amp; HEALTH)</w:t>
             </w:r>
@@ -11925,8 +12235,113 @@
         <w:autoSpaceDN w:val="0"/>
         <w:autoSpaceDE w:val="0"/>
         <w:widowControl/>
-        <w:spacing w:line="233" w:lineRule="auto" w:before="1082" w:after="0"/>
-        <w:ind w:left="1174" w:right="0" w:firstLine="0"/>
+        <w:spacing w:line="235" w:lineRule="auto" w:before="1082" w:after="0"/>
+        <w:ind w:left="12" w:right="0" w:firstLine="0"/>
+        <w:jc w:val="left"/>
+      </w:pPr>
+      <w:r>
+        <w:rPr>
+          <w:rFonts w:ascii="Liberation Sans" w:hAnsi="Liberation Sans" w:eastAsia="Liberation Sans"/>
+          <w:b/>
+          <w:i w:val="0"/>
+          <w:color w:val="0B3C5D"/>
+          <w:sz w:val="18"/>
+        </w:rPr>
+        <w:t xml:space="preserve">RINGKASAN INDIKATOR BAB 3 / </w:t>
+      </w:r>
+      <w:r>
+        <w:rPr>
+          <w:rFonts w:ascii="Liberation Sans" w:hAnsi="Liberation Sans" w:eastAsia="Liberation Sans"/>
+          <w:b/>
+          <w:i/>
+          <w:color w:val="0B3C5D"/>
+          <w:sz w:val="18"/>
+        </w:rPr>
+        <w:t>CHAPTER 3 HIGHLIGHTS</w:t>
+      </w:r>
+    </w:p>
+    <w:p>
+      <w:pPr>
+        <w:autoSpaceDN w:val="0"/>
+        <w:tabs>
+          <w:tab w:pos="4800" w:val="left"/>
+        </w:tabs>
+        <w:autoSpaceDE w:val="0"/>
+        <w:widowControl/>
+        <w:spacing w:line="230" w:lineRule="auto" w:before="456" w:after="0"/>
+        <w:ind w:left="206" w:right="0" w:firstLine="0"/>
+        <w:jc w:val="left"/>
+      </w:pPr>
+      <w:r>
+        <w:rPr>
+          <w:rFonts w:ascii="Liberation Sans" w:hAnsi="Liberation Sans" w:eastAsia="Liberation Sans"/>
+          <w:b/>
+          <w:i w:val="0"/>
+          <w:color w:val="9D174D"/>
+          <w:sz w:val="15"/>
+        </w:rPr>
+        <w:t xml:space="preserve">POSYANDU AKTIF / ACTIVE POSYANDU </w:t>
+      </w:r>
+      <w:r>
+        <w:tab/>
+      </w:r>
+      <w:r>
+        <w:rPr>
+          <w:rFonts w:ascii="Liberation Sans" w:hAnsi="Liberation Sans" w:eastAsia="Liberation Sans"/>
+          <w:b/>
+          <w:i w:val="0"/>
+          <w:color w:val="6B21A8"/>
+          <w:sz w:val="15"/>
+        </w:rPr>
+        <w:t>POSBINDU / POSBINDU UNITS</w:t>
+      </w:r>
+    </w:p>
+    <w:p>
+      <w:pPr>
+        <w:autoSpaceDN w:val="0"/>
+        <w:tabs>
+          <w:tab w:pos="4800" w:val="left"/>
+        </w:tabs>
+        <w:autoSpaceDE w:val="0"/>
+        <w:widowControl/>
+        <w:spacing w:line="233" w:lineRule="auto" w:before="82" w:after="0"/>
+        <w:ind w:left="206" w:right="0" w:firstLine="0"/>
+        <w:jc w:val="left"/>
+      </w:pPr>
+      <w:r>
+        <w:rPr>
+          <w:rFonts w:ascii="Liberation Sans" w:hAnsi="Liberation Sans" w:eastAsia="Liberation Sans"/>
+          <w:b/>
+          <w:i w:val="0"/>
+          <w:color w:val="BE185D"/>
+          <w:sz w:val="24"/>
+        </w:rPr>
+        <w:t xml:space="preserve">4 Unit </w:t>
+      </w:r>
+      <w:r>
+        <w:tab/>
+      </w:r>
+      <w:r>
+        <w:rPr>
+          <w:rFonts w:ascii="Liberation Sans" w:hAnsi="Liberation Sans" w:eastAsia="Liberation Sans"/>
+          <w:b/>
+          <w:i w:val="0"/>
+          <w:color w:val="7E22CE"/>
+          <w:sz w:val="24"/>
+        </w:rPr>
+        <w:t>1 Unit</w:t>
+      </w:r>
+    </w:p>
+    <w:p>
+      <w:pPr>
+        <w:autoSpaceDN w:val="0"/>
+        <w:tabs>
+          <w:tab w:pos="4800" w:val="left"/>
+        </w:tabs>
+        <w:autoSpaceDE w:val="0"/>
+        <w:widowControl/>
+        <w:spacing w:line="233" w:lineRule="auto" w:before="62" w:after="0"/>
+        <w:ind w:left="206" w:right="0" w:firstLine="0"/>
         <w:jc w:val="left"/>
       </w:pPr>
       <w:r>
@@ -11934,20 +12349,66 @@
           <w:rFonts w:ascii="Liberation Sans" w:hAnsi="Liberation Sans" w:eastAsia="Liberation Sans"/>
           <w:b w:val="0"/>
           <w:i w:val="0"/>
-          <w:color w:val="334155"/>
-          <w:sz w:val="19"/>
+          <w:color w:val="9D174D"/>
+          <w:sz w:val="14"/>
         </w:rPr>
-        <w:t xml:space="preserve">Ketersediaan sarana pendidikan formal/keagamaan dan pelayanan kesehatan meliputi </w:t>
+        <w:t xml:space="preserve">Pemeriksaan Kesehatan Bulanan </w:t>
+      </w:r>
+      <w:r>
+        <w:tab/>
       </w:r>
       <w:r>
         <w:rPr>
           <w:rFonts w:ascii="Liberation Sans" w:hAnsi="Liberation Sans" w:eastAsia="Liberation Sans"/>
+          <w:b w:val="0"/>
+          <w:i w:val="0"/>
+          <w:color w:val="581C87"/>
+          <w:sz w:val="14"/>
+        </w:rPr>
+        <w:t>Pos Pembinaan Terpadu Lansia</w:t>
+      </w:r>
+    </w:p>
+    <w:p>
+      <w:pPr>
+        <w:autoSpaceDN w:val="0"/>
+        <w:autoSpaceDE w:val="0"/>
+        <w:widowControl/>
+        <w:spacing w:line="233" w:lineRule="auto" w:before="442" w:after="0"/>
+        <w:ind w:left="12" w:right="0" w:firstLine="0"/>
+        <w:jc w:val="left"/>
+      </w:pPr>
+      <w:r>
+        <w:rPr>
+          <w:w w:val="97.74999618530273"/>
+          <w:rFonts w:ascii="Liberation Sans" w:hAnsi="Liberation Sans" w:eastAsia="Liberation Sans"/>
+          <w:b w:val="0"/>
+          <w:i w:val="0"/>
+          <w:color w:val="334155"/>
+          <w:sz w:val="18"/>
+        </w:rPr>
+        <w:t xml:space="preserve">Pelayanan kesehatan masyarakat berbasis komunitas didukung oleh keberadaan </w:t>
+      </w:r>
+      <w:r>
+        <w:rPr>
+          <w:w w:val="97.74999618530273"/>
+          <w:rFonts w:ascii="Liberation Sans" w:hAnsi="Liberation Sans" w:eastAsia="Liberation Sans"/>
           <w:b/>
           <w:i w:val="0"/>
           <w:color w:val="334155"/>
-          <w:sz w:val="19"/>
+          <w:sz w:val="18"/>
         </w:rPr>
         <w:t>4 Posyandu aktif</w:t>
+      </w:r>
+      <w:r>
+        <w:rPr>
+          <w:w w:val="97.74999618530273"/>
+          <w:rFonts w:ascii="Liberation Sans" w:hAnsi="Liberation Sans" w:eastAsia="Liberation Sans"/>
+          <w:b w:val="0"/>
+          <w:i w:val="0"/>
+          <w:color w:val="334155"/>
+          <w:sz w:val="18"/>
+        </w:rPr>
+        <w:t xml:space="preserve"> yang rutin</w:t>
       </w:r>
     </w:p>
     <w:p>
@@ -11956,36 +12417,82 @@
         <w:autoSpaceDE w:val="0"/>
         <w:widowControl/>
         <w:spacing w:line="233" w:lineRule="auto" w:before="74" w:after="0"/>
-        <w:ind w:left="1174" w:right="0" w:firstLine="0"/>
+        <w:ind w:left="12" w:right="0" w:firstLine="0"/>
         <w:jc w:val="left"/>
       </w:pPr>
       <w:r>
         <w:rPr>
+          <w:w w:val="97.74999618530273"/>
           <w:rFonts w:ascii="Liberation Sans" w:hAnsi="Liberation Sans" w:eastAsia="Liberation Sans"/>
           <w:b w:val="0"/>
           <w:i w:val="0"/>
           <w:color w:val="334155"/>
-          <w:sz w:val="19"/>
+          <w:sz w:val="18"/>
         </w:rPr>
-        <w:t xml:space="preserve">dan </w:t>
+        <w:t xml:space="preserve">menyelenggarakan pelayanan bulanan dan </w:t>
       </w:r>
       <w:r>
         <w:rPr>
+          <w:w w:val="97.74999618530273"/>
           <w:rFonts w:ascii="Liberation Sans" w:hAnsi="Liberation Sans" w:eastAsia="Liberation Sans"/>
           <w:b/>
           <w:i w:val="0"/>
           <w:color w:val="334155"/>
-          <w:sz w:val="19"/>
+          <w:sz w:val="18"/>
         </w:rPr>
         <w:t>1 Posbindu</w:t>
       </w:r>
       <w:r>
         <w:rPr>
+          <w:w w:val="97.74999618530273"/>
           <w:rFonts w:ascii="Liberation Sans" w:hAnsi="Liberation Sans" w:eastAsia="Liberation Sans"/>
           <w:b w:val="0"/>
           <w:i w:val="0"/>
           <w:color w:val="334155"/>
-          <w:sz w:val="19"/>
+          <w:sz w:val="18"/>
+        </w:rPr>
+        <w:t>. Fasilitas pendidikan formal &amp; keagamaan yang tersedia</w:t>
+      </w:r>
+    </w:p>
+    <w:p>
+      <w:pPr>
+        <w:autoSpaceDN w:val="0"/>
+        <w:autoSpaceDE w:val="0"/>
+        <w:widowControl/>
+        <w:spacing w:line="235" w:lineRule="auto" w:before="58" w:after="0"/>
+        <w:ind w:left="12" w:right="0" w:firstLine="0"/>
+        <w:jc w:val="left"/>
+      </w:pPr>
+      <w:r>
+        <w:rPr>
+          <w:w w:val="97.74999618530273"/>
+          <w:rFonts w:ascii="Liberation Sans" w:hAnsi="Liberation Sans" w:eastAsia="Liberation Sans"/>
+          <w:b w:val="0"/>
+          <w:i w:val="0"/>
+          <w:color w:val="334155"/>
+          <w:sz w:val="18"/>
+        </w:rPr>
+        <w:t xml:space="preserve">meliputi </w:t>
+      </w:r>
+      <w:r>
+        <w:rPr>
+          <w:w w:val="97.74999618530273"/>
+          <w:rFonts w:ascii="Liberation Sans" w:hAnsi="Liberation Sans" w:eastAsia="Liberation Sans"/>
+          <w:b/>
+          <w:i w:val="0"/>
+          <w:color w:val="334155"/>
+          <w:sz w:val="18"/>
+        </w:rPr>
+        <w:t>TK Swasta (1), SD Negeri (3), MI Swasta (5), SMP Swasta (1)</w:t>
+      </w:r>
+      <w:r>
+        <w:rPr>
+          <w:w w:val="97.74999618530273"/>
+          <w:rFonts w:ascii="Liberation Sans" w:hAnsi="Liberation Sans" w:eastAsia="Liberation Sans"/>
+          <w:b w:val="0"/>
+          <w:i w:val="0"/>
+          <w:color w:val="334155"/>
+          <w:sz w:val="18"/>
         </w:rPr>
         <w:t>.</w:t>
       </w:r>
@@ -11995,8 +12502,8 @@
         <w:autoSpaceDN w:val="0"/>
         <w:autoSpaceDE w:val="0"/>
         <w:widowControl/>
-        <w:spacing w:line="233" w:lineRule="auto" w:before="5634" w:after="0"/>
-        <w:ind w:left="0" w:right="468" w:firstLine="0"/>
+        <w:spacing w:line="233" w:lineRule="auto" w:before="10302" w:after="0"/>
+        <w:ind w:left="0" w:right="20" w:firstLine="0"/>
         <w:jc w:val="right"/>
       </w:pPr>
       <w:r>
@@ -12014,7 +12521,7 @@
       <w:pPr>
         <w:sectPr>
           <w:pgSz w:w="11899" w:h="16838"/>
-          <w:pgMar w:top="1440" w:right="318" w:bottom="162" w:left="1440" w:header="720" w:footer="720" w:gutter="0"/>
+          <w:pgMar w:top="642" w:right="766" w:bottom="162" w:left="1440" w:header="720" w:footer="720" w:gutter="0"/>
           <w:cols/>
           <w:docGrid w:linePitch="360"/>
         </w:sectPr>
@@ -13716,7 +14223,7 @@
         <w:autoSpaceDN w:val="0"/>
         <w:autoSpaceDE w:val="0"/>
         <w:widowControl/>
-        <w:spacing w:line="220" w:lineRule="exact" w:before="0" w:after="6050"/>
+        <w:spacing w:line="220" w:lineRule="exact" w:before="0" w:after="424"/>
         <w:ind w:left="0" w:right="0"/>
       </w:pPr>
       <w:r>
@@ -13724,12 +14231,12 @@
           <wp:anchor xmlns:a="http://schemas.openxmlformats.org/drawingml/2006/main" xmlns:pic="http://schemas.openxmlformats.org/drawingml/2006/picture" distT="0" distB="0" distL="0" distR="0" simplePos="0" relativeHeight="0" behindDoc="1" locked="0" layoutInCell="1" allowOverlap="1">
             <wp:simplePos x="0" y="0"/>
             <wp:positionH relativeFrom="page">
-              <wp:posOffset>1244600</wp:posOffset>
+              <wp:posOffset>571500</wp:posOffset>
             </wp:positionH>
             <wp:positionV relativeFrom="page">
-              <wp:posOffset>4572000</wp:posOffset>
+              <wp:posOffset>520700</wp:posOffset>
             </wp:positionV>
-            <wp:extent cx="6311900" cy="2667000"/>
+            <wp:extent cx="6400800" cy="3594100"/>
             <wp:wrapNone/>
             <wp:docPr id="4" name="Picture 4"/>
             <wp:cNvGraphicFramePr>
@@ -13751,7 +14258,7 @@
                   <pic:spPr>
                     <a:xfrm>
                       <a:off x="0" y="0"/>
-                      <a:ext cx="6311900" cy="2667000"/>
+                      <a:ext cx="6400800" cy="3594100"/>
                     </a:xfrm>
                     <a:prstGeom prst="rect"/>
                   </pic:spPr>
@@ -13767,19 +14274,19 @@
         <w:tblW w:type="auto" w:w="0"/>
         <w:tblLayout w:type="fixed"/>
         <w:tblLook w:firstColumn="1" w:firstRow="1" w:lastColumn="0" w:lastRow="0" w:noHBand="0" w:noVBand="1" w:val="04A0"/>
-        <w:tblInd w:w="1124.0" w:type="dxa"/>
+        <w:tblInd w:w="504.00000000000006" w:type="dxa"/>
       </w:tblPr>
       <w:tblGrid>
-        <w:gridCol w:w="5392"/>
-        <w:gridCol w:w="5392"/>
+        <w:gridCol w:w="4840"/>
+        <w:gridCol w:w="4840"/>
       </w:tblGrid>
       <w:tr>
         <w:trPr>
-          <w:trHeight w:hRule="exact" w:val="1202"/>
+          <w:trHeight w:hRule="exact" w:val="1054"/>
         </w:trPr>
         <w:tc>
           <w:tcPr>
-            <w:tcW w:type="dxa" w:w="2080"/>
+            <w:tcW w:type="dxa" w:w="1380"/>
             <w:tcBorders/>
             <w:tcMar>
               <w:start w:w="0" w:type="dxa"/>
@@ -13792,7 +14299,7 @@
               <w:autoSpaceDE w:val="0"/>
               <w:widowControl/>
               <w:spacing w:line="245" w:lineRule="auto" w:before="0" w:after="0"/>
-              <w:ind w:left="1152" w:right="432" w:firstLine="0"/>
+              <w:ind w:left="576" w:right="288" w:firstLine="0"/>
               <w:jc w:val="center"/>
             </w:pPr>
             <w:r>
@@ -13801,7 +14308,7 @@
                 <w:b/>
                 <w:i w:val="0"/>
                 <w:color w:val="FFFFFF"/>
-                <w:sz w:val="68"/>
+                <w:sz w:val="60"/>
               </w:rPr>
               <w:t xml:space="preserve">4 </w:t>
             </w:r>
@@ -13814,7 +14321,7 @@
                 <w:b/>
                 <w:i w:val="0"/>
                 <w:color w:val="EB8A3C"/>
-                <w:sz w:val="19"/>
+                <w:sz w:val="17"/>
               </w:rPr>
               <w:t>BAB</w:t>
             </w:r>
@@ -13824,8 +14331,8 @@
               <w:autoSpaceDN w:val="0"/>
               <w:autoSpaceDE w:val="0"/>
               <w:widowControl/>
-              <w:spacing w:line="233" w:lineRule="auto" w:before="34" w:after="0"/>
-              <w:ind w:left="0" w:right="360" w:firstLine="0"/>
+              <w:spacing w:line="233" w:lineRule="auto" w:before="18" w:after="0"/>
+              <w:ind w:left="0" w:right="320" w:firstLine="0"/>
               <w:jc w:val="right"/>
             </w:pPr>
             <w:r>
@@ -13834,7 +14341,7 @@
                 <w:b/>
                 <w:i/>
                 <w:color w:val="FEF08A"/>
-                <w:sz w:val="15"/>
+                <w:sz w:val="14"/>
               </w:rPr>
               <w:t>Chapter</w:t>
             </w:r>
@@ -13842,7 +14349,7 @@
         </w:tc>
         <w:tc>
           <w:tcPr>
-            <w:tcW w:type="dxa" w:w="7420"/>
+            <w:tcW w:type="dxa" w:w="7300"/>
             <w:tcBorders/>
             <w:tcMar>
               <w:start w:w="0" w:type="dxa"/>
@@ -13854,8 +14361,8 @@
               <w:autoSpaceDN w:val="0"/>
               <w:autoSpaceDE w:val="0"/>
               <w:widowControl/>
-              <w:spacing w:line="355" w:lineRule="auto" w:before="160" w:after="0"/>
-              <w:ind w:left="370" w:right="0" w:firstLine="0"/>
+              <w:spacing w:line="319" w:lineRule="auto" w:before="152" w:after="0"/>
+              <w:ind w:left="332" w:right="432" w:firstLine="0"/>
               <w:jc w:val="left"/>
             </w:pPr>
             <w:r>
@@ -13864,7 +14371,7 @@
                 <w:b/>
                 <w:i w:val="0"/>
                 <w:color w:val="FFFFFF"/>
-                <w:sz w:val="32"/>
+                <w:sz w:val="30"/>
               </w:rPr>
               <w:t xml:space="preserve">TRANSPORTASI, KOMUNIKASI &amp; EKONOMI </w:t>
             </w:r>
@@ -13874,7 +14381,7 @@
                 <w:b/>
                 <w:i/>
                 <w:color w:val="FEF08A"/>
-                <w:sz w:val="24"/>
+                <w:sz w:val="22"/>
               </w:rPr>
               <w:t>TRANSPORTATION, COMMUNICATION &amp; ECONOMY</w:t>
             </w:r>
@@ -13887,8 +14394,113 @@
         <w:autoSpaceDN w:val="0"/>
         <w:autoSpaceDE w:val="0"/>
         <w:widowControl/>
-        <w:spacing w:line="233" w:lineRule="auto" w:before="1206" w:after="0"/>
-        <w:ind w:left="1818" w:right="0" w:firstLine="0"/>
+        <w:spacing w:line="235" w:lineRule="auto" w:before="1082" w:after="0"/>
+        <w:ind w:left="656" w:right="0" w:firstLine="0"/>
+        <w:jc w:val="left"/>
+      </w:pPr>
+      <w:r>
+        <w:rPr>
+          <w:rFonts w:ascii="Liberation Sans" w:hAnsi="Liberation Sans" w:eastAsia="Liberation Sans"/>
+          <w:b/>
+          <w:i w:val="0"/>
+          <w:color w:val="0B3C5D"/>
+          <w:sz w:val="18"/>
+        </w:rPr>
+        <w:t xml:space="preserve">RINGKASAN INDIKATOR BAB 4 / </w:t>
+      </w:r>
+      <w:r>
+        <w:rPr>
+          <w:rFonts w:ascii="Liberation Sans" w:hAnsi="Liberation Sans" w:eastAsia="Liberation Sans"/>
+          <w:b/>
+          <w:i/>
+          <w:color w:val="0B3C5D"/>
+          <w:sz w:val="18"/>
+        </w:rPr>
+        <w:t>CHAPTER 4 HIGHLIGHTS</w:t>
+      </w:r>
+    </w:p>
+    <w:p>
+      <w:pPr>
+        <w:autoSpaceDN w:val="0"/>
+        <w:tabs>
+          <w:tab w:pos="5444" w:val="left"/>
+        </w:tabs>
+        <w:autoSpaceDE w:val="0"/>
+        <w:widowControl/>
+        <w:spacing w:line="230" w:lineRule="auto" w:before="456" w:after="0"/>
+        <w:ind w:left="850" w:right="0" w:firstLine="0"/>
+        <w:jc w:val="left"/>
+      </w:pPr>
+      <w:r>
+        <w:rPr>
+          <w:rFonts w:ascii="Liberation Sans" w:hAnsi="Liberation Sans" w:eastAsia="Liberation Sans"/>
+          <w:b/>
+          <w:i w:val="0"/>
+          <w:color w:val="1E40AF"/>
+          <w:sz w:val="15"/>
+        </w:rPr>
+        <w:t xml:space="preserve">MENARA BTS &amp; INTERNET / BTS TOWERS </w:t>
+      </w:r>
+      <w:r>
+        <w:tab/>
+      </w:r>
+      <w:r>
+        <w:rPr>
+          <w:rFonts w:ascii="Liberation Sans" w:hAnsi="Liberation Sans" w:eastAsia="Liberation Sans"/>
+          <w:b/>
+          <w:i w:val="0"/>
+          <w:color w:val="115E59"/>
+          <w:sz w:val="15"/>
+        </w:rPr>
+        <w:t>INDUSTRI MIKRO (IMK) / MICRO INDUSTRIES</w:t>
+      </w:r>
+    </w:p>
+    <w:p>
+      <w:pPr>
+        <w:autoSpaceDN w:val="0"/>
+        <w:tabs>
+          <w:tab w:pos="5444" w:val="left"/>
+        </w:tabs>
+        <w:autoSpaceDE w:val="0"/>
+        <w:widowControl/>
+        <w:spacing w:line="233" w:lineRule="auto" w:before="82" w:after="0"/>
+        <w:ind w:left="850" w:right="0" w:firstLine="0"/>
+        <w:jc w:val="left"/>
+      </w:pPr>
+      <w:r>
+        <w:rPr>
+          <w:rFonts w:ascii="Liberation Sans" w:hAnsi="Liberation Sans" w:eastAsia="Liberation Sans"/>
+          <w:b/>
+          <w:i w:val="0"/>
+          <w:color w:val="1D4ED8"/>
+          <w:sz w:val="24"/>
+        </w:rPr>
+        <w:t xml:space="preserve">3 Menara (5G/4G/LTE) </w:t>
+      </w:r>
+      <w:r>
+        <w:tab/>
+      </w:r>
+      <w:r>
+        <w:rPr>
+          <w:rFonts w:ascii="Liberation Sans" w:hAnsi="Liberation Sans" w:eastAsia="Liberation Sans"/>
+          <w:b/>
+          <w:i w:val="0"/>
+          <w:color w:val="0F766E"/>
+          <w:sz w:val="24"/>
+        </w:rPr>
+        <w:t>30 Usaha</w:t>
+      </w:r>
+    </w:p>
+    <w:p>
+      <w:pPr>
+        <w:autoSpaceDN w:val="0"/>
+        <w:tabs>
+          <w:tab w:pos="5444" w:val="left"/>
+        </w:tabs>
+        <w:autoSpaceDE w:val="0"/>
+        <w:widowControl/>
+        <w:spacing w:line="233" w:lineRule="auto" w:before="62" w:after="0"/>
+        <w:ind w:left="850" w:right="0" w:firstLine="0"/>
         <w:jc w:val="left"/>
       </w:pPr>
       <w:r>
@@ -13896,50 +14508,66 @@
           <w:rFonts w:ascii="Liberation Sans" w:hAnsi="Liberation Sans" w:eastAsia="Liberation Sans"/>
           <w:b w:val="0"/>
           <w:i w:val="0"/>
-          <w:color w:val="334155"/>
-          <w:sz w:val="19"/>
+          <w:color w:val="1E40AF"/>
+          <w:sz w:val="14"/>
         </w:rPr>
-        <w:t xml:space="preserve">Dukungan telekomunikasi mencakup </w:t>
+        <w:t xml:space="preserve">Sinyal Telepon Seluler: Sinyal sangat kuat </w:t>
       </w:r>
       <w:r>
-        <w:rPr>
-          <w:rFonts w:ascii="Liberation Sans" w:hAnsi="Liberation Sans" w:eastAsia="Liberation Sans"/>
-          <w:b/>
-          <w:i w:val="0"/>
-          <w:color w:val="334155"/>
-          <w:sz w:val="19"/>
-        </w:rPr>
-        <w:t>3 Menara BTS</w:t>
+        <w:tab/>
       </w:r>
       <w:r>
         <w:rPr>
           <w:rFonts w:ascii="Liberation Sans" w:hAnsi="Liberation Sans" w:eastAsia="Liberation Sans"/>
           <w:b w:val="0"/>
           <w:i w:val="0"/>
+          <w:color w:val="134E4A"/>
+          <w:sz w:val="14"/>
+        </w:rPr>
+        <w:t>Usaha Pengolahan Mikro &amp; Kecil</w:t>
+      </w:r>
+    </w:p>
+    <w:p>
+      <w:pPr>
+        <w:autoSpaceDN w:val="0"/>
+        <w:autoSpaceDE w:val="0"/>
+        <w:widowControl/>
+        <w:spacing w:line="233" w:lineRule="auto" w:before="442" w:after="0"/>
+        <w:ind w:left="656" w:right="0" w:firstLine="0"/>
+        <w:jc w:val="left"/>
+      </w:pPr>
+      <w:r>
+        <w:rPr>
+          <w:w w:val="97.74999618530273"/>
+          <w:rFonts w:ascii="Liberation Sans" w:hAnsi="Liberation Sans" w:eastAsia="Liberation Sans"/>
+          <w:b w:val="0"/>
+          <w:i w:val="0"/>
           <w:color w:val="334155"/>
-          <w:sz w:val="19"/>
+          <w:sz w:val="18"/>
         </w:rPr>
-        <w:t xml:space="preserve"> dengan jaringan </w:t>
+        <w:t xml:space="preserve">Prasarana jalan utama di Desa Pasir Palembang memiliki permukaan jalan berjenis </w:t>
       </w:r>
       <w:r>
         <w:rPr>
+          <w:w w:val="97.74999618530273"/>
           <w:rFonts w:ascii="Liberation Sans" w:hAnsi="Liberation Sans" w:eastAsia="Liberation Sans"/>
           <w:b/>
           <w:i w:val="0"/>
           <w:color w:val="334155"/>
-          <w:sz w:val="19"/>
+          <w:sz w:val="18"/>
         </w:rPr>
-        <w:t>5G/4G/LTE</w:t>
+        <w:t>Aspal/Beton</w:t>
       </w:r>
       <w:r>
         <w:rPr>
+          <w:w w:val="97.74999618530273"/>
           <w:rFonts w:ascii="Liberation Sans" w:hAnsi="Liberation Sans" w:eastAsia="Liberation Sans"/>
           <w:b w:val="0"/>
           <w:i w:val="0"/>
           <w:color w:val="334155"/>
-          <w:sz w:val="19"/>
+          <w:sz w:val="18"/>
         </w:rPr>
-        <w:t>. Sektor industri kecil</w:t>
+        <w:t>. Sarana</w:t>
       </w:r>
     </w:p>
     <w:p>
@@ -13948,36 +14576,104 @@
         <w:autoSpaceDE w:val="0"/>
         <w:widowControl/>
         <w:spacing w:line="233" w:lineRule="auto" w:before="74" w:after="0"/>
-        <w:ind w:left="1818" w:right="0" w:firstLine="0"/>
+        <w:ind w:left="656" w:right="0" w:firstLine="0"/>
         <w:jc w:val="left"/>
       </w:pPr>
       <w:r>
         <w:rPr>
+          <w:w w:val="97.74999618530273"/>
           <w:rFonts w:ascii="Liberation Sans" w:hAnsi="Liberation Sans" w:eastAsia="Liberation Sans"/>
           <w:b w:val="0"/>
           <w:i w:val="0"/>
           <w:color w:val="334155"/>
-          <w:sz w:val="19"/>
+          <w:sz w:val="18"/>
         </w:rPr>
-        <w:t xml:space="preserve">didukung oleh </w:t>
+        <w:t xml:space="preserve">telekomunikasi ditopang oleh </w:t>
       </w:r>
       <w:r>
         <w:rPr>
+          <w:w w:val="97.74999618530273"/>
           <w:rFonts w:ascii="Liberation Sans" w:hAnsi="Liberation Sans" w:eastAsia="Liberation Sans"/>
           <w:b/>
           <w:i w:val="0"/>
           <w:color w:val="334155"/>
-          <w:sz w:val="19"/>
+          <w:sz w:val="18"/>
         </w:rPr>
-        <w:t>30 unit Industri Mikro dan Kecil (IMK)</w:t>
+        <w:t>3 Menara BTS</w:t>
       </w:r>
       <w:r>
         <w:rPr>
+          <w:w w:val="97.74999618530273"/>
           <w:rFonts w:ascii="Liberation Sans" w:hAnsi="Liberation Sans" w:eastAsia="Liberation Sans"/>
           <w:b w:val="0"/>
           <w:i w:val="0"/>
           <w:color w:val="334155"/>
-          <w:sz w:val="19"/>
+          <w:sz w:val="18"/>
+        </w:rPr>
+        <w:t xml:space="preserve"> dengan sinyal </w:t>
+      </w:r>
+      <w:r>
+        <w:rPr>
+          <w:w w:val="97.74999618530273"/>
+          <w:rFonts w:ascii="Liberation Sans" w:hAnsi="Liberation Sans" w:eastAsia="Liberation Sans"/>
+          <w:b/>
+          <w:i w:val="0"/>
+          <w:color w:val="334155"/>
+          <w:sz w:val="18"/>
+        </w:rPr>
+        <w:t>5G/4G/LTE</w:t>
+      </w:r>
+      <w:r>
+        <w:rPr>
+          <w:w w:val="97.74999618530273"/>
+          <w:rFonts w:ascii="Liberation Sans" w:hAnsi="Liberation Sans" w:eastAsia="Liberation Sans"/>
+          <w:b w:val="0"/>
+          <w:i w:val="0"/>
+          <w:color w:val="334155"/>
+          <w:sz w:val="18"/>
+        </w:rPr>
+        <w:t>. Sektor perekonomian didukung</w:t>
+      </w:r>
+    </w:p>
+    <w:p>
+      <w:pPr>
+        <w:autoSpaceDN w:val="0"/>
+        <w:autoSpaceDE w:val="0"/>
+        <w:widowControl/>
+        <w:spacing w:line="235" w:lineRule="auto" w:before="58" w:after="0"/>
+        <w:ind w:left="656" w:right="0" w:firstLine="0"/>
+        <w:jc w:val="left"/>
+      </w:pPr>
+      <w:r>
+        <w:rPr>
+          <w:w w:val="97.74999618530273"/>
+          <w:rFonts w:ascii="Liberation Sans" w:hAnsi="Liberation Sans" w:eastAsia="Liberation Sans"/>
+          <w:b w:val="0"/>
+          <w:i w:val="0"/>
+          <w:color w:val="334155"/>
+          <w:sz w:val="18"/>
+        </w:rPr>
+        <w:t xml:space="preserve">ketersediaan </w:t>
+      </w:r>
+      <w:r>
+        <w:rPr>
+          <w:w w:val="97.74999618530273"/>
+          <w:rFonts w:ascii="Liberation Sans" w:hAnsi="Liberation Sans" w:eastAsia="Liberation Sans"/>
+          <w:b/>
+          <w:i w:val="0"/>
+          <w:color w:val="334155"/>
+          <w:sz w:val="18"/>
+        </w:rPr>
+        <w:t>30 unit usaha Industri Mikro dan Kecil (IMK)</w:t>
+      </w:r>
+      <w:r>
+        <w:rPr>
+          <w:w w:val="97.74999618530273"/>
+          <w:rFonts w:ascii="Liberation Sans" w:hAnsi="Liberation Sans" w:eastAsia="Liberation Sans"/>
+          <w:b w:val="0"/>
+          <w:i w:val="0"/>
+          <w:color w:val="334155"/>
+          <w:sz w:val="18"/>
         </w:rPr>
         <w:t>.</w:t>
       </w:r>
@@ -13987,7 +14683,7 @@
         <w:autoSpaceDN w:val="0"/>
         <w:autoSpaceDE w:val="0"/>
         <w:widowControl/>
-        <w:spacing w:line="233" w:lineRule="auto" w:before="5664" w:after="0"/>
+        <w:spacing w:line="233" w:lineRule="auto" w:before="10302" w:after="0"/>
         <w:ind w:left="0" w:right="0" w:firstLine="0"/>
         <w:jc w:val="left"/>
       </w:pPr>
@@ -14006,7 +14702,7 @@
       <w:pPr>
         <w:sectPr>
           <w:pgSz w:w="11899" w:h="16838"/>
-          <w:pgMar w:top="1440" w:right="318" w:bottom="162" w:left="796" w:header="720" w:footer="720" w:gutter="0"/>
+          <w:pgMar w:top="642" w:right="1422" w:bottom="162" w:left="796" w:header="720" w:footer="720" w:gutter="0"/>
           <w:cols/>
           <w:docGrid w:linePitch="360"/>
         </w:sectPr>
@@ -17076,7 +17772,7 @@
         <w:autoSpaceDN w:val="0"/>
         <w:autoSpaceDE w:val="0"/>
         <w:widowControl/>
-        <w:spacing w:line="220" w:lineRule="exact" w:before="0" w:after="6030"/>
+        <w:spacing w:line="220" w:lineRule="exact" w:before="0" w:after="416"/>
         <w:ind w:left="0" w:right="0"/>
       </w:pPr>
       <w:r>
@@ -17084,12 +17780,12 @@
           <wp:anchor xmlns:a="http://schemas.openxmlformats.org/drawingml/2006/main" xmlns:pic="http://schemas.openxmlformats.org/drawingml/2006/picture" distT="0" distB="0" distL="0" distR="0" simplePos="0" relativeHeight="0" behindDoc="1" locked="0" layoutInCell="1" allowOverlap="1">
             <wp:simplePos x="0" y="0"/>
             <wp:positionH relativeFrom="page">
-              <wp:posOffset>1244600</wp:posOffset>
+              <wp:posOffset>571500</wp:posOffset>
             </wp:positionH>
             <wp:positionV relativeFrom="page">
-              <wp:posOffset>4559300</wp:posOffset>
+              <wp:posOffset>520700</wp:posOffset>
             </wp:positionV>
-            <wp:extent cx="6311900" cy="2692400"/>
+            <wp:extent cx="6400800" cy="3606800"/>
             <wp:wrapNone/>
             <wp:docPr id="5" name="Picture 5"/>
             <wp:cNvGraphicFramePr>
@@ -17111,7 +17807,7 @@
                   <pic:spPr>
                     <a:xfrm>
                       <a:off x="0" y="0"/>
-                      <a:ext cx="6311900" cy="2692400"/>
+                      <a:ext cx="6400800" cy="3606800"/>
                     </a:xfrm>
                     <a:prstGeom prst="rect"/>
                   </pic:spPr>
@@ -17127,19 +17823,19 @@
         <w:tblW w:type="auto" w:w="0"/>
         <w:tblLayout w:type="fixed"/>
         <w:tblLook w:firstColumn="1" w:firstRow="1" w:lastColumn="0" w:lastRow="0" w:noHBand="0" w:noVBand="1" w:val="04A0"/>
-        <w:tblInd w:w="1124.0" w:type="dxa"/>
+        <w:tblInd w:w="504.00000000000006" w:type="dxa"/>
       </w:tblPr>
       <w:tblGrid>
-        <w:gridCol w:w="5392"/>
-        <w:gridCol w:w="5392"/>
+        <w:gridCol w:w="4840"/>
+        <w:gridCol w:w="4840"/>
       </w:tblGrid>
       <w:tr>
         <w:trPr>
-          <w:trHeight w:hRule="exact" w:val="1376"/>
+          <w:trHeight w:hRule="exact" w:val="1218"/>
         </w:trPr>
         <w:tc>
           <w:tcPr>
-            <w:tcW w:type="dxa" w:w="2080"/>
+            <w:tcW w:type="dxa" w:w="1380"/>
             <w:tcBorders/>
             <w:tcMar>
               <w:start w:w="0" w:type="dxa"/>
@@ -17151,8 +17847,8 @@
               <w:autoSpaceDN w:val="0"/>
               <w:autoSpaceDE w:val="0"/>
               <w:widowControl/>
-              <w:spacing w:line="245" w:lineRule="auto" w:before="20" w:after="0"/>
-              <w:ind w:left="1152" w:right="432" w:firstLine="0"/>
+              <w:spacing w:line="245" w:lineRule="auto" w:before="28" w:after="0"/>
+              <w:ind w:left="576" w:right="288" w:firstLine="0"/>
               <w:jc w:val="center"/>
             </w:pPr>
             <w:r>
@@ -17161,7 +17857,7 @@
                 <w:b/>
                 <w:i w:val="0"/>
                 <w:color w:val="FFFFFF"/>
-                <w:sz w:val="68"/>
+                <w:sz w:val="60"/>
               </w:rPr>
               <w:t xml:space="preserve">5 </w:t>
             </w:r>
@@ -17174,7 +17870,7 @@
                 <w:b/>
                 <w:i w:val="0"/>
                 <w:color w:val="EB8A3C"/>
-                <w:sz w:val="19"/>
+                <w:sz w:val="17"/>
               </w:rPr>
               <w:t>BAB</w:t>
             </w:r>
@@ -17184,8 +17880,8 @@
               <w:autoSpaceDN w:val="0"/>
               <w:autoSpaceDE w:val="0"/>
               <w:widowControl/>
-              <w:spacing w:line="233" w:lineRule="auto" w:before="34" w:after="0"/>
-              <w:ind w:left="0" w:right="360" w:firstLine="0"/>
+              <w:spacing w:line="233" w:lineRule="auto" w:before="2" w:after="0"/>
+              <w:ind w:left="0" w:right="320" w:firstLine="0"/>
               <w:jc w:val="right"/>
             </w:pPr>
             <w:r>
@@ -17194,7 +17890,7 @@
                 <w:b/>
                 <w:i/>
                 <w:color w:val="FEF08A"/>
-                <w:sz w:val="15"/>
+                <w:sz w:val="14"/>
               </w:rPr>
               <w:t>Chapter</w:t>
             </w:r>
@@ -17202,7 +17898,7 @@
         </w:tc>
         <w:tc>
           <w:tcPr>
-            <w:tcW w:type="dxa" w:w="7440"/>
+            <w:tcW w:type="dxa" w:w="7680"/>
             <w:tcBorders/>
             <w:tcMar>
               <w:start w:w="0" w:type="dxa"/>
@@ -17215,7 +17911,7 @@
               <w:autoSpaceDE w:val="0"/>
               <w:widowControl/>
               <w:spacing w:line="245" w:lineRule="auto" w:before="0" w:after="0"/>
-              <w:ind w:left="370" w:right="1296" w:firstLine="0"/>
+              <w:ind w:left="332" w:right="0" w:firstLine="0"/>
               <w:jc w:val="left"/>
             </w:pPr>
             <w:r>
@@ -17224,9 +17920,9 @@
                 <w:b/>
                 <w:i w:val="0"/>
                 <w:color w:val="FFFFFF"/>
-                <w:sz w:val="32"/>
+                <w:sz w:val="30"/>
               </w:rPr>
-              <w:t xml:space="preserve">PEMERINTAHAN, KELEMBAGAAN &amp; </w:t>
+              <w:t xml:space="preserve">PEMERINTAHAN, KELEMBAGAAN &amp; INFORMASI </w:t>
             </w:r>
             <w:r>
               <w:rPr>
@@ -17234,9 +17930,9 @@
                 <w:b/>
                 <w:i w:val="0"/>
                 <w:color w:val="FFFFFF"/>
-                <w:sz w:val="32"/>
+                <w:sz w:val="30"/>
               </w:rPr>
-              <w:t>INFORMASI DESA</w:t>
+              <w:t>DESA</w:t>
             </w:r>
           </w:p>
           <w:p>
@@ -17244,8 +17940,8 @@
               <w:autoSpaceDN w:val="0"/>
               <w:autoSpaceDE w:val="0"/>
               <w:widowControl/>
-              <w:spacing w:line="233" w:lineRule="auto" w:before="316" w:after="0"/>
-              <w:ind w:left="370" w:right="0" w:firstLine="0"/>
+              <w:spacing w:line="233" w:lineRule="auto" w:before="218" w:after="0"/>
+              <w:ind w:left="332" w:right="0" w:firstLine="0"/>
               <w:jc w:val="left"/>
             </w:pPr>
             <w:r>
@@ -17254,7 +17950,7 @@
                 <w:b/>
                 <w:i/>
                 <w:color w:val="FEF08A"/>
-                <w:sz w:val="24"/>
+                <w:sz w:val="22"/>
               </w:rPr>
               <w:t>GOVERNMENT, INSTITUTIONS &amp; VILLAGE INFORMATION</w:t>
             </w:r>
@@ -17267,8 +17963,113 @@
         <w:autoSpaceDN w:val="0"/>
         <w:autoSpaceDE w:val="0"/>
         <w:widowControl/>
-        <w:spacing w:line="233" w:lineRule="auto" w:before="1082" w:after="0"/>
-        <w:ind w:left="1818" w:right="0" w:firstLine="0"/>
+        <w:spacing w:line="233" w:lineRule="auto" w:before="946" w:after="0"/>
+        <w:ind w:left="656" w:right="0" w:firstLine="0"/>
+        <w:jc w:val="left"/>
+      </w:pPr>
+      <w:r>
+        <w:rPr>
+          <w:rFonts w:ascii="Liberation Sans" w:hAnsi="Liberation Sans" w:eastAsia="Liberation Sans"/>
+          <w:b/>
+          <w:i w:val="0"/>
+          <w:color w:val="0B3C5D"/>
+          <w:sz w:val="18"/>
+        </w:rPr>
+        <w:t xml:space="preserve">RINGKASAN INDIKATOR BAB 5 / </w:t>
+      </w:r>
+      <w:r>
+        <w:rPr>
+          <w:rFonts w:ascii="Liberation Sans" w:hAnsi="Liberation Sans" w:eastAsia="Liberation Sans"/>
+          <w:b/>
+          <w:i/>
+          <w:color w:val="0B3C5D"/>
+          <w:sz w:val="18"/>
+        </w:rPr>
+        <w:t>CHAPTER 5 HIGHLIGHTS</w:t>
+      </w:r>
+    </w:p>
+    <w:p>
+      <w:pPr>
+        <w:autoSpaceDN w:val="0"/>
+        <w:tabs>
+          <w:tab w:pos="5444" w:val="left"/>
+        </w:tabs>
+        <w:autoSpaceDE w:val="0"/>
+        <w:widowControl/>
+        <w:spacing w:line="230" w:lineRule="auto" w:before="472" w:after="0"/>
+        <w:ind w:left="850" w:right="0" w:firstLine="0"/>
+        <w:jc w:val="left"/>
+      </w:pPr>
+      <w:r>
+        <w:rPr>
+          <w:rFonts w:ascii="Liberation Sans" w:hAnsi="Liberation Sans" w:eastAsia="Liberation Sans"/>
+          <w:b/>
+          <w:i w:val="0"/>
+          <w:color w:val="166534"/>
+          <w:sz w:val="15"/>
+        </w:rPr>
+        <w:t xml:space="preserve">APARATUR DESA / APPARATUS </w:t>
+      </w:r>
+      <w:r>
+        <w:tab/>
+      </w:r>
+      <w:r>
+        <w:rPr>
+          <w:rFonts w:ascii="Liberation Sans" w:hAnsi="Liberation Sans" w:eastAsia="Liberation Sans"/>
+          <w:b/>
+          <w:i w:val="0"/>
+          <w:color w:val="92400E"/>
+          <w:sz w:val="15"/>
+        </w:rPr>
+        <w:t>SISTEM INFORMASI (SID) / INFO SYSTEM</w:t>
+      </w:r>
+    </w:p>
+    <w:p>
+      <w:pPr>
+        <w:autoSpaceDN w:val="0"/>
+        <w:tabs>
+          <w:tab w:pos="5444" w:val="left"/>
+        </w:tabs>
+        <w:autoSpaceDE w:val="0"/>
+        <w:widowControl/>
+        <w:spacing w:line="233" w:lineRule="auto" w:before="82" w:after="0"/>
+        <w:ind w:left="850" w:right="0" w:firstLine="0"/>
+        <w:jc w:val="left"/>
+      </w:pPr>
+      <w:r>
+        <w:rPr>
+          <w:rFonts w:ascii="Liberation Sans" w:hAnsi="Liberation Sans" w:eastAsia="Liberation Sans"/>
+          <w:b/>
+          <w:i w:val="0"/>
+          <w:color w:val="15803D"/>
+          <w:sz w:val="24"/>
+        </w:rPr>
+        <w:t xml:space="preserve">11 Orang </w:t>
+      </w:r>
+      <w:r>
+        <w:tab/>
+      </w:r>
+      <w:r>
+        <w:rPr>
+          <w:rFonts w:ascii="Liberation Sans" w:hAnsi="Liberation Sans" w:eastAsia="Liberation Sans"/>
+          <w:b/>
+          <w:i w:val="0"/>
+          <w:color w:val="B45309"/>
+          <w:sz w:val="24"/>
+        </w:rPr>
+        <w:t>Tidak ada</w:t>
+      </w:r>
+    </w:p>
+    <w:p>
+      <w:pPr>
+        <w:autoSpaceDN w:val="0"/>
+        <w:tabs>
+          <w:tab w:pos="5444" w:val="left"/>
+        </w:tabs>
+        <w:autoSpaceDE w:val="0"/>
+        <w:widowControl/>
+        <w:spacing w:line="233" w:lineRule="auto" w:before="48" w:after="0"/>
+        <w:ind w:left="850" w:right="0" w:firstLine="0"/>
         <w:jc w:val="left"/>
       </w:pPr>
       <w:r>
@@ -17276,30 +18077,23 @@
           <w:rFonts w:ascii="Liberation Sans" w:hAnsi="Liberation Sans" w:eastAsia="Liberation Sans"/>
           <w:b w:val="0"/>
           <w:i w:val="0"/>
-          <w:color w:val="334155"/>
-          <w:sz w:val="19"/>
+          <w:color w:val="166534"/>
+          <w:sz w:val="14"/>
         </w:rPr>
-        <w:t xml:space="preserve">Penyelenggaraan pemerintah desa didukung oleh </w:t>
+        <w:t xml:space="preserve">Aparatur Pemerintah Desa </w:t>
       </w:r>
       <w:r>
-        <w:rPr>
-          <w:rFonts w:ascii="Liberation Sans" w:hAnsi="Liberation Sans" w:eastAsia="Liberation Sans"/>
-          <w:b/>
-          <w:i w:val="0"/>
-          <w:color w:val="334155"/>
-          <w:sz w:val="19"/>
-        </w:rPr>
-        <w:t>11 orang aparatur desa</w:t>
+        <w:tab/>
       </w:r>
       <w:r>
         <w:rPr>
           <w:rFonts w:ascii="Liberation Sans" w:hAnsi="Liberation Sans" w:eastAsia="Liberation Sans"/>
           <w:b w:val="0"/>
           <w:i w:val="0"/>
-          <w:color w:val="334155"/>
-          <w:sz w:val="19"/>
+          <w:color w:val="78350F"/>
+          <w:sz w:val="14"/>
         </w:rPr>
-        <w:t>, keberadaan BPD/LMK</w:t>
+        <w:t>Musyawarah Desa: 12 kali/tahun</w:t>
       </w:r>
     </w:p>
     <w:p>
@@ -17307,57 +18101,137 @@
         <w:autoSpaceDN w:val="0"/>
         <w:autoSpaceDE w:val="0"/>
         <w:widowControl/>
-        <w:spacing w:line="233" w:lineRule="auto" w:before="74" w:after="0"/>
-        <w:ind w:left="1818" w:right="0" w:firstLine="0"/>
+        <w:spacing w:line="233" w:lineRule="auto" w:before="456" w:after="0"/>
+        <w:ind w:left="656" w:right="0" w:firstLine="0"/>
         <w:jc w:val="left"/>
       </w:pPr>
       <w:r>
         <w:rPr>
+          <w:w w:val="97.74999618530273"/>
           <w:rFonts w:ascii="Liberation Sans" w:hAnsi="Liberation Sans" w:eastAsia="Liberation Sans"/>
           <w:b w:val="0"/>
           <w:i w:val="0"/>
           <w:color w:val="334155"/>
-          <w:sz w:val="19"/>
+          <w:sz w:val="18"/>
         </w:rPr>
-        <w:t xml:space="preserve">tercatat </w:t>
+        <w:t xml:space="preserve">Penyelenggaraan pemerintah desa didukung oleh </w:t>
       </w:r>
       <w:r>
         <w:rPr>
+          <w:w w:val="97.74999618530273"/>
           <w:rFonts w:ascii="Liberation Sans" w:hAnsi="Liberation Sans" w:eastAsia="Liberation Sans"/>
           <w:b/>
           <w:i w:val="0"/>
           <w:color w:val="334155"/>
-          <w:sz w:val="19"/>
+          <w:sz w:val="18"/>
+        </w:rPr>
+        <w:t>11 orang aparatur</w:t>
+      </w:r>
+      <w:r>
+        <w:rPr>
+          <w:w w:val="97.74999618530273"/>
+          <w:rFonts w:ascii="Liberation Sans" w:hAnsi="Liberation Sans" w:eastAsia="Liberation Sans"/>
+          <w:b w:val="0"/>
+          <w:i w:val="0"/>
+          <w:color w:val="334155"/>
+          <w:sz w:val="18"/>
+        </w:rPr>
+        <w:t xml:space="preserve">, keberadaan BPD/LMK tercatat </w:t>
+      </w:r>
+      <w:r>
+        <w:rPr>
+          <w:w w:val="97.74999618530273"/>
+          <w:rFonts w:ascii="Liberation Sans" w:hAnsi="Liberation Sans" w:eastAsia="Liberation Sans"/>
+          <w:b/>
+          <w:i w:val="0"/>
+          <w:color w:val="334155"/>
+          <w:sz w:val="18"/>
         </w:rPr>
         <w:t>"Ada"</w:t>
       </w:r>
       <w:r>
         <w:rPr>
+          <w:w w:val="97.74999618530273"/>
           <w:rFonts w:ascii="Liberation Sans" w:hAnsi="Liberation Sans" w:eastAsia="Liberation Sans"/>
           <w:b w:val="0"/>
           <w:i w:val="0"/>
           <w:color w:val="334155"/>
-          <w:sz w:val="19"/>
+          <w:sz w:val="18"/>
         </w:rPr>
-        <w:t xml:space="preserve">, serta pelaksanaan musyawarah desa sebanyak </w:t>
+        <w:t>,</w:t>
+      </w:r>
+    </w:p>
+    <w:p>
+      <w:pPr>
+        <w:autoSpaceDN w:val="0"/>
+        <w:autoSpaceDE w:val="0"/>
+        <w:widowControl/>
+        <w:spacing w:line="235" w:lineRule="auto" w:before="58" w:after="0"/>
+        <w:ind w:left="656" w:right="0" w:firstLine="0"/>
+        <w:jc w:val="left"/>
+      </w:pPr>
+      <w:r>
+        <w:rPr>
+          <w:w w:val="97.74999618530273"/>
+          <w:rFonts w:ascii="Liberation Sans" w:hAnsi="Liberation Sans" w:eastAsia="Liberation Sans"/>
+          <w:b w:val="0"/>
+          <w:i w:val="0"/>
+          <w:color w:val="334155"/>
+          <w:sz w:val="18"/>
+        </w:rPr>
+        <w:t xml:space="preserve">frekuensi musyawarah desa sebanyak </w:t>
       </w:r>
       <w:r>
         <w:rPr>
+          <w:w w:val="97.74999618530273"/>
           <w:rFonts w:ascii="Liberation Sans" w:hAnsi="Liberation Sans" w:eastAsia="Liberation Sans"/>
           <w:b/>
           <w:i w:val="0"/>
           <w:color w:val="334155"/>
-          <w:sz w:val="19"/>
+          <w:sz w:val="18"/>
         </w:rPr>
         <w:t>12 kali</w:t>
       </w:r>
       <w:r>
         <w:rPr>
+          <w:w w:val="97.74999618530273"/>
           <w:rFonts w:ascii="Liberation Sans" w:hAnsi="Liberation Sans" w:eastAsia="Liberation Sans"/>
           <w:b w:val="0"/>
           <w:i w:val="0"/>
           <w:color w:val="334155"/>
-          <w:sz w:val="19"/>
+          <w:sz w:val="18"/>
+        </w:rPr>
+        <w:t>, serta pemanfaatan Sistem Informasi Desa (SID) bernomenklatur</w:t>
+      </w:r>
+    </w:p>
+    <w:p>
+      <w:pPr>
+        <w:autoSpaceDN w:val="0"/>
+        <w:autoSpaceDE w:val="0"/>
+        <w:widowControl/>
+        <w:spacing w:line="235" w:lineRule="auto" w:before="72" w:after="0"/>
+        <w:ind w:left="656" w:right="0" w:firstLine="0"/>
+        <w:jc w:val="left"/>
+      </w:pPr>
+      <w:r>
+        <w:rPr>
+          <w:w w:val="97.74999618530273"/>
+          <w:rFonts w:ascii="Liberation Sans" w:hAnsi="Liberation Sans" w:eastAsia="Liberation Sans"/>
+          <w:b/>
+          <w:i w:val="0"/>
+          <w:color w:val="334155"/>
+          <w:sz w:val="18"/>
+        </w:rPr>
+        <w:t>"Tidak ada"</w:t>
+      </w:r>
+      <w:r>
+        <w:rPr>
+          <w:w w:val="97.74999618530273"/>
+          <w:rFonts w:ascii="Liberation Sans" w:hAnsi="Liberation Sans" w:eastAsia="Liberation Sans"/>
+          <w:b w:val="0"/>
+          <w:i w:val="0"/>
+          <w:color w:val="334155"/>
+          <w:sz w:val="18"/>
         </w:rPr>
         <w:t>.</w:t>
       </w:r>
@@ -17367,7 +18241,7 @@
         <w:autoSpaceDN w:val="0"/>
         <w:autoSpaceDE w:val="0"/>
         <w:widowControl/>
-        <w:spacing w:line="233" w:lineRule="auto" w:before="5634" w:after="0"/>
+        <w:spacing w:line="233" w:lineRule="auto" w:before="10272" w:after="0"/>
         <w:ind w:left="0" w:right="0" w:firstLine="0"/>
         <w:jc w:val="left"/>
       </w:pPr>
@@ -17386,7 +18260,7 @@
       <w:pPr>
         <w:sectPr>
           <w:pgSz w:w="11899" w:h="16838"/>
-          <w:pgMar w:top="1440" w:right="318" w:bottom="162" w:left="796" w:header="720" w:footer="720" w:gutter="0"/>
+          <w:pgMar w:top="638" w:right="1422" w:bottom="162" w:left="796" w:header="720" w:footer="720" w:gutter="0"/>
           <w:cols/>
           <w:docGrid w:linePitch="360"/>
         </w:sectPr>

</xml_diff>

<commit_message>
fix(podes): remove bottom motto section from final page of PODES publication
</commit_message>
<xml_diff>
--- a/kegiatan/desa-cantik/2026/pasir-palembang/publikasi-potensi-pasir-palembang-2026.docx
+++ b/kegiatan/desa-cantik/2026/pasir-palembang/publikasi-potensi-pasir-palembang-2026.docx
@@ -19253,21 +19253,20 @@
         <w:tblW w:type="auto" w:w="0"/>
         <w:tblLayout w:type="fixed"/>
         <w:tblLook w:firstColumn="1" w:firstRow="1" w:lastColumn="0" w:lastRow="0" w:noHBand="0" w:noVBand="1" w:val="04A0"/>
-        <w:tblInd w:w="1140.0" w:type="dxa"/>
+        <w:tblInd w:w="1200.0" w:type="dxa"/>
       </w:tblPr>
       <w:tblGrid>
         <w:gridCol w:w="9019"/>
       </w:tblGrid>
       <w:tr>
         <w:trPr>
-          <w:trHeight w:hRule="exact" w:val="818"/>
+          <w:trHeight w:hRule="exact" w:val="250"/>
         </w:trPr>
         <w:tc>
           <w:tcPr>
-            <w:tcW w:type="dxa" w:w="9630"/>
-            <w:tcBorders>
-              <w:bottom w:sz="12.800000000000182" w:val="single" w:color="#0A3C5C"/>
-            </w:tcBorders>
+            <w:tcW w:type="dxa" w:w="7780"/>
+            <w:tcBorders/>
+            <w:shd w:fill="f7fafb"/>
             <w:tcMar>
               <w:start w:w="0" w:type="dxa"/>
               <w:end w:w="0" w:type="dxa"/>
@@ -19279,7 +19278,7 @@
               <w:autoSpaceDE w:val="0"/>
               <w:widowControl/>
               <w:spacing w:line="233" w:lineRule="auto" w:before="22" w:after="0"/>
-              <w:ind w:left="1272" w:right="0" w:firstLine="0"/>
+              <w:ind w:left="1212" w:right="0" w:firstLine="0"/>
               <w:jc w:val="left"/>
             </w:pPr>
             <w:r>
@@ -19301,119 +19300,7 @@
         <w:autoSpaceDN w:val="0"/>
         <w:autoSpaceDE w:val="0"/>
         <w:widowControl/>
-        <w:spacing w:line="280" w:lineRule="exact" w:before="0" w:after="0"/>
-        <w:ind w:left="0" w:right="0"/>
-      </w:pPr>
-    </w:p>
-    <w:tbl>
-      <w:tblPr>
-        <w:tblW w:type="auto" w:w="0"/>
-        <w:tblLayout w:type="fixed"/>
-        <w:tblLook w:firstColumn="1" w:firstRow="1" w:lastColumn="0" w:lastRow="0" w:noHBand="0" w:noVBand="1" w:val="04A0"/>
-        <w:tblInd w:w="1000.0" w:type="dxa"/>
-      </w:tblPr>
-      <w:tblGrid>
-        <w:gridCol w:w="9019"/>
-      </w:tblGrid>
-      <w:tr>
-        <w:trPr>
-          <w:trHeight w:hRule="exact" w:val="420"/>
-        </w:trPr>
-        <w:tc>
-          <w:tcPr>
-            <w:tcW w:type="dxa" w:w="9880"/>
-            <w:tcBorders/>
-            <w:tcMar>
-              <w:start w:w="0" w:type="dxa"/>
-              <w:end w:w="0" w:type="dxa"/>
-            </w:tcMar>
-          </w:tcPr>
-          <w:p>
-            <w:pPr>
-              <w:autoSpaceDN w:val="0"/>
-              <w:autoSpaceDE w:val="0"/>
-              <w:widowControl/>
-              <w:spacing w:line="233" w:lineRule="auto" w:before="60" w:after="0"/>
-              <w:ind w:left="0" w:right="0" w:firstLine="0"/>
-              <w:jc w:val="center"/>
-            </w:pPr>
-            <w:r>
-              <w:rPr>
-                <w:rFonts w:ascii="Liberation Sans" w:hAnsi="Liberation Sans" w:eastAsia="Liberation Sans"/>
-                <w:b/>
-                <w:i w:val="0"/>
-                <w:color w:val="0B3C5D"/>
-                <w:sz w:val="27"/>
-              </w:rPr>
-              <w:t>MENCERDASKAN BANGSA DENGAN DATA STATISTIK DESA</w:t>
-            </w:r>
-          </w:p>
-        </w:tc>
-      </w:tr>
-    </w:tbl>
-    <w:p>
-      <w:pPr>
-        <w:autoSpaceDN w:val="0"/>
-        <w:autoSpaceDE w:val="0"/>
-        <w:widowControl/>
-        <w:spacing w:line="20" w:lineRule="exact" w:before="0" w:after="0"/>
-        <w:ind w:left="0" w:right="0"/>
-      </w:pPr>
-    </w:p>
-    <w:tbl>
-      <w:tblPr>
-        <w:tblW w:type="auto" w:w="0"/>
-        <w:tblLayout w:type="fixed"/>
-        <w:tblLook w:firstColumn="1" w:firstRow="1" w:lastColumn="0" w:lastRow="0" w:noHBand="0" w:noVBand="1" w:val="04A0"/>
-        <w:tblInd w:w="560.0" w:type="dxa"/>
-      </w:tblPr>
-      <w:tblGrid>
-        <w:gridCol w:w="9019"/>
-      </w:tblGrid>
-      <w:tr>
-        <w:trPr>
-          <w:trHeight w:hRule="exact" w:val="312"/>
-        </w:trPr>
-        <w:tc>
-          <w:tcPr>
-            <w:tcW w:type="dxa" w:w="7940"/>
-            <w:tcBorders/>
-            <w:shd w:fill="f7fafb"/>
-            <w:tcMar>
-              <w:start w:w="0" w:type="dxa"/>
-              <w:end w:w="0" w:type="dxa"/>
-            </w:tcMar>
-          </w:tcPr>
-          <w:p>
-            <w:pPr>
-              <w:autoSpaceDN w:val="0"/>
-              <w:autoSpaceDE w:val="0"/>
-              <w:widowControl/>
-              <w:spacing w:line="233" w:lineRule="auto" w:before="56" w:after="0"/>
-              <w:ind w:left="576" w:right="0" w:firstLine="0"/>
-              <w:jc w:val="left"/>
-            </w:pPr>
-            <w:r>
-              <w:rPr>
-                <w:w w:val="97.74999618530273"/>
-                <w:rFonts w:ascii="Liberation Sans" w:hAnsi="Liberation Sans" w:eastAsia="Liberation Sans"/>
-                <w:b w:val="0"/>
-                <w:i/>
-                <w:color w:val="64748B"/>
-                <w:sz w:val="18"/>
-              </w:rPr>
-              <w:t>Enlightening the Nation with Village Statistical Data</w:t>
-            </w:r>
-          </w:p>
-        </w:tc>
-      </w:tr>
-    </w:tbl>
-    <w:p>
-      <w:pPr>
-        <w:autoSpaceDN w:val="0"/>
-        <w:autoSpaceDE w:val="0"/>
-        <w:widowControl/>
-        <w:spacing w:line="8068" w:lineRule="exact" w:before="0" w:after="0"/>
+        <w:spacing w:line="9648" w:lineRule="exact" w:before="0" w:after="0"/>
         <w:ind w:left="0" w:right="0"/>
       </w:pPr>
     </w:p>
@@ -19464,24 +19351,6 @@
         </w:tc>
       </w:tr>
     </w:tbl>
-    <w:p>
-      <w:pPr>
-        <w:autoSpaceDN w:val="0"/>
-        <w:autoSpaceDE w:val="0"/>
-        <w:widowControl/>
-        <w:spacing w:line="14" w:lineRule="exact" w:before="0" w:after="0"/>
-        <w:ind w:left="0" w:right="0"/>
-      </w:pPr>
-    </w:p>
-    <w:p>
-      <w:pPr>
-        <w:autoSpaceDN w:val="0"/>
-        <w:autoSpaceDE w:val="0"/>
-        <w:widowControl/>
-        <w:spacing w:line="14" w:lineRule="exact" w:before="0" w:after="0"/>
-        <w:ind w:left="0" w:right="0"/>
-      </w:pPr>
-    </w:p>
     <w:p>
       <w:pPr>
         <w:autoSpaceDN w:val="0"/>

</xml_diff>